<commit_message>
docs: regenerate formatted DOCX for progress report v1.6, SRS, SDS v2.2
Co-authored-by: Cursor <cursoragent@cursor.com>
</commit_message>
<xml_diff>
--- a/docs/progress/Supplementary_Progress_Report_v1.0.docx
+++ b/docs/progress/Supplementary_Progress_Report_v1.0.docx
@@ -23,7 +23,7 @@
         <w:rPr>
           <w:b/>
         </w:rPr>
-        <w:t>Practical work completed — Weeks 1–2 (baseline 1 July 2026)</w:t>
+        <w:t>Practical work completed — Weeks 1–4 (baseline 1 July 2026; updated 9 July 2026)</w:t>
       </w:r>
     </w:p>
     <w:p>
@@ -410,7 +410,17 @@
             </w:pPr>
             <w:r/>
             <w:r>
-              <w:t>Result (1 Jul baseline)</w:t>
+              <w:t xml:space="preserve">Result (9 Jul on </w:t>
+            </w:r>
+            <w:r>
+              <w:rPr>
+                <w:rFonts w:ascii="Consolas" w:hAnsi="Consolas"/>
+                <w:sz w:val="20"/>
+              </w:rPr>
+              <w:t>noor</w:t>
+            </w:r>
+            <w:r>
+              <w:t>)</w:t>
             </w:r>
           </w:p>
         </w:tc>
@@ -446,7 +456,17 @@
               <w:t>Complete</w:t>
             </w:r>
             <w:r>
-              <w:t xml:space="preserve"> — hybrid XML parser; 7,068 / 7,068 MASC screens parsed with PASS sign-off</w:t>
+              <w:t xml:space="preserve"> — hybrid XML parser; MASC </w:t>
+            </w:r>
+            <w:r>
+              <w:rPr>
+                <w:rFonts w:ascii="Consolas" w:hAnsi="Consolas"/>
+                <w:sz w:val="20"/>
+              </w:rPr>
+              <w:t>&lt;wrapper&gt;</w:t>
+            </w:r>
+            <w:r>
+              <w:t xml:space="preserve"> + bounds fixes; visibility field; R13–R20 extended fields</w:t>
             </w:r>
           </w:p>
         </w:tc>
@@ -479,46 +499,62 @@
               <w:rPr>
                 <w:b/>
               </w:rPr>
-              <w:t>In progress</w:t>
-            </w:r>
-            <w:r>
-              <w:t xml:space="preserve"> — R01–R10 done; R11–R12 stubs</w:t>
-            </w:r>
-          </w:p>
-        </w:tc>
-      </w:tr>
-      <w:tr>
-        <w:tc>
-          <w:tcPr>
-            <w:tcW w:type="dxa" w:w="4680"/>
-          </w:tcPr>
-          <w:p>
-            <w:pPr>
-              <w:spacing w:after="40"/>
-            </w:pPr>
-            <w:r/>
-            <w:r>
-              <w:t>Agent layer (Stage 3)</w:t>
-            </w:r>
-          </w:p>
-        </w:tc>
-        <w:tc>
-          <w:tcPr>
-            <w:tcW w:type="dxa" w:w="4680"/>
-          </w:tcPr>
-          <w:p>
-            <w:pPr>
-              <w:spacing w:after="40"/>
-            </w:pPr>
-            <w:r/>
+              <w:t>R01–R30 implemented</w:t>
+            </w:r>
+            <w:r>
+              <w:t xml:space="preserve"> — visibility filter; R11 implemented; R09 needs declared colors/screenshot; </w:t>
+            </w:r>
             <w:r>
               <w:rPr>
                 <w:b/>
               </w:rPr>
-              <w:t>Scaffolded</w:t>
+              <w:t>94 pytest</w:t>
+            </w:r>
+          </w:p>
+        </w:tc>
+      </w:tr>
+      <w:tr>
+        <w:tc>
+          <w:tcPr>
+            <w:tcW w:type="dxa" w:w="4680"/>
+          </w:tcPr>
+          <w:p>
+            <w:pPr>
+              <w:spacing w:after="40"/>
+            </w:pPr>
+            <w:r/>
+            <w:r>
+              <w:t>Agent layer (Stage 3)</w:t>
+            </w:r>
+          </w:p>
+        </w:tc>
+        <w:tc>
+          <w:tcPr>
+            <w:tcW w:type="dxa" w:w="4680"/>
+          </w:tcPr>
+          <w:p>
+            <w:pPr>
+              <w:spacing w:after="40"/>
+            </w:pPr>
+            <w:r/>
+            <w:r>
+              <w:rPr>
+                <w:b/>
+              </w:rPr>
+              <w:t>Wired</w:t>
             </w:r>
             <w:r>
               <w:t xml:space="preserve"> — </w:t>
+            </w:r>
+            <w:r>
+              <w:rPr>
+                <w:rFonts w:ascii="Consolas" w:hAnsi="Consolas"/>
+                <w:sz w:val="20"/>
+              </w:rPr>
+              <w:t>src/explainer.py</w:t>
+            </w:r>
+            <w:r>
+              <w:t xml:space="preserve"> + </w:t>
             </w:r>
             <w:r>
               <w:rPr>
@@ -528,7 +564,17 @@
               <w:t>src/agent.py</w:t>
             </w:r>
             <w:r>
-              <w:t xml:space="preserve"> template enrichment</w:t>
+              <w:t xml:space="preserve"> (</w:t>
+            </w:r>
+            <w:r>
+              <w:rPr>
+                <w:rFonts w:ascii="Consolas" w:hAnsi="Consolas"/>
+                <w:sz w:val="20"/>
+              </w:rPr>
+              <w:t>build_audit_report</w:t>
+            </w:r>
+            <w:r>
+              <w:t>); LLM or template fallback; API-wired</w:t>
             </w:r>
           </w:p>
         </w:tc>
@@ -558,7 +604,17 @@
             </w:pPr>
             <w:r/>
             <w:r>
-              <w:t>Not started</w:t>
+              <w:t xml:space="preserve">Not started — no </w:t>
+            </w:r>
+            <w:r>
+              <w:rPr>
+                <w:rFonts w:ascii="Consolas" w:hAnsi="Consolas"/>
+                <w:sz w:val="20"/>
+              </w:rPr>
+              <w:t>src/report.py</w:t>
+            </w:r>
+            <w:r>
+              <w:t xml:space="preserve"> HTML/PDF yet</w:t>
             </w:r>
           </w:p>
         </w:tc>
@@ -604,7 +660,16 @@
               <w:t>frontend/</w:t>
             </w:r>
             <w:r>
-              <w:t xml:space="preserve"> synced (auth + Upload/Dashboard/Report/Records); backend not wired yet</w:t>
+              <w:t xml:space="preserve"> synced (latest 8 Jul); </w:t>
+            </w:r>
+            <w:r>
+              <w:rPr>
+                <w:b/>
+              </w:rPr>
+              <w:t>not calling live API</w:t>
+            </w:r>
+            <w:r>
+              <w:t xml:space="preserve"> (mock data)</w:t>
             </w:r>
           </w:p>
         </w:tc>
@@ -620,7 +685,7 @@
             </w:pPr>
             <w:r/>
             <w:r>
-              <w:t>Auth + Records</w:t>
+              <w:t>FastAPI audit API</w:t>
             </w:r>
           </w:p>
         </w:tc>
@@ -634,47 +699,32 @@
             </w:pPr>
             <w:r/>
             <w:r>
-              <w:t>Specified in SRS v2.0; not implemented in code</w:t>
-            </w:r>
-          </w:p>
-        </w:tc>
-      </w:tr>
-      <w:tr>
-        <w:tc>
-          <w:tcPr>
-            <w:tcW w:type="dxa" w:w="4680"/>
-          </w:tcPr>
-          <w:p>
-            <w:pPr>
-              <w:spacing w:after="40"/>
-            </w:pPr>
-            <w:r/>
-            <w:r>
-              <w:t>Docker</w:t>
-            </w:r>
-          </w:p>
-        </w:tc>
-        <w:tc>
-          <w:tcPr>
-            <w:tcW w:type="dxa" w:w="4680"/>
-          </w:tcPr>
-          <w:p>
-            <w:pPr>
-              <w:spacing w:after="40"/>
-            </w:pPr>
-            <w:r/>
-            <w:r>
-              <w:t xml:space="preserve">Partial — </w:t>
+              <w:rPr>
+                <w:b/>
+              </w:rPr>
+              <w:t>Partial</w:t>
+            </w:r>
+            <w:r>
+              <w:t xml:space="preserve"> — </w:t>
             </w:r>
             <w:r>
               <w:rPr>
                 <w:rFonts w:ascii="Consolas" w:hAnsi="Consolas"/>
                 <w:sz w:val="20"/>
               </w:rPr>
-              <w:t>docker-compose.yml</w:t>
-            </w:r>
-            <w:r>
-              <w:t xml:space="preserve"> runs backend + batch auditor</w:t>
+              <w:t>POST /audit</w:t>
+            </w:r>
+            <w:r>
+              <w:t xml:space="preserve"> → violations + </w:t>
+            </w:r>
+            <w:r>
+              <w:rPr>
+                <w:b/>
+              </w:rPr>
+              <w:t>`GET …/report`</w:t>
+            </w:r>
+            <w:r>
+              <w:t xml:space="preserve"> (score + agent fields); no auth/records/download</w:t>
             </w:r>
           </w:p>
         </w:tc>
@@ -690,6 +740,83 @@
             </w:pPr>
             <w:r/>
             <w:r>
+              <w:t>Auth + Records</w:t>
+            </w:r>
+          </w:p>
+        </w:tc>
+        <w:tc>
+          <w:tcPr>
+            <w:tcW w:type="dxa" w:w="4680"/>
+          </w:tcPr>
+          <w:p>
+            <w:pPr>
+              <w:spacing w:after="40"/>
+            </w:pPr>
+            <w:r/>
+            <w:r>
+              <w:t>Specified in SRS v2.0; not implemented in code</w:t>
+            </w:r>
+          </w:p>
+        </w:tc>
+      </w:tr>
+      <w:tr>
+        <w:tc>
+          <w:tcPr>
+            <w:tcW w:type="dxa" w:w="4680"/>
+          </w:tcPr>
+          <w:p>
+            <w:pPr>
+              <w:spacing w:after="40"/>
+            </w:pPr>
+            <w:r/>
+            <w:r>
+              <w:t>Docker</w:t>
+            </w:r>
+          </w:p>
+        </w:tc>
+        <w:tc>
+          <w:tcPr>
+            <w:tcW w:type="dxa" w:w="4680"/>
+          </w:tcPr>
+          <w:p>
+            <w:pPr>
+              <w:spacing w:after="40"/>
+            </w:pPr>
+            <w:r/>
+            <w:r>
+              <w:t xml:space="preserve">Deferred on </w:t>
+            </w:r>
+            <w:r>
+              <w:rPr>
+                <w:rFonts w:ascii="Consolas" w:hAnsi="Consolas"/>
+                <w:sz w:val="20"/>
+              </w:rPr>
+              <w:t>noor</w:t>
+            </w:r>
+            <w:r>
+              <w:t xml:space="preserve"> (removed); Salar owns Docker on </w:t>
+            </w:r>
+            <w:r>
+              <w:rPr>
+                <w:rFonts w:ascii="Consolas" w:hAnsi="Consolas"/>
+                <w:sz w:val="20"/>
+              </w:rPr>
+              <w:t>salar</w:t>
+            </w:r>
+          </w:p>
+        </w:tc>
+      </w:tr>
+      <w:tr>
+        <w:tc>
+          <w:tcPr>
+            <w:tcW w:type="dxa" w:w="4680"/>
+          </w:tcPr>
+          <w:p>
+            <w:pPr>
+              <w:spacing w:after="40"/>
+            </w:pPr>
+            <w:r/>
+            <w:r>
               <w:t>Documentation</w:t>
             </w:r>
           </w:p>
@@ -704,7 +831,22 @@
             </w:pPr>
             <w:r/>
             <w:r>
-              <w:t>SRS v2.0 (cleaned §9/TBD-06), SDS v2.0, progress report v1.1</w:t>
+              <w:t xml:space="preserve">SRS v2.0, </w:t>
+            </w:r>
+            <w:r>
+              <w:rPr>
+                <w:b/>
+              </w:rPr>
+              <w:t>SDS v2.2</w:t>
+            </w:r>
+            <w:r>
+              <w:t xml:space="preserve">, progress report </w:t>
+            </w:r>
+            <w:r>
+              <w:rPr>
+                <w:b/>
+              </w:rPr>
+              <w:t>v1.6</w:t>
             </w:r>
           </w:p>
         </w:tc>
@@ -716,10 +858,30 @@
         <w:rPr>
           <w:b/>
         </w:rPr>
-        <w:t>Bottom line (1 Jul):</w:t>
-      </w:r>
-      <w:r>
-        <w:t xml:space="preserve"> The data and parsing foundation is strong. The team was ready to begin Week 3 (rule engine).</w:t>
+        <w:t>Bottom line (9 Jul):</w:t>
+      </w:r>
+      <w:r>
+        <w:t xml:space="preserve"> Week 4 agent wiring is done — real API demo: XML → R01–R30 → </w:t>
+      </w:r>
+      <w:r>
+        <w:rPr>
+          <w:rFonts w:ascii="Consolas" w:hAnsi="Consolas"/>
+          <w:sz w:val="20"/>
+        </w:rPr>
+        <w:t>report.json</w:t>
+      </w:r>
+      <w:r>
+        <w:t xml:space="preserve"> (template mode without live LLM). Next: Ayesha frontend↔API + prompt experiments (TBD-01); Noor </w:t>
+      </w:r>
+      <w:r>
+        <w:rPr>
+          <w:rFonts w:ascii="Consolas" w:hAnsi="Consolas"/>
+          <w:sz w:val="20"/>
+        </w:rPr>
+        <w:t>src/report.py</w:t>
+      </w:r>
+      <w:r>
+        <w:t xml:space="preserve"> HTML/PDF.</w:t>
       </w:r>
     </w:p>
     <w:p>
@@ -813,7 +975,7 @@
             </w:pPr>
             <w:r/>
             <w:r>
-              <w:t>Status (1 Jul)</w:t>
+              <w:t>Status (9 Jul)</w:t>
             </w:r>
           </w:p>
         </w:tc>
@@ -858,7 +1020,7 @@
             </w:pPr>
             <w:r/>
             <w:r>
-              <w:t>Salar</w:t>
+              <w:t>Salar / Noor</w:t>
             </w:r>
           </w:p>
         </w:tc>
@@ -895,6 +1057,9 @@
               </w:rPr>
               <w:t>Done</w:t>
             </w:r>
+            <w:r>
+              <w:t xml:space="preserve"> (R13–R20 fields + visibility)</w:t>
+            </w:r>
           </w:p>
         </w:tc>
         <w:tc>
@@ -914,7 +1079,7 @@
               <w:t>data/data-masc/parsed/</w:t>
             </w:r>
             <w:r>
-              <w:t xml:space="preserve"> (7,068 files)</w:t>
+              <w:t xml:space="preserve"> (7,068 files, sign-off PASS)</w:t>
             </w:r>
           </w:p>
         </w:tc>
@@ -944,7 +1109,7 @@
             </w:pPr>
             <w:r/>
             <w:r>
-              <w:t>Salar</w:t>
+              <w:t>Salar / Noor</w:t>
             </w:r>
           </w:p>
         </w:tc>
@@ -976,7 +1141,13 @@
             </w:pPr>
             <w:r/>
             <w:r>
-              <w:t>Planned at baseline</w:t>
+              <w:rPr>
+                <w:b/>
+              </w:rPr>
+              <w:t>Done</w:t>
+            </w:r>
+            <w:r>
+              <w:t xml:space="preserve"> R01–R30</w:t>
             </w:r>
           </w:p>
         </w:tc>
@@ -990,7 +1161,14 @@
             </w:pPr>
             <w:r/>
             <w:r>
-              <w:t>See §15</w:t>
+              <w:rPr>
+                <w:rFonts w:ascii="Consolas" w:hAnsi="Consolas"/>
+                <w:sz w:val="20"/>
+              </w:rPr>
+              <w:t>src/rules.py</w:t>
+            </w:r>
+            <w:r>
+              <w:t>; fixtures R11 + R21–R30</w:t>
             </w:r>
           </w:p>
         </w:tc>
@@ -1020,7 +1198,7 @@
             </w:pPr>
             <w:r/>
             <w:r>
-              <w:t>Noor</w:t>
+              <w:t>Noor / Salar</w:t>
             </w:r>
           </w:p>
         </w:tc>
@@ -1055,7 +1233,13 @@
             </w:pPr>
             <w:r/>
             <w:r>
-              <w:t>Planned</w:t>
+              <w:rPr>
+                <w:b/>
+              </w:rPr>
+              <w:t>Done</w:t>
+            </w:r>
+            <w:r>
+              <w:t xml:space="preserve"> (API-wired)</w:t>
             </w:r>
           </w:p>
         </w:tc>
@@ -1068,9 +1252,6 @@
               <w:spacing w:after="40"/>
             </w:pPr>
             <w:r/>
-            <w:r>
-              <w:t xml:space="preserve">No </w:t>
-            </w:r>
             <w:r>
               <w:rPr>
                 <w:rFonts w:ascii="Consolas" w:hAnsi="Consolas"/>
@@ -1078,6 +1259,26 @@
               </w:rPr>
               <w:t>src/agent.py</w:t>
             </w:r>
+            <w:r>
+              <w:t xml:space="preserve"> + </w:t>
+            </w:r>
+            <w:r>
+              <w:rPr>
+                <w:rFonts w:ascii="Consolas" w:hAnsi="Consolas"/>
+                <w:sz w:val="20"/>
+              </w:rPr>
+              <w:t>src/explainer.py</w:t>
+            </w:r>
+            <w:r>
+              <w:t xml:space="preserve">; </w:t>
+            </w:r>
+            <w:r>
+              <w:rPr>
+                <w:rFonts w:ascii="Consolas" w:hAnsi="Consolas"/>
+                <w:sz w:val="20"/>
+              </w:rPr>
+              <w:t>GET …/report</w:t>
+            </w:r>
           </w:p>
         </w:tc>
       </w:tr>
@@ -1213,7 +1414,10 @@
             </w:pPr>
             <w:r/>
             <w:r>
-              <w:t>Planned</w:t>
+              <w:rPr>
+                <w:b/>
+              </w:rPr>
+              <w:t>Scaffold</w:t>
             </w:r>
           </w:p>
         </w:tc>
@@ -1226,9 +1430,6 @@
               <w:spacing w:after="40"/>
             </w:pPr>
             <w:r/>
-            <w:r>
-              <w:t xml:space="preserve">No </w:t>
-            </w:r>
             <w:r>
               <w:rPr>
                 <w:rFonts w:ascii="Consolas" w:hAnsi="Consolas"/>
@@ -1237,86 +1438,92 @@
               <w:t>frontend/</w:t>
             </w:r>
             <w:r>
-              <w:t xml:space="preserve"> folder</w:t>
-            </w:r>
-          </w:p>
-        </w:tc>
-      </w:tr>
-      <w:tr>
-        <w:tc>
-          <w:tcPr>
-            <w:tcW w:type="dxa" w:w="1872"/>
-          </w:tcPr>
-          <w:p>
-            <w:pPr>
-              <w:spacing w:after="40"/>
-            </w:pPr>
-            <w:r/>
-            <w:r>
-              <w:t>API</w:t>
-            </w:r>
-          </w:p>
-        </w:tc>
-        <w:tc>
-          <w:tcPr>
-            <w:tcW w:type="dxa" w:w="1872"/>
-          </w:tcPr>
-          <w:p>
-            <w:pPr>
-              <w:spacing w:after="40"/>
-            </w:pPr>
-            <w:r/>
-            <w:r>
-              <w:t>Salar / Noor</w:t>
-            </w:r>
-          </w:p>
-        </w:tc>
-        <w:tc>
-          <w:tcPr>
-            <w:tcW w:type="dxa" w:w="1872"/>
-          </w:tcPr>
-          <w:p>
-            <w:pPr>
-              <w:spacing w:after="40"/>
-            </w:pPr>
-            <w:r/>
-            <w:r>
-              <w:t>FastAPI routes</w:t>
-            </w:r>
-          </w:p>
-        </w:tc>
-        <w:tc>
-          <w:tcPr>
-            <w:tcW w:type="dxa" w:w="1872"/>
-          </w:tcPr>
-          <w:p>
-            <w:pPr>
-              <w:spacing w:after="40"/>
-            </w:pPr>
-            <w:r/>
-            <w:r>
-              <w:t>Partial</w:t>
-            </w:r>
-          </w:p>
-        </w:tc>
-        <w:tc>
-          <w:tcPr>
-            <w:tcW w:type="dxa" w:w="1872"/>
-          </w:tcPr>
-          <w:p>
-            <w:pPr>
-              <w:spacing w:after="40"/>
-            </w:pPr>
-            <w:r/>
+              <w:t xml:space="preserve"> on </w:t>
+            </w:r>
             <w:r>
               <w:rPr>
                 <w:rFonts w:ascii="Consolas" w:hAnsi="Consolas"/>
                 <w:sz w:val="20"/>
               </w:rPr>
-              <w:t>backend/main.py</w:t>
-            </w:r>
-            <w:r>
-              <w:t xml:space="preserve"> — health only</w:t>
+              <w:t>noor</w:t>
+            </w:r>
+            <w:r>
+              <w:t>; mock data only</w:t>
+            </w:r>
+          </w:p>
+        </w:tc>
+      </w:tr>
+      <w:tr>
+        <w:tc>
+          <w:tcPr>
+            <w:tcW w:type="dxa" w:w="1872"/>
+          </w:tcPr>
+          <w:p>
+            <w:pPr>
+              <w:spacing w:after="40"/>
+            </w:pPr>
+            <w:r/>
+            <w:r>
+              <w:t>API</w:t>
+            </w:r>
+          </w:p>
+        </w:tc>
+        <w:tc>
+          <w:tcPr>
+            <w:tcW w:type="dxa" w:w="1872"/>
+          </w:tcPr>
+          <w:p>
+            <w:pPr>
+              <w:spacing w:after="40"/>
+            </w:pPr>
+            <w:r/>
+            <w:r>
+              <w:t>Noor</w:t>
+            </w:r>
+          </w:p>
+        </w:tc>
+        <w:tc>
+          <w:tcPr>
+            <w:tcW w:type="dxa" w:w="1872"/>
+          </w:tcPr>
+          <w:p>
+            <w:pPr>
+              <w:spacing w:after="40"/>
+            </w:pPr>
+            <w:r/>
+            <w:r>
+              <w:t>FastAPI audit routes</w:t>
+            </w:r>
+          </w:p>
+        </w:tc>
+        <w:tc>
+          <w:tcPr>
+            <w:tcW w:type="dxa" w:w="1872"/>
+          </w:tcPr>
+          <w:p>
+            <w:pPr>
+              <w:spacing w:after="40"/>
+            </w:pPr>
+            <w:r/>
+            <w:r>
+              <w:rPr>
+                <w:b/>
+              </w:rPr>
+              <w:t>Partial</w:t>
+            </w:r>
+          </w:p>
+        </w:tc>
+        <w:tc>
+          <w:tcPr>
+            <w:tcW w:type="dxa" w:w="1872"/>
+          </w:tcPr>
+          <w:p>
+            <w:pPr>
+              <w:spacing w:after="40"/>
+            </w:pPr>
+            <w:r/>
+            <w:r>
+              <w:t>violations + report; no auth/records/download</w:t>
             </w:r>
           </w:p>
         </w:tc>
@@ -1425,7 +1632,7 @@
           <w:i/>
           <w:color w:val="333333"/>
         </w:rPr>
-        <w:t>**As of 3 July 2026** on branch `noor` — canonical repo: [agentic-accessibility-auditor](https://github.com/MuhammadNoor7/agentic-accessibility-auditor)</w:t>
+        <w:t>**As of 9 July 2026** on branch `noor` — canonical repo: [agentic-accessibility-auditor](https://github.com/MuhammadNoor7/agentic-accessibility-auditor)</w:t>
       </w:r>
     </w:p>
     <w:p>
@@ -1444,11 +1651,17 @@
         <w:br/>
         <w:t>├── src/                                ← Stage 1–3 Python core</w:t>
         <w:br/>
-        <w:t>│   ├── parser.py                       ← XML → components.json (Stage 1)</w:t>
+        <w:t>│   ├── parser.py                       ← XML → components.json (Stage 1; R13–R20 fields + visibility)</w:t>
         <w:br/>
-        <w:t>│   ├── rules.py                        ← R01–R12 rule checker (Stage 2)</w:t>
+        <w:t>│   ├── rules.py                        ← R01–R30 rule checker (Stage 2)</w:t>
         <w:br/>
-        <w:t>│   ├── agent.py                        ← Agent scaffold / score formula (Stage 3, not API-wired)</w:t>
+        <w:t>│   ├── agent.py                        ← Score + build_audit_report (Stage 3; API-wired)</w:t>
+        <w:br/>
+        <w:t>│   ├── explainer.py                    ← Live LLM recommendations (batched; anti-hallucination)</w:t>
+        <w:br/>
+        <w:t>│   ├── guidelines.py                   ← G01–G30 + R→G mapping for explainer</w:t>
+        <w:br/>
+        <w:t>│   ├── llm_providers.py                ← Anthropic / OpenAI / Gemini / Groq</w:t>
         <w:br/>
         <w:t>│   └── schema_documents.py             ← JSON envelope builders</w:t>
         <w:br/>
@@ -1458,8 +1671,6 @@
         <w:br/>
         <w:t>│   ├── main.py                         ← App entry + CORS + routers</w:t>
         <w:br/>
-        <w:t>│   ├── Dockerfile</w:t>
-        <w:br/>
         <w:t>│   ├── requirements.txt</w:t>
         <w:br/>
         <w:t>│   ├── models/</w:t>
@@ -1468,7 +1679,7 @@
         <w:br/>
         <w:t>│   └── routers/</w:t>
         <w:br/>
-        <w:t>│       └── audit.py                    ← POST /api/v1/audit, GET …/violations (Week 3)</w:t>
+        <w:t>│       └── audit.py                    ← POST /audit, GET …/violations, GET …/report</w:t>
         <w:br/>
         <w:t>│</w:t>
         <w:br/>
@@ -1486,7 +1697,7 @@
         <w:br/>
         <w:t>│       ├── main.jsx, index.css</w:t>
         <w:br/>
-        <w:t>│       ├── assets/                     ← Axion logo, etc.</w:t>
+        <w:t>│       ├── state/auditFiles.js         ← Local upload state (not API-wired yet)</w:t>
         <w:br/>
         <w:t>│       ├── components/</w:t>
         <w:br/>
@@ -1506,15 +1717,19 @@
         <w:br/>
         <w:t>│</w:t>
         <w:br/>
-        <w:t>├── tests/                              ← pytest suite</w:t>
+        <w:t>├── tests/                              ← pytest suite (**94** passed on `noor`)</w:t>
         <w:br/>
-        <w:t>│   ├── test_rules.py                   ← 23 tests (R01–R12)</w:t>
+        <w:t>│   ├── test_parser.py</w:t>
         <w:br/>
-        <w:t>│   ├── test_agent.py                   ← 2 tests (agent scaffold)</w:t>
+        <w:t>│   ├── test_rules.py                   ← R01–R30 fixtures + visibility filter tests</w:t>
         <w:br/>
-        <w:t>│   ├── test_audit.py                   ← 2 tests (FastAPI violations API)</w:t>
+        <w:t>│   ├── test_agent.py                   ← score + template report</w:t>
         <w:br/>
-        <w:t>│   └── fixtures/rules/                 ← XML fixtures per rule (16 files)</w:t>
+        <w:t>│   ├── test_audit.py                   ← FastAPI violations + report</w:t>
+        <w:br/>
+        <w:t>│   ├── test_explainer.py               ← anti-hallucination / batching (mocked LLM)</w:t>
+        <w:br/>
+        <w:t>│   └── fixtures/rules/                 ← XML fixtures (R01–R12, R21–R30, …)</w:t>
         <w:br/>
         <w:t>│</w:t>
         <w:br/>
@@ -1522,7 +1737,11 @@
         <w:br/>
         <w:t>│   ├── data-masc/</w:t>
         <w:br/>
-        <w:t>│   │   ├── parsed/                     ← 7,068 MASC components.json (10 categories)</w:t>
+        <w:t>│   │   ├── parsed/                     ← 7,068 MASC components.json</w:t>
+        <w:br/>
+        <w:t>│   │   │   ├── masc_parse_signoff_report.json</w:t>
+        <w:br/>
+        <w:t>│   │   │   └── batch_parse_masc_full.log</w:t>
         <w:br/>
         <w:t>│   │   └── splits/                     ← train / val / test split JSON</w:t>
         <w:br/>
@@ -1536,19 +1755,29 @@
         <w:br/>
         <w:t>│</w:t>
         <w:br/>
-        <w:t>├── outputs/                            ← pipeline artefacts (violations gitignored except logs)</w:t>
+        <w:t>├── outputs/                            ← pipeline artefacts</w:t>
         <w:br/>
-        <w:t>│   ├── violations/                     ← *_violations.json (~70 files after Week 3)</w:t>
+        <w:t>│   ├── violations/                     ← *_violations.json</w:t>
+        <w:br/>
+        <w:t>│   ├── reports/                        ← *_report.json (agent-enriched; Week 4)</w:t>
         <w:br/>
         <w:t>│   └── validation_logs/</w:t>
         <w:br/>
-        <w:t>│       ├── week3_summary.md            ← Salar Week 3 validation summary</w:t>
+        <w:t>│       ├── week3_summary.md</w:t>
         <w:br/>
-        <w:t>│       ├── week3_validation_log.txt    ← Salar full terminal log</w:t>
+        <w:t>│       ├── week3_validation_log.txt</w:t>
         <w:br/>
-        <w:t>│       ├── noor_week3_summary.md       ← Noor Week 3 validation summary</w:t>
+        <w:t>│       ├── noor_week3_summary.md</w:t>
         <w:br/>
-        <w:t>│       └── noor_week3_validation_log.txt</w:t>
+        <w:t>│       ├── noor_week3_validation_log.txt</w:t>
+        <w:br/>
+        <w:t>│       └── masc_reparse_log.txt</w:t>
+        <w:br/>
+        <w:t>│</w:t>
+        <w:br/>
+        <w:t>├── notebooks/</w:t>
+        <w:br/>
+        <w:t>│   └── masc_dataset_analysis.ipynb     ← Salar MASC analysis (synced Week 4)</w:t>
         <w:br/>
         <w:t>│</w:t>
         <w:br/>
@@ -1574,11 +1803,15 @@
         <w:br/>
         <w:t>├── scripts/                            ← batch + validation utilities</w:t>
         <w:br/>
-        <w:t>│   ├── validate_output.py              ← JSON schema checker</w:t>
+        <w:t>│   ├── validate_output.py</w:t>
         <w:br/>
-        <w:t>│   ├── noor_week3_validate.py          ← Noor Week 3 re-runnable validation</w:t>
+        <w:t>│   ├── noor_week3_validate.py</w:t>
         <w:br/>
         <w:t>│   ├── masc_parse_signoff.py</w:t>
+        <w:br/>
+        <w:t>│   ├── run_explainer_sample.py         ← Stage 3 LLM sample runner</w:t>
+        <w:br/>
+        <w:t>│   ├── compare_visibility_filter_impact.py</w:t>
         <w:br/>
         <w:t>│   ├── split_masc_dataset.py</w:t>
         <w:br/>
@@ -1588,7 +1821,7 @@
         <w:br/>
         <w:t>├── srs/                                ← SRS v2.0 (md + docx)</w:t>
         <w:br/>
-        <w:t>├── sds/                                ← SDS v2.0 (md + docx)</w:t>
+        <w:t>├── sds/                                ← SDS v2.2 (md + docx)</w:t>
         <w:br/>
         <w:t>│</w:t>
         <w:br/>
@@ -1596,11 +1829,9 @@
         <w:br/>
         <w:t>├── test_run.py                         ← CLI batch / single-file parser + rules</w:t>
         <w:br/>
-        <w:t>├── docker-compose.yml                  ← backend + auditor services</w:t>
+        <w:t>├── .env.example                        ← LLM_PROVIDER + API key template</w:t>
         <w:br/>
-        <w:t>├── Dockerfile                          ← root batch auditor image</w:t>
-        <w:br/>
-        <w:t>├── requirements.txt                    ← root Python deps</w:t>
+        <w:t>├── requirements.txt                    ← root Python deps (+ anthropic/openai/groq)</w:t>
         <w:br/>
         <w:t>├── updated_plan.md                     ← 8-week team plan</w:t>
         <w:br/>
@@ -1832,28 +2063,32 @@
               <w:t>src/agent.py</w:t>
             </w:r>
             <w:r>
-              <w:t xml:space="preserve"> (scaffold)</w:t>
-            </w:r>
-          </w:p>
-        </w:tc>
-        <w:tc>
-          <w:tcPr>
-            <w:tcW w:type="dxa" w:w="3120"/>
-          </w:tcPr>
-          <w:p>
-            <w:pPr>
-              <w:spacing w:after="40"/>
-            </w:pPr>
-            <w:r/>
+              <w:t xml:space="preserve">, </w:t>
+            </w:r>
             <w:r>
               <w:rPr>
                 <w:rFonts w:ascii="Consolas" w:hAnsi="Consolas"/>
                 <w:sz w:val="20"/>
               </w:rPr>
-              <w:t>report.json</w:t>
-            </w:r>
-            <w:r>
-              <w:t xml:space="preserve"> — Week 4+</w:t>
+              <w:t>src/explainer.py</w:t>
+            </w:r>
+          </w:p>
+        </w:tc>
+        <w:tc>
+          <w:tcPr>
+            <w:tcW w:type="dxa" w:w="3120"/>
+          </w:tcPr>
+          <w:p>
+            <w:pPr>
+              <w:spacing w:after="40"/>
+            </w:pPr>
+            <w:r/>
+            <w:r>
+              <w:rPr>
+                <w:rFonts w:ascii="Consolas" w:hAnsi="Consolas"/>
+                <w:sz w:val="20"/>
+              </w:rPr>
+              <w:t>outputs/reports/*_report.json</w:t>
             </w:r>
           </w:p>
         </w:tc>
@@ -1904,14 +2139,7 @@
             </w:pPr>
             <w:r/>
             <w:r>
-              <w:rPr>
-                <w:rFonts w:ascii="Consolas" w:hAnsi="Consolas"/>
-                <w:sz w:val="20"/>
-              </w:rPr>
-              <w:t>outputs/reports/</w:t>
-            </w:r>
-            <w:r>
-              <w:t xml:space="preserve"> — not started</w:t>
+              <w:t>HTML/PDF — not started</w:t>
             </w:r>
           </w:p>
         </w:tc>
@@ -1959,7 +2187,7 @@
             </w:pPr>
             <w:r/>
             <w:r>
-              <w:t>in-memory job → violations JSON</w:t>
+              <w:t>in-memory job → violations + report JSON</w:t>
             </w:r>
           </w:p>
         </w:tc>
@@ -2017,7 +2245,7 @@
               <w:t>:5173</w:t>
             </w:r>
             <w:r>
-              <w:t xml:space="preserve"> (not wired to API yet)</w:t>
+              <w:t xml:space="preserve"> (mock data; not wired to API yet)</w:t>
             </w:r>
           </w:p>
         </w:tc>
@@ -2094,7 +2322,7 @@
         <w:pStyle w:val="Heading3"/>
       </w:pPr>
       <w:r>
-        <w:t>5.1 Sign-off result</w:t>
+        <w:t>5.1 Sign-off result (re-parse 6 July 2026)</w:t>
       </w:r>
     </w:p>
     <w:tbl>
@@ -2241,6 +2469,108 @@
             </w:pPr>
             <w:r/>
             <w:r>
+              <w:t>Components parsed</w:t>
+            </w:r>
+          </w:p>
+        </w:tc>
+        <w:tc>
+          <w:tcPr>
+            <w:tcW w:type="dxa" w:w="4680"/>
+          </w:tcPr>
+          <w:p>
+            <w:pPr>
+              <w:spacing w:after="40"/>
+            </w:pPr>
+            <w:r/>
+            <w:r>
+              <w:rPr>
+                <w:b/>
+              </w:rPr>
+              <w:t>640,563</w:t>
+            </w:r>
+          </w:p>
+        </w:tc>
+      </w:tr>
+      <w:tr>
+        <w:tc>
+          <w:tcPr>
+            <w:tcW w:type="dxa" w:w="4680"/>
+          </w:tcPr>
+          <w:p>
+            <w:pPr>
+              <w:spacing w:after="40"/>
+            </w:pPr>
+            <w:r/>
+            <w:r>
+              <w:t>Violations (R01–R20)</w:t>
+            </w:r>
+          </w:p>
+        </w:tc>
+        <w:tc>
+          <w:tcPr>
+            <w:tcW w:type="dxa" w:w="4680"/>
+          </w:tcPr>
+          <w:p>
+            <w:pPr>
+              <w:spacing w:after="40"/>
+            </w:pPr>
+            <w:r/>
+            <w:r>
+              <w:rPr>
+                <w:b/>
+              </w:rPr>
+              <w:t>462,542</w:t>
+            </w:r>
+          </w:p>
+        </w:tc>
+      </w:tr>
+      <w:tr>
+        <w:tc>
+          <w:tcPr>
+            <w:tcW w:type="dxa" w:w="4680"/>
+          </w:tcPr>
+          <w:p>
+            <w:pPr>
+              <w:spacing w:after="40"/>
+            </w:pPr>
+            <w:r/>
+            <w:r>
+              <w:t>Extended parser fields</w:t>
+            </w:r>
+          </w:p>
+        </w:tc>
+        <w:tc>
+          <w:tcPr>
+            <w:tcW w:type="dxa" w:w="4680"/>
+          </w:tcPr>
+          <w:p>
+            <w:pPr>
+              <w:spacing w:after="40"/>
+            </w:pPr>
+            <w:r/>
+            <w:r>
+              <w:rPr>
+                <w:b/>
+              </w:rPr>
+              <w:t>0 missing</w:t>
+            </w:r>
+            <w:r>
+              <w:t xml:space="preserve"> (all 13 R13–R20 fields)</w:t>
+            </w:r>
+          </w:p>
+        </w:tc>
+      </w:tr>
+      <w:tr>
+        <w:tc>
+          <w:tcPr>
+            <w:tcW w:type="dxa" w:w="4680"/>
+          </w:tcPr>
+          <w:p>
+            <w:pPr>
+              <w:spacing w:after="40"/>
+            </w:pPr>
+            <w:r/>
+            <w:r>
               <w:t>Parse OK</w:t>
             </w:r>
           </w:p>
@@ -2339,17 +2669,67 @@
     </w:p>
     <w:p>
       <w:r>
-        <w:t xml:space="preserve">Script: </w:t>
+        <w:t xml:space="preserve">Scripts: </w:t>
       </w:r>
       <w:r>
         <w:rPr>
           <w:rFonts w:ascii="Consolas" w:hAnsi="Consolas"/>
           <w:sz w:val="20"/>
         </w:rPr>
-        <w:t>scripts/masc_parse_signoff.py</w:t>
-      </w:r>
-      <w:r>
-        <w:t xml:space="preserve"> (29 June 2026)</w:t>
+        <w:t>python test_run.py --dataset masc</w:t>
+      </w:r>
+      <w:r>
+        <w:t xml:space="preserve"> · </w:t>
+      </w:r>
+      <w:r>
+        <w:rPr>
+          <w:rFonts w:ascii="Consolas" w:hAnsi="Consolas"/>
+          <w:sz w:val="20"/>
+        </w:rPr>
+        <w:t>python scripts/masc_parse_signoff.py</w:t>
+      </w:r>
+    </w:p>
+    <w:p>
+      <w:r>
+        <w:t xml:space="preserve">Commit: </w:t>
+      </w:r>
+      <w:r>
+        <w:rPr>
+          <w:rFonts w:ascii="Consolas" w:hAnsi="Consolas"/>
+          <w:sz w:val="20"/>
+        </w:rPr>
+        <w:t>f7bcac9</w:t>
+      </w:r>
+      <w:r>
+        <w:t xml:space="preserve"> on branch </w:t>
+      </w:r>
+      <w:r>
+        <w:rPr>
+          <w:rFonts w:ascii="Consolas" w:hAnsi="Consolas"/>
+          <w:sz w:val="20"/>
+        </w:rPr>
+        <w:t>noor</w:t>
+      </w:r>
+    </w:p>
+    <w:p>
+      <w:r>
+        <w:rPr>
+          <w:b/>
+        </w:rPr>
+        <w:t>Parser fix (Jul 2026):</w:t>
+      </w:r>
+      <w:r>
+        <w:t xml:space="preserve"> MASC widgets nest inside </w:t>
+      </w:r>
+      <w:r>
+        <w:rPr>
+          <w:rFonts w:ascii="Consolas" w:hAnsi="Consolas"/>
+          <w:sz w:val="20"/>
+        </w:rPr>
+        <w:t>&lt;wrapper&gt;</w:t>
+      </w:r>
+      <w:r>
+        <w:t xml:space="preserve"> nodes; depth-first walk now descends into wrappers (previously ~1 component/screen).</w:t>
       </w:r>
     </w:p>
     <w:p>
@@ -4467,7 +4847,7 @@
         <w:pStyle w:val="Heading3"/>
       </w:pPr>
       <w:r>
-        <w:t>Top real-world issue types (literature + our Week 3 validation)</w:t>
+        <w:t>Top real-world issue types (literature + full MASC validation, Jul 2026)</w:t>
       </w:r>
     </w:p>
     <w:tbl>
@@ -4540,7 +4920,7 @@
             </w:pPr>
             <w:r/>
             <w:r>
-              <w:t>Week 3 evidence</w:t>
+              <w:t>MASC evidence (7,068 screens)</w:t>
             </w:r>
           </w:p>
         </w:tc>
@@ -4570,7 +4950,141 @@
             </w:pPr>
             <w:r/>
             <w:r>
-              <w:t>Small touch target</w:t>
+              <w:t>Missing label / content description</w:t>
+            </w:r>
+          </w:p>
+        </w:tc>
+        <w:tc>
+          <w:tcPr>
+            <w:tcW w:type="dxa" w:w="2340"/>
+          </w:tcPr>
+          <w:p>
+            <w:pPr>
+              <w:spacing w:after="40"/>
+            </w:pPr>
+            <w:r/>
+            <w:r>
+              <w:rPr>
+                <w:b/>
+              </w:rPr>
+              <w:t>R01</w:t>
+            </w:r>
+            <w:r>
+              <w:t>, R02, R30</w:t>
+            </w:r>
+          </w:p>
+        </w:tc>
+        <w:tc>
+          <w:tcPr>
+            <w:tcW w:type="dxa" w:w="2340"/>
+          </w:tcPr>
+          <w:p>
+            <w:pPr>
+              <w:spacing w:after="40"/>
+            </w:pPr>
+            <w:r/>
+            <w:r>
+              <w:t>R01: 60,112 violations / 6,185 screens</w:t>
+            </w:r>
+          </w:p>
+        </w:tc>
+      </w:tr>
+      <w:tr>
+        <w:tc>
+          <w:tcPr>
+            <w:tcW w:type="dxa" w:w="2340"/>
+          </w:tcPr>
+          <w:p>
+            <w:pPr>
+              <w:spacing w:after="40"/>
+            </w:pPr>
+            <w:r/>
+            <w:r>
+              <w:t>2</w:t>
+            </w:r>
+          </w:p>
+        </w:tc>
+        <w:tc>
+          <w:tcPr>
+            <w:tcW w:type="dxa" w:w="2340"/>
+          </w:tcPr>
+          <w:p>
+            <w:pPr>
+              <w:spacing w:after="40"/>
+            </w:pPr>
+            <w:r/>
+            <w:r>
+              <w:t>Layout / focus order issues</w:t>
+            </w:r>
+          </w:p>
+        </w:tc>
+        <w:tc>
+          <w:tcPr>
+            <w:tcW w:type="dxa" w:w="2340"/>
+          </w:tcPr>
+          <w:p>
+            <w:pPr>
+              <w:spacing w:after="40"/>
+            </w:pPr>
+            <w:r/>
+            <w:r>
+              <w:rPr>
+                <w:b/>
+              </w:rPr>
+              <w:t>R07</w:t>
+            </w:r>
+            <w:r>
+              <w:t xml:space="preserve">, R08, </w:t>
+            </w:r>
+            <w:r>
+              <w:rPr>
+                <w:b/>
+              </w:rPr>
+              <w:t>R15</w:t>
+            </w:r>
+          </w:p>
+        </w:tc>
+        <w:tc>
+          <w:tcPr>
+            <w:tcW w:type="dxa" w:w="2340"/>
+          </w:tcPr>
+          <w:p>
+            <w:pPr>
+              <w:spacing w:after="40"/>
+            </w:pPr>
+            <w:r/>
+            <w:r>
+              <w:t>R07: 266,393; R15: 3,860 screens</w:t>
+            </w:r>
+          </w:p>
+        </w:tc>
+      </w:tr>
+      <w:tr>
+        <w:tc>
+          <w:tcPr>
+            <w:tcW w:type="dxa" w:w="2340"/>
+          </w:tcPr>
+          <w:p>
+            <w:pPr>
+              <w:spacing w:after="40"/>
+            </w:pPr>
+            <w:r/>
+            <w:r>
+              <w:t>3</w:t>
+            </w:r>
+          </w:p>
+        </w:tc>
+        <w:tc>
+          <w:tcPr>
+            <w:tcW w:type="dxa" w:w="2340"/>
+          </w:tcPr>
+          <w:p>
+            <w:pPr>
+              <w:spacing w:after="40"/>
+            </w:pPr>
+            <w:r/>
+            <w:r>
+              <w:t>Small touch target / spacing</w:t>
             </w:r>
           </w:p>
         </w:tc>
@@ -4590,71 +5104,13 @@
               <w:t>R04</w:t>
             </w:r>
             <w:r>
-              <w:t>, R17</w:t>
-            </w:r>
-          </w:p>
-        </w:tc>
-        <w:tc>
-          <w:tcPr>
-            <w:tcW w:type="dxa" w:w="2340"/>
-          </w:tcPr>
-          <w:p>
-            <w:pPr>
-              <w:spacing w:after="40"/>
-            </w:pPr>
-            <w:r/>
-            <w:r>
-              <w:t>3 hits on 20 MASC screens (Salar validation)</w:t>
-            </w:r>
-          </w:p>
-        </w:tc>
-      </w:tr>
-      <w:tr>
-        <w:tc>
-          <w:tcPr>
-            <w:tcW w:type="dxa" w:w="2340"/>
-          </w:tcPr>
-          <w:p>
-            <w:pPr>
-              <w:spacing w:after="40"/>
-            </w:pPr>
-            <w:r/>
-            <w:r>
-              <w:t>2</w:t>
-            </w:r>
-          </w:p>
-        </w:tc>
-        <w:tc>
-          <w:tcPr>
-            <w:tcW w:type="dxa" w:w="2340"/>
-          </w:tcPr>
-          <w:p>
-            <w:pPr>
-              <w:spacing w:after="40"/>
-            </w:pPr>
-            <w:r/>
-            <w:r>
-              <w:t>Missing label / content description</w:t>
-            </w:r>
-          </w:p>
-        </w:tc>
-        <w:tc>
-          <w:tcPr>
-            <w:tcW w:type="dxa" w:w="2340"/>
-          </w:tcPr>
-          <w:p>
-            <w:pPr>
-              <w:spacing w:after="40"/>
-            </w:pPr>
-            <w:r/>
+              <w:t xml:space="preserve">, </w:t>
+            </w:r>
             <w:r>
               <w:rPr>
                 <w:b/>
               </w:rPr>
-              <w:t>R01</w:t>
-            </w:r>
-            <w:r>
-              <w:t>, R02, R30</w:t>
+              <w:t>R17</w:t>
             </w:r>
           </w:p>
         </w:tc>
@@ -4668,7 +5124,7 @@
             </w:pPr>
             <w:r/>
             <w:r>
-              <w:t>261 R01 + 28 R02 on 20 MASC screens</w:t>
+              <w:t>R17: 9,327 violations / 1,697 screens</w:t>
             </w:r>
           </w:p>
         </w:tc>
@@ -4684,7 +5140,138 @@
             </w:pPr>
             <w:r/>
             <w:r>
-              <w:t>3</w:t>
+              <w:t>4</w:t>
+            </w:r>
+          </w:p>
+        </w:tc>
+        <w:tc>
+          <w:tcPr>
+            <w:tcW w:type="dxa" w:w="2340"/>
+          </w:tcPr>
+          <w:p>
+            <w:pPr>
+              <w:spacing w:after="40"/>
+            </w:pPr>
+            <w:r/>
+            <w:r>
+              <w:t>Multi-gesture only</w:t>
+            </w:r>
+          </w:p>
+        </w:tc>
+        <w:tc>
+          <w:tcPr>
+            <w:tcW w:type="dxa" w:w="2340"/>
+          </w:tcPr>
+          <w:p>
+            <w:pPr>
+              <w:spacing w:after="40"/>
+            </w:pPr>
+            <w:r/>
+            <w:r>
+              <w:rPr>
+                <w:b/>
+              </w:rPr>
+              <w:t>R18</w:t>
+            </w:r>
+          </w:p>
+        </w:tc>
+        <w:tc>
+          <w:tcPr>
+            <w:tcW w:type="dxa" w:w="2340"/>
+          </w:tcPr>
+          <w:p>
+            <w:pPr>
+              <w:spacing w:after="40"/>
+            </w:pPr>
+            <w:r/>
+            <w:r>
+              <w:t>R18: 13,529 violations / 3,945 screens</w:t>
+            </w:r>
+          </w:p>
+        </w:tc>
+      </w:tr>
+      <w:tr>
+        <w:tc>
+          <w:tcPr>
+            <w:tcW w:type="dxa" w:w="2340"/>
+          </w:tcPr>
+          <w:p>
+            <w:pPr>
+              <w:spacing w:after="40"/>
+            </w:pPr>
+            <w:r/>
+            <w:r>
+              <w:t>5</w:t>
+            </w:r>
+          </w:p>
+        </w:tc>
+        <w:tc>
+          <w:tcPr>
+            <w:tcW w:type="dxa" w:w="2340"/>
+          </w:tcPr>
+          <w:p>
+            <w:pPr>
+              <w:spacing w:after="40"/>
+            </w:pPr>
+            <w:r/>
+            <w:r>
+              <w:t>Unlabeled input</w:t>
+            </w:r>
+          </w:p>
+        </w:tc>
+        <w:tc>
+          <w:tcPr>
+            <w:tcW w:type="dxa" w:w="2340"/>
+          </w:tcPr>
+          <w:p>
+            <w:pPr>
+              <w:spacing w:after="40"/>
+            </w:pPr>
+            <w:r/>
+            <w:r>
+              <w:rPr>
+                <w:b/>
+              </w:rPr>
+              <w:t>R05</w:t>
+            </w:r>
+            <w:r>
+              <w:t xml:space="preserve">, </w:t>
+            </w:r>
+            <w:r>
+              <w:rPr>
+                <w:b/>
+              </w:rPr>
+              <w:t>R20</w:t>
+            </w:r>
+          </w:p>
+        </w:tc>
+        <w:tc>
+          <w:tcPr>
+            <w:tcW w:type="dxa" w:w="2340"/>
+          </w:tcPr>
+          <w:p>
+            <w:pPr>
+              <w:spacing w:after="40"/>
+            </w:pPr>
+            <w:r/>
+            <w:r>
+              <w:t>R05: 3,797; R20: 0 (no hint-only inputs in MASC)</w:t>
+            </w:r>
+          </w:p>
+        </w:tc>
+      </w:tr>
+      <w:tr>
+        <w:tc>
+          <w:tcPr>
+            <w:tcW w:type="dxa" w:w="2340"/>
+          </w:tcPr>
+          <w:p>
+            <w:pPr>
+              <w:spacing w:after="40"/>
+            </w:pPr>
+            <w:r/>
+            <w:r>
+              <w:t>6</w:t>
             </w:r>
           </w:p>
         </w:tc>
@@ -4729,135 +5316,7 @@
             </w:pPr>
             <w:r/>
             <w:r>
-              <w:t>Placeholder — needs screenshot CV (Stretch)</w:t>
-            </w:r>
-          </w:p>
-        </w:tc>
-      </w:tr>
-      <w:tr>
-        <w:tc>
-          <w:tcPr>
-            <w:tcW w:type="dxa" w:w="2340"/>
-          </w:tcPr>
-          <w:p>
-            <w:pPr>
-              <w:spacing w:after="40"/>
-            </w:pPr>
-            <w:r/>
-            <w:r>
-              <w:t>4</w:t>
-            </w:r>
-          </w:p>
-        </w:tc>
-        <w:tc>
-          <w:tcPr>
-            <w:tcW w:type="dxa" w:w="2340"/>
-          </w:tcPr>
-          <w:p>
-            <w:pPr>
-              <w:spacing w:after="40"/>
-            </w:pPr>
-            <w:r/>
-            <w:r>
-              <w:t>Unlabeled input</w:t>
-            </w:r>
-          </w:p>
-        </w:tc>
-        <w:tc>
-          <w:tcPr>
-            <w:tcW w:type="dxa" w:w="2340"/>
-          </w:tcPr>
-          <w:p>
-            <w:pPr>
-              <w:spacing w:after="40"/>
-            </w:pPr>
-            <w:r/>
-            <w:r>
-              <w:rPr>
-                <w:b/>
-              </w:rPr>
-              <w:t>R05</w:t>
-            </w:r>
-            <w:r>
-              <w:t>, R20</w:t>
-            </w:r>
-          </w:p>
-        </w:tc>
-        <w:tc>
-          <w:tcPr>
-            <w:tcW w:type="dxa" w:w="2340"/>
-          </w:tcPr>
-          <w:p>
-            <w:pPr>
-              <w:spacing w:after="40"/>
-            </w:pPr>
-            <w:r/>
-            <w:r>
-              <w:t>9 R05 hits on validation sample</w:t>
-            </w:r>
-          </w:p>
-        </w:tc>
-      </w:tr>
-      <w:tr>
-        <w:tc>
-          <w:tcPr>
-            <w:tcW w:type="dxa" w:w="2340"/>
-          </w:tcPr>
-          <w:p>
-            <w:pPr>
-              <w:spacing w:after="40"/>
-            </w:pPr>
-            <w:r/>
-            <w:r>
-              <w:t>5</w:t>
-            </w:r>
-          </w:p>
-        </w:tc>
-        <w:tc>
-          <w:tcPr>
-            <w:tcW w:type="dxa" w:w="2340"/>
-          </w:tcPr>
-          <w:p>
-            <w:pPr>
-              <w:spacing w:after="40"/>
-            </w:pPr>
-            <w:r/>
-            <w:r>
-              <w:t>Image/icon without text alternative</w:t>
-            </w:r>
-          </w:p>
-        </w:tc>
-        <w:tc>
-          <w:tcPr>
-            <w:tcW w:type="dxa" w:w="2340"/>
-          </w:tcPr>
-          <w:p>
-            <w:pPr>
-              <w:spacing w:after="40"/>
-            </w:pPr>
-            <w:r/>
-            <w:r>
-              <w:rPr>
-                <w:b/>
-              </w:rPr>
-              <w:t>R02</w:t>
-            </w:r>
-            <w:r>
-              <w:t>, R30</w:t>
-            </w:r>
-          </w:p>
-        </w:tc>
-        <w:tc>
-          <w:tcPr>
-            <w:tcW w:type="dxa" w:w="2340"/>
-          </w:tcPr>
-          <w:p>
-            <w:pPr>
-              <w:spacing w:after="40"/>
-            </w:pPr>
-            <w:r/>
-            <w:r>
-              <w:t>Covered by R02</w:t>
+              <w:t>0 — needs screenshot CV</w:t>
             </w:r>
           </w:p>
         </w:tc>
@@ -4894,20 +5353,10 @@
         <w:rPr>
           <w:b/>
         </w:rPr>
-        <w:t>Investigate R07 dominance</w:t>
-      </w:r>
-      <w:r>
-        <w:t xml:space="preserve"> — 65% of violations in Salar's 20-screen run; may include parser </w:t>
-      </w:r>
-      <w:r>
-        <w:rPr>
-          <w:rFonts w:ascii="Consolas" w:hAnsi="Consolas"/>
-          <w:sz w:val="20"/>
-        </w:rPr>
-        <w:t>[0,0,0,0]</w:t>
-      </w:r>
-      <w:r>
-        <w:t xml:space="preserve"> bounds fallback (follow-up needed).</w:t>
+        <w:t>R07 remains dominant</w:t>
+      </w:r>
+      <w:r>
+        <w:t xml:space="preserve"> on full MASC — review false-positive rate (bounds fallback).</w:t>
       </w:r>
     </w:p>
     <w:p>
@@ -4918,30 +5367,10 @@
         <w:rPr>
           <w:b/>
         </w:rPr>
-        <w:t>Issue-level JSON</w:t>
-      </w:r>
-      <w:r>
-        <w:t xml:space="preserve"> (</w:t>
-      </w:r>
-      <w:r>
-        <w:rPr>
-          <w:rFonts w:ascii="Consolas" w:hAnsi="Consolas"/>
-          <w:sz w:val="20"/>
-        </w:rPr>
-        <w:t>violations.json</w:t>
-      </w:r>
-      <w:r>
-        <w:t xml:space="preserve"> → </w:t>
-      </w:r>
-      <w:r>
-        <w:rPr>
-          <w:rFonts w:ascii="Consolas" w:hAnsi="Consolas"/>
-          <w:sz w:val="20"/>
-        </w:rPr>
-        <w:t>report.json</w:t>
-      </w:r>
-      <w:r>
-        <w:t>) matches research direction — enables severity stats and guideline mapping.</w:t>
+        <w:t>R13–R20 are active</w:t>
+      </w:r>
+      <w:r>
+        <w:t xml:space="preserve"> on real data after parser re-parse (audio, focus order, spacing, gestures).</w:t>
       </w:r>
     </w:p>
     <w:p>
@@ -4952,10 +5381,10 @@
         <w:rPr>
           <w:b/>
         </w:rPr>
-        <w:t>Fixing gap</w:t>
-      </w:r>
-      <w:r>
-        <w:t xml:space="preserve"> — Chen et al. report many apps do not improve accessibility across versions; our agent layer should produce actionable developer fixes, not just detection counts.</w:t>
+        <w:t>Issue-level JSON</w:t>
+      </w:r>
+      <w:r>
+        <w:t xml:space="preserve"> enables severity stats and guideline mapping per Chen et al.</w:t>
       </w:r>
     </w:p>
     <w:p>
@@ -4963,7 +5392,7 @@
         <w:rPr>
           <w:b/>
         </w:rPr>
-        <w:t>Source for our validation counts:</w:t>
+        <w:t>Sources:</w:t>
       </w:r>
       <w:r>
         <w:t xml:space="preserve"> </w:t>
@@ -4973,20 +5402,17 @@
           <w:rFonts w:ascii="Consolas" w:hAnsi="Consolas"/>
           <w:sz w:val="20"/>
         </w:rPr>
-        <w:t>outputs/validation_logs/week3_summary.md</w:t>
-      </w:r>
-      <w:r>
-        <w:t xml:space="preserve"> (Salar, </w:t>
+        <w:t>outputs/validation_logs/noor_week3_summary.md</w:t>
+      </w:r>
+      <w:r>
+        <w:t xml:space="preserve"> · </w:t>
       </w:r>
       <w:r>
         <w:rPr>
           <w:rFonts w:ascii="Consolas" w:hAnsi="Consolas"/>
           <w:sz w:val="20"/>
         </w:rPr>
-        <w:t>salar</w:t>
-      </w:r>
-      <w:r>
-        <w:t xml:space="preserve"> branch).</w:t>
+        <w:t>data/data-masc/parsed/masc_parse_signoff_report.json</w:t>
       </w:r>
     </w:p>
     <w:p>
@@ -5180,7 +5606,7 @@
             </w:pPr>
             <w:r/>
             <w:r>
-              <w:t>R11–R20 / G11–G20</w:t>
+              <w:t>R11–R12 / G11–G12</w:t>
             </w:r>
           </w:p>
         </w:tc>
@@ -5229,6 +5655,70 @@
             <w:r/>
             <w:r>
               <w:t>Noor</w:t>
+            </w:r>
+          </w:p>
+        </w:tc>
+      </w:tr>
+      <w:tr>
+        <w:tc>
+          <w:tcPr>
+            <w:tcW w:type="dxa" w:w="2340"/>
+          </w:tcPr>
+          <w:p>
+            <w:pPr>
+              <w:spacing w:after="40"/>
+            </w:pPr>
+            <w:r/>
+            <w:r>
+              <w:t>R13–R20 / G13–G20</w:t>
+            </w:r>
+          </w:p>
+        </w:tc>
+        <w:tc>
+          <w:tcPr>
+            <w:tcW w:type="dxa" w:w="2340"/>
+          </w:tcPr>
+          <w:p>
+            <w:pPr>
+              <w:spacing w:after="40"/>
+            </w:pPr>
+            <w:r/>
+            <w:r>
+              <w:rPr>
+                <w:b/>
+              </w:rPr>
+              <w:t>Noor</w:t>
+            </w:r>
+          </w:p>
+        </w:tc>
+        <w:tc>
+          <w:tcPr>
+            <w:tcW w:type="dxa" w:w="2340"/>
+          </w:tcPr>
+          <w:p>
+            <w:pPr>
+              <w:spacing w:after="40"/>
+            </w:pPr>
+            <w:r/>
+            <w:r>
+              <w:rPr>
+                <w:b/>
+              </w:rPr>
+              <w:t>Salar</w:t>
+            </w:r>
+          </w:p>
+        </w:tc>
+        <w:tc>
+          <w:tcPr>
+            <w:tcW w:type="dxa" w:w="2340"/>
+          </w:tcPr>
+          <w:p>
+            <w:pPr>
+              <w:spacing w:after="40"/>
+            </w:pPr>
+            <w:r/>
+            <w:r>
+              <w:t>Ayesha</w:t>
             </w:r>
           </w:p>
         </w:tc>
@@ -6025,7 +6515,7 @@
             </w:pPr>
             <w:r/>
             <w:r>
-              <w:t>🟡 Stub</w:t>
+              <w:t>🟡 Partial</w:t>
             </w:r>
           </w:p>
         </w:tc>
@@ -6039,7 +6529,7 @@
             </w:pPr>
             <w:r/>
             <w:r>
-              <w:t>Needs screenshot contrast</w:t>
+              <w:t>Needs declared colors / screenshot contrast</w:t>
             </w:r>
           </w:p>
         </w:tc>
@@ -6166,7 +6656,7 @@
             </w:pPr>
             <w:r/>
             <w:r>
-              <w:t>🟡 Stub</w:t>
+              <w:t>✅ Done</w:t>
             </w:r>
           </w:p>
         </w:tc>
@@ -6179,12 +6669,28 @@
               <w:spacing w:after="40"/>
             </w:pPr>
             <w:r/>
+            <w:r>
+              <w:t xml:space="preserve">Implemented on </w:t>
+            </w:r>
             <w:r>
               <w:rPr>
                 <w:rFonts w:ascii="Consolas" w:hAnsi="Consolas"/>
                 <w:sz w:val="20"/>
               </w:rPr>
-              <w:t>docs/r11_r12_design.md</w:t>
+              <w:t>salar</w:t>
+            </w:r>
+            <w:r>
+              <w:t>/</w:t>
+            </w:r>
+            <w:r>
+              <w:rPr>
+                <w:rFonts w:ascii="Consolas" w:hAnsi="Consolas"/>
+                <w:sz w:val="20"/>
+              </w:rPr>
+              <w:t>noor</w:t>
+            </w:r>
+            <w:r>
+              <w:t xml:space="preserve"> (checkable-state widgets); Ayesha review pending</w:t>
             </w:r>
           </w:p>
         </w:tc>
@@ -6242,7 +6748,7 @@
             </w:pPr>
             <w:r/>
             <w:r>
-              <w:t>🟡 Stub</w:t>
+              <w:t>✅ Done</w:t>
             </w:r>
           </w:p>
         </w:tc>
@@ -6256,7 +6762,14 @@
             </w:pPr>
             <w:r/>
             <w:r>
-              <w:t>Flags VideoView only</w:t>
+              <w:rPr>
+                <w:rFonts w:ascii="Consolas" w:hAnsi="Consolas"/>
+                <w:sz w:val="20"/>
+              </w:rPr>
+              <w:t>media_type</w:t>
+            </w:r>
+            <w:r>
+              <w:t xml:space="preserve"> + caption heuristics</w:t>
             </w:r>
           </w:p>
         </w:tc>
@@ -6300,7 +6813,7 @@
             </w:pPr>
             <w:r/>
             <w:r>
-              <w:t>Ayesha</w:t>
+              <w:t>Noor</w:t>
             </w:r>
           </w:p>
         </w:tc>
@@ -6314,7 +6827,7 @@
             </w:pPr>
             <w:r/>
             <w:r>
-              <w:t>⬜ Week 4+</w:t>
+              <w:t>✅ Done</w:t>
             </w:r>
           </w:p>
         </w:tc>
@@ -6327,6 +6840,9 @@
               <w:spacing w:after="40"/>
             </w:pPr>
             <w:r/>
+            <w:r>
+              <w:t>1,055 violations / 118 MASC screens</w:t>
+            </w:r>
           </w:p>
         </w:tc>
       </w:tr>
@@ -6369,7 +6885,7 @@
             </w:pPr>
             <w:r/>
             <w:r>
-              <w:t>Ayesha</w:t>
+              <w:t>Noor</w:t>
             </w:r>
           </w:p>
         </w:tc>
@@ -6383,7 +6899,7 @@
             </w:pPr>
             <w:r/>
             <w:r>
-              <w:t>⬜ Week 4+</w:t>
+              <w:t>✅ Done</w:t>
             </w:r>
           </w:p>
         </w:tc>
@@ -6396,6 +6912,9 @@
               <w:spacing w:after="40"/>
             </w:pPr>
             <w:r/>
+            <w:r>
+              <w:t>1,873 / 667 screens</w:t>
+            </w:r>
           </w:p>
         </w:tc>
       </w:tr>
@@ -6438,7 +6957,7 @@
             </w:pPr>
             <w:r/>
             <w:r>
-              <w:t>Ayesha</w:t>
+              <w:t>Noor</w:t>
             </w:r>
           </w:p>
         </w:tc>
@@ -6452,7 +6971,7 @@
             </w:pPr>
             <w:r/>
             <w:r>
-              <w:t>⬜ Week 4+</w:t>
+              <w:t>✅ Done</w:t>
             </w:r>
           </w:p>
         </w:tc>
@@ -6465,6 +6984,9 @@
               <w:spacing w:after="40"/>
             </w:pPr>
             <w:r/>
+            <w:r>
+              <w:t>3,860 / 3,860 screens</w:t>
+            </w:r>
           </w:p>
         </w:tc>
       </w:tr>
@@ -6507,7 +7029,7 @@
             </w:pPr>
             <w:r/>
             <w:r>
-              <w:t>Ayesha</w:t>
+              <w:t>Noor</w:t>
             </w:r>
           </w:p>
         </w:tc>
@@ -6521,7 +7043,7 @@
             </w:pPr>
             <w:r/>
             <w:r>
-              <w:t>⬜ Week 4+</w:t>
+              <w:t>✅ Done</w:t>
             </w:r>
           </w:p>
         </w:tc>
@@ -6534,6 +7056,9 @@
               <w:spacing w:after="40"/>
             </w:pPr>
             <w:r/>
+            <w:r>
+              <w:t>130 / 115 screens</w:t>
+            </w:r>
           </w:p>
         </w:tc>
       </w:tr>
@@ -6576,7 +7101,7 @@
             </w:pPr>
             <w:r/>
             <w:r>
-              <w:t>Ayesha</w:t>
+              <w:t>Noor</w:t>
             </w:r>
           </w:p>
         </w:tc>
@@ -6590,7 +7115,7 @@
             </w:pPr>
             <w:r/>
             <w:r>
-              <w:t>⬜ Week 4+</w:t>
+              <w:t>✅ Done</w:t>
             </w:r>
           </w:p>
         </w:tc>
@@ -6604,7 +7129,14 @@
             </w:pPr>
             <w:r/>
             <w:r>
-              <w:t>Pairs with R04</w:t>
+              <w:rPr>
+                <w:rFonts w:ascii="Consolas" w:hAnsi="Consolas"/>
+                <w:sz w:val="20"/>
+              </w:rPr>
+              <w:t>related_component</w:t>
+            </w:r>
+            <w:r>
+              <w:t>; 9,327 / 1,697</w:t>
             </w:r>
           </w:p>
         </w:tc>
@@ -6648,7 +7180,7 @@
             </w:pPr>
             <w:r/>
             <w:r>
-              <w:t>Ayesha</w:t>
+              <w:t>Noor</w:t>
             </w:r>
           </w:p>
         </w:tc>
@@ -6662,7 +7194,7 @@
             </w:pPr>
             <w:r/>
             <w:r>
-              <w:t>⬜ Week 4+</w:t>
+              <w:t>✅ Done</w:t>
             </w:r>
           </w:p>
         </w:tc>
@@ -6675,6 +7207,9 @@
               <w:spacing w:after="40"/>
             </w:pPr>
             <w:r/>
+            <w:r>
+              <w:t>13,529 / 3,945 screens</w:t>
+            </w:r>
           </w:p>
         </w:tc>
       </w:tr>
@@ -6717,7 +7252,7 @@
             </w:pPr>
             <w:r/>
             <w:r>
-              <w:t>Ayesha</w:t>
+              <w:t>Noor</w:t>
             </w:r>
           </w:p>
         </w:tc>
@@ -6731,7 +7266,7 @@
             </w:pPr>
             <w:r/>
             <w:r>
-              <w:t>⬜ Week 4+</w:t>
+              <w:t>✅ Done</w:t>
             </w:r>
           </w:p>
         </w:tc>
@@ -6744,6 +7279,9 @@
               <w:spacing w:after="40"/>
             </w:pPr>
             <w:r/>
+            <w:r>
+              <w:t>758 / 416 screens</w:t>
+            </w:r>
           </w:p>
         </w:tc>
       </w:tr>
@@ -6786,7 +7324,7 @@
             </w:pPr>
             <w:r/>
             <w:r>
-              <w:t>Ayesha</w:t>
+              <w:t>Noor</w:t>
             </w:r>
           </w:p>
         </w:tc>
@@ -6800,7 +7338,7 @@
             </w:pPr>
             <w:r/>
             <w:r>
-              <w:t>⬜ Week 4+</w:t>
+              <w:t>✅ Done</w:t>
             </w:r>
           </w:p>
         </w:tc>
@@ -6813,6 +7351,9 @@
               <w:spacing w:after="40"/>
             </w:pPr>
             <w:r/>
+            <w:r>
+              <w:t>Unit tests pass; 0 MASC hits</w:t>
+            </w:r>
           </w:p>
         </w:tc>
       </w:tr>
@@ -6869,7 +7410,7 @@
             </w:pPr>
             <w:r/>
             <w:r>
-              <w:t>⬜ Week 4+</w:t>
+              <w:t>✅ Done</w:t>
             </w:r>
           </w:p>
         </w:tc>
@@ -6882,6 +7423,9 @@
               <w:spacing w:after="40"/>
             </w:pPr>
             <w:r/>
+            <w:r>
+              <w:t>Vague error message (Salar sync Week 4)</w:t>
+            </w:r>
           </w:p>
         </w:tc>
       </w:tr>
@@ -6938,7 +7482,7 @@
             </w:pPr>
             <w:r/>
             <w:r>
-              <w:t>⬜ Week 4+</w:t>
+              <w:t>✅ Done</w:t>
             </w:r>
           </w:p>
         </w:tc>
@@ -6951,6 +7495,9 @@
               <w:spacing w:after="40"/>
             </w:pPr>
             <w:r/>
+            <w:r>
+              <w:t>No password toggle</w:t>
+            </w:r>
           </w:p>
         </w:tc>
       </w:tr>
@@ -7007,7 +7554,7 @@
             </w:pPr>
             <w:r/>
             <w:r>
-              <w:t>⬜ Week 5+</w:t>
+              <w:t>✅ Done</w:t>
             </w:r>
           </w:p>
         </w:tc>
@@ -7020,6 +7567,9 @@
               <w:spacing w:after="40"/>
             </w:pPr>
             <w:r/>
+            <w:r>
+              <w:t>Unlabeled nav control</w:t>
+            </w:r>
           </w:p>
         </w:tc>
       </w:tr>
@@ -7076,7 +7626,7 @@
             </w:pPr>
             <w:r/>
             <w:r>
-              <w:t>⬜ Week 5+</w:t>
+              <w:t>✅ Done</w:t>
             </w:r>
           </w:p>
         </w:tc>
@@ -7089,6 +7639,9 @@
               <w:spacing w:after="40"/>
             </w:pPr>
             <w:r/>
+            <w:r>
+              <w:t>Missing screen title</w:t>
+            </w:r>
           </w:p>
         </w:tc>
       </w:tr>
@@ -7145,7 +7698,7 @@
             </w:pPr>
             <w:r/>
             <w:r>
-              <w:t>⬜ Week 5+</w:t>
+              <w:t>✅ Done</w:t>
             </w:r>
           </w:p>
         </w:tc>
@@ -7158,6 +7711,9 @@
               <w:spacing w:after="40"/>
             </w:pPr>
             <w:r/>
+            <w:r>
+              <w:t>Uncontrolled animation</w:t>
+            </w:r>
           </w:p>
         </w:tc>
       </w:tr>
@@ -7214,7 +7770,7 @@
             </w:pPr>
             <w:r/>
             <w:r>
-              <w:t>⬜ Week 5+</w:t>
+              <w:t>✅ Done</w:t>
             </w:r>
           </w:p>
         </w:tc>
@@ -7227,6 +7783,9 @@
               <w:spacing w:after="40"/>
             </w:pPr>
             <w:r/>
+            <w:r>
+              <w:t>No timeout warning</w:t>
+            </w:r>
           </w:p>
         </w:tc>
       </w:tr>
@@ -7283,7 +7842,7 @@
             </w:pPr>
             <w:r/>
             <w:r>
-              <w:t>⬜ Week 6+</w:t>
+              <w:t>✅ Done</w:t>
             </w:r>
           </w:p>
         </w:tc>
@@ -7296,6 +7855,9 @@
               <w:spacing w:after="40"/>
             </w:pPr>
             <w:r/>
+            <w:r>
+              <w:t>Complex label language</w:t>
+            </w:r>
           </w:p>
         </w:tc>
       </w:tr>
@@ -7352,7 +7914,7 @@
             </w:pPr>
             <w:r/>
             <w:r>
-              <w:t>⬜ Week 6+</w:t>
+              <w:t>✅ Done</w:t>
             </w:r>
           </w:p>
         </w:tc>
@@ -7365,6 +7927,9 @@
               <w:spacing w:after="40"/>
             </w:pPr>
             <w:r/>
+            <w:r>
+              <w:t>Font scale overflow (needs declared text size)</w:t>
+            </w:r>
           </w:p>
         </w:tc>
       </w:tr>
@@ -7421,7 +7986,7 @@
             </w:pPr>
             <w:r/>
             <w:r>
-              <w:t>⬜ Week 6+</w:t>
+              <w:t>✅ Done</w:t>
             </w:r>
           </w:p>
         </w:tc>
@@ -7434,6 +7999,9 @@
               <w:spacing w:after="40"/>
             </w:pPr>
             <w:r/>
+            <w:r>
+              <w:t>All-caps body text</w:t>
+            </w:r>
           </w:p>
         </w:tc>
       </w:tr>
@@ -7490,7 +8058,7 @@
             </w:pPr>
             <w:r/>
             <w:r>
-              <w:t>⬜ Week 6+</w:t>
+              <w:t>✅ Done</w:t>
             </w:r>
           </w:p>
         </w:tc>
@@ -7503,6 +8071,9 @@
               <w:spacing w:after="40"/>
             </w:pPr>
             <w:r/>
+            <w:r>
+              <w:t>Icon-only, no label</w:t>
+            </w:r>
           </w:p>
         </w:tc>
       </w:tr>
@@ -7536,7 +8107,7 @@
         <w:pStyle w:val="Heading2"/>
       </w:pPr>
       <w:r>
-        <w:t>14. Recommended next steps (updated Week 3)</w:t>
+        <w:t>14. Recommended next steps (updated 9 July 2026)</w:t>
       </w:r>
     </w:p>
     <w:p>
@@ -7547,10 +8118,69 @@
         <w:rPr>
           <w:b/>
         </w:rPr>
-        <w:t>Salar:</w:t>
-      </w:r>
-      <w:r>
-        <w:t xml:space="preserve"> Tune R07 false positives; begin R13–R15 with team</w:t>
+        <w:t>Ayesha:</w:t>
+      </w:r>
+      <w:r>
+        <w:t xml:space="preserve"> Wire </w:t>
+      </w:r>
+      <w:r>
+        <w:rPr>
+          <w:rFonts w:ascii="Consolas" w:hAnsi="Consolas"/>
+          <w:sz w:val="20"/>
+        </w:rPr>
+        <w:t>frontend/</w:t>
+      </w:r>
+      <w:r>
+        <w:t xml:space="preserve"> to live audit API (</w:t>
+      </w:r>
+      <w:r>
+        <w:rPr>
+          <w:rFonts w:ascii="Consolas" w:hAnsi="Consolas"/>
+          <w:sz w:val="20"/>
+        </w:rPr>
+        <w:t>POST /audit</w:t>
+      </w:r>
+      <w:r>
+        <w:t xml:space="preserve">, </w:t>
+      </w:r>
+      <w:r>
+        <w:rPr>
+          <w:rFonts w:ascii="Consolas" w:hAnsi="Consolas"/>
+          <w:sz w:val="20"/>
+        </w:rPr>
+        <w:t>GET …/violations</w:t>
+      </w:r>
+      <w:r>
+        <w:t xml:space="preserve">, </w:t>
+      </w:r>
+      <w:r>
+        <w:rPr>
+          <w:rFonts w:ascii="Consolas" w:hAnsi="Consolas"/>
+          <w:sz w:val="20"/>
+        </w:rPr>
+        <w:t>GET …/report</w:t>
+      </w:r>
+      <w:r>
+        <w:t>); run prompt experiments (</w:t>
+      </w:r>
+      <w:r>
+        <w:rPr>
+          <w:rFonts w:ascii="Consolas" w:hAnsi="Consolas"/>
+          <w:sz w:val="20"/>
+        </w:rPr>
+        <w:t>run_explainer_sample.py</w:t>
+      </w:r>
+      <w:r>
+        <w:t xml:space="preserve">) and resolve </w:t>
+      </w:r>
+      <w:r>
+        <w:rPr>
+          <w:b/>
+        </w:rPr>
+        <w:t>TBD-01</w:t>
+      </w:r>
+      <w:r>
+        <w:t xml:space="preserve"> with Noor; review R11–R12</w:t>
       </w:r>
     </w:p>
     <w:p>
@@ -7561,20 +8191,20 @@
         <w:rPr>
           <w:b/>
         </w:rPr>
-        <w:t>Ayesha:</w:t>
-      </w:r>
-      <w:r>
-        <w:t xml:space="preserve"> Push </w:t>
+        <w:t>Noor:</w:t>
+      </w:r>
+      <w:r>
+        <w:t xml:space="preserve"> Start </w:t>
       </w:r>
       <w:r>
         <w:rPr>
           <w:rFonts w:ascii="Consolas" w:hAnsi="Consolas"/>
           <w:sz w:val="20"/>
         </w:rPr>
-        <w:t>frontend/</w:t>
-      </w:r>
-      <w:r>
-        <w:t>; refine R11/R12 stubs; connect to audit API</w:t>
+        <w:t>src/report.py</w:t>
+      </w:r>
+      <w:r>
+        <w:t xml:space="preserve"> HTML/PDF; update validation logs for R01–R30; Rico holdout batch parse</w:t>
       </w:r>
     </w:p>
     <w:p>
@@ -7585,30 +8215,10 @@
         <w:rPr>
           <w:b/>
         </w:rPr>
-        <w:t>Noor:</w:t>
-      </w:r>
-      <w:r>
-        <w:t xml:space="preserve"> Wire LLM into </w:t>
-      </w:r>
-      <w:r>
-        <w:rPr>
-          <w:rFonts w:ascii="Consolas" w:hAnsi="Consolas"/>
-          <w:sz w:val="20"/>
-        </w:rPr>
-        <w:t>src/agent.py</w:t>
-      </w:r>
-      <w:r>
-        <w:t xml:space="preserve">; add </w:t>
-      </w:r>
-      <w:r>
-        <w:rPr>
-          <w:rFonts w:ascii="Consolas" w:hAnsi="Consolas"/>
-          <w:sz w:val="20"/>
-        </w:rPr>
-        <w:t>src/report.py</w:t>
-      </w:r>
-      <w:r>
-        <w:t>; Rico holdout eval design</w:t>
+        <w:t>Salar:</w:t>
+      </w:r>
+      <w:r>
+        <w:t xml:space="preserve"> Tune R07 false positives; improve R09 when colors/screenshots available</w:t>
       </w:r>
     </w:p>
     <w:p>
@@ -7622,7 +8232,7 @@
         <w:t>All:</w:t>
       </w:r>
       <w:r>
-        <w:t xml:space="preserve"> Demo — XML upload → API → violations → report.json on one screen</w:t>
+        <w:t xml:space="preserve"> Demo — XML upload → API → violations → agent-enriched report (template or live LLM)</w:t>
       </w:r>
     </w:p>
     <w:p>
@@ -7656,6 +8266,754 @@
           <w:color w:val="333333"/>
         </w:rPr>
         <w:t>**Instructions:** Each intern adds a dated entry after pushing work. Newest week at the top. Keep entries factual — file names, test counts, branch commits.</w:t>
+      </w:r>
+    </w:p>
+    <w:p>
+      <w:pPr>
+        <w:pStyle w:val="Heading3"/>
+      </w:pPr>
+      <w:r>
+        <w:t>Week 4 — Noor (`noor` branch, commits `98efd2fe0` → `0144b1af3`)</w:t>
+      </w:r>
+    </w:p>
+    <w:p>
+      <w:r>
+        <w:rPr>
+          <w:b/>
+        </w:rPr>
+        <w:t>Pushed by:</w:t>
+      </w:r>
+      <w:r>
+        <w:t xml:space="preserve"> Muhammad Noor</w:t>
+      </w:r>
+    </w:p>
+    <w:p>
+      <w:r>
+        <w:rPr>
+          <w:b/>
+        </w:rPr>
+        <w:t>Date:</w:t>
+      </w:r>
+      <w:r>
+        <w:t xml:space="preserve"> 9 July 2026</w:t>
+      </w:r>
+    </w:p>
+    <w:p>
+      <w:r>
+        <w:rPr>
+          <w:b/>
+        </w:rPr>
+        <w:t>Completed:</w:t>
+      </w:r>
+    </w:p>
+    <w:p>
+      <w:pPr>
+        <w:pStyle w:val="ListBullet"/>
+      </w:pPr>
+      <w:r>
+        <w:rPr>
+          <w:b/>
+        </w:rPr>
+        <w:t>Salar sync</w:t>
+      </w:r>
+      <w:r>
+        <w:t xml:space="preserve"> (</w:t>
+      </w:r>
+      <w:r>
+        <w:rPr>
+          <w:rFonts w:ascii="Consolas" w:hAnsi="Consolas"/>
+          <w:sz w:val="20"/>
+        </w:rPr>
+        <w:t>98efd2fe0</w:t>
+      </w:r>
+      <w:r>
+        <w:t xml:space="preserve">): Stage 3 LLM layer — </w:t>
+      </w:r>
+      <w:r>
+        <w:rPr>
+          <w:rFonts w:ascii="Consolas" w:hAnsi="Consolas"/>
+          <w:sz w:val="20"/>
+        </w:rPr>
+        <w:t>src/explainer.py</w:t>
+      </w:r>
+      <w:r>
+        <w:t xml:space="preserve">, </w:t>
+      </w:r>
+      <w:r>
+        <w:rPr>
+          <w:rFonts w:ascii="Consolas" w:hAnsi="Consolas"/>
+          <w:sz w:val="20"/>
+        </w:rPr>
+        <w:t>src/guidelines.py</w:t>
+      </w:r>
+      <w:r>
+        <w:t xml:space="preserve">, </w:t>
+      </w:r>
+      <w:r>
+        <w:rPr>
+          <w:rFonts w:ascii="Consolas" w:hAnsi="Consolas"/>
+          <w:sz w:val="20"/>
+        </w:rPr>
+        <w:t>src/llm_providers.py</w:t>
+      </w:r>
+      <w:r>
+        <w:t xml:space="preserve">; rules </w:t>
+      </w:r>
+      <w:r>
+        <w:rPr>
+          <w:b/>
+        </w:rPr>
+        <w:t>R01–R30</w:t>
+      </w:r>
+      <w:r>
+        <w:t xml:space="preserve"> + visibility filter; parser bounds/visibility fixes; R11 + R21–R30 fixtures; </w:t>
+      </w:r>
+      <w:r>
+        <w:rPr>
+          <w:rFonts w:ascii="Consolas" w:hAnsi="Consolas"/>
+          <w:sz w:val="20"/>
+        </w:rPr>
+        <w:t>scripts/run_explainer_sample.py</w:t>
+      </w:r>
+      <w:r>
+        <w:t xml:space="preserve">, </w:t>
+      </w:r>
+      <w:r>
+        <w:rPr>
+          <w:rFonts w:ascii="Consolas" w:hAnsi="Consolas"/>
+          <w:sz w:val="20"/>
+        </w:rPr>
+        <w:t>compare_visibility_filter_impact.py</w:t>
+      </w:r>
+      <w:r>
+        <w:t xml:space="preserve">; </w:t>
+      </w:r>
+      <w:r>
+        <w:rPr>
+          <w:rFonts w:ascii="Consolas" w:hAnsi="Consolas"/>
+          <w:sz w:val="20"/>
+        </w:rPr>
+        <w:t>.env.example</w:t>
+      </w:r>
+    </w:p>
+    <w:p>
+      <w:pPr>
+        <w:pStyle w:val="ListBullet"/>
+      </w:pPr>
+      <w:r>
+        <w:rPr>
+          <w:b/>
+        </w:rPr>
+        <w:t>Notebook sync</w:t>
+      </w:r>
+      <w:r>
+        <w:t xml:space="preserve"> (</w:t>
+      </w:r>
+      <w:r>
+        <w:rPr>
+          <w:rFonts w:ascii="Consolas" w:hAnsi="Consolas"/>
+          <w:sz w:val="20"/>
+        </w:rPr>
+        <w:t>20c96fd07</w:t>
+      </w:r>
+      <w:r>
+        <w:t xml:space="preserve">): </w:t>
+      </w:r>
+      <w:r>
+        <w:rPr>
+          <w:rFonts w:ascii="Consolas" w:hAnsi="Consolas"/>
+          <w:sz w:val="20"/>
+        </w:rPr>
+        <w:t>notebooks/masc_dataset_analysis.ipynb</w:t>
+      </w:r>
+    </w:p>
+    <w:p>
+      <w:pPr>
+        <w:pStyle w:val="ListBullet"/>
+      </w:pPr>
+      <w:r>
+        <w:rPr>
+          <w:b/>
+        </w:rPr>
+        <w:t>Ayesha frontend sync</w:t>
+      </w:r>
+      <w:r>
+        <w:t xml:space="preserve"> (</w:t>
+      </w:r>
+      <w:r>
+        <w:rPr>
+          <w:rFonts w:ascii="Consolas" w:hAnsi="Consolas"/>
+          <w:sz w:val="20"/>
+        </w:rPr>
+        <w:t>2d8356066</w:t>
+      </w:r>
+      <w:r>
+        <w:t xml:space="preserve">): Report/Sidebar/Dashboard/Records/Upload updates + </w:t>
+      </w:r>
+      <w:r>
+        <w:rPr>
+          <w:rFonts w:ascii="Consolas" w:hAnsi="Consolas"/>
+          <w:sz w:val="20"/>
+        </w:rPr>
+        <w:t>frontend/src/state/auditFiles.js</w:t>
+      </w:r>
+    </w:p>
+    <w:p>
+      <w:pPr>
+        <w:pStyle w:val="ListBullet"/>
+      </w:pPr>
+      <w:r>
+        <w:rPr>
+          <w:b/>
+        </w:rPr>
+        <w:t>Agent API wiring</w:t>
+      </w:r>
+      <w:r>
+        <w:t xml:space="preserve"> (</w:t>
+      </w:r>
+      <w:r>
+        <w:rPr>
+          <w:rFonts w:ascii="Consolas" w:hAnsi="Consolas"/>
+          <w:sz w:val="20"/>
+        </w:rPr>
+        <w:t>0144b1af3</w:t>
+      </w:r>
+      <w:r>
+        <w:t xml:space="preserve">): </w:t>
+      </w:r>
+      <w:r>
+        <w:rPr>
+          <w:rFonts w:ascii="Consolas" w:hAnsi="Consolas"/>
+          <w:sz w:val="20"/>
+        </w:rPr>
+        <w:t>build_audit_report()</w:t>
+      </w:r>
+      <w:r>
+        <w:t xml:space="preserve"> in </w:t>
+      </w:r>
+      <w:r>
+        <w:rPr>
+          <w:rFonts w:ascii="Consolas" w:hAnsi="Consolas"/>
+          <w:sz w:val="20"/>
+        </w:rPr>
+        <w:t>src/agent.py</w:t>
+      </w:r>
+      <w:r>
+        <w:t xml:space="preserve"> merges explainer + score formula (TBD-02); </w:t>
+      </w:r>
+      <w:r>
+        <w:rPr>
+          <w:rFonts w:ascii="Consolas" w:hAnsi="Consolas"/>
+          <w:sz w:val="20"/>
+        </w:rPr>
+        <w:t>GET /api/v1/audit/{id}/report</w:t>
+      </w:r>
+      <w:r>
+        <w:t xml:space="preserve">; pipeline statuses include </w:t>
+      </w:r>
+      <w:r>
+        <w:rPr>
+          <w:rFonts w:ascii="Consolas" w:hAnsi="Consolas"/>
+          <w:sz w:val="20"/>
+        </w:rPr>
+        <w:t>explaining</w:t>
+      </w:r>
+      <w:r>
+        <w:t xml:space="preserve">; template fallback when no API key (FR-AG.6); reports → </w:t>
+      </w:r>
+      <w:r>
+        <w:rPr>
+          <w:rFonts w:ascii="Consolas" w:hAnsi="Consolas"/>
+          <w:sz w:val="20"/>
+        </w:rPr>
+        <w:t>outputs/reports/</w:t>
+      </w:r>
+    </w:p>
+    <w:p>
+      <w:pPr>
+        <w:pStyle w:val="ListBullet"/>
+      </w:pPr>
+      <w:r>
+        <w:rPr>
+          <w:b/>
+        </w:rPr>
+        <w:t>Tests:</w:t>
+      </w:r>
+      <w:r>
+        <w:t xml:space="preserve"> </w:t>
+      </w:r>
+      <w:r>
+        <w:rPr>
+          <w:b/>
+        </w:rPr>
+        <w:t>94 pytest</w:t>
+      </w:r>
+      <w:r>
+        <w:t xml:space="preserve"> passed (parser, rules R01–R30, agent, audit, explainer)</w:t>
+      </w:r>
+    </w:p>
+    <w:p>
+      <w:pPr>
+        <w:pStyle w:val="ListBullet"/>
+      </w:pPr>
+      <w:r>
+        <w:t xml:space="preserve">Week 4 demo goal met: XML upload → violations → agent-enriched </w:t>
+      </w:r>
+      <w:r>
+        <w:rPr>
+          <w:rFonts w:ascii="Consolas" w:hAnsi="Consolas"/>
+          <w:sz w:val="20"/>
+        </w:rPr>
+        <w:t>report.json</w:t>
+      </w:r>
+      <w:r>
+        <w:t xml:space="preserve"> (template mode without live LLM)</w:t>
+      </w:r>
+    </w:p>
+    <w:p>
+      <w:r>
+        <w:rPr>
+          <w:b/>
+        </w:rPr>
+        <w:t>Pending:</w:t>
+      </w:r>
+    </w:p>
+    <w:p>
+      <w:pPr>
+        <w:pStyle w:val="ListBullet"/>
+      </w:pPr>
+      <w:r>
+        <w:t>Ayesha: frontend ↔ API wiring; prompt experiments + TBD-01 model choice</w:t>
+      </w:r>
+    </w:p>
+    <w:p>
+      <w:pPr>
+        <w:pStyle w:val="ListBullet"/>
+      </w:pPr>
+      <w:r>
+        <w:rPr>
+          <w:rFonts w:ascii="Consolas" w:hAnsi="Consolas"/>
+          <w:sz w:val="20"/>
+        </w:rPr>
+        <w:t>src/report.py</w:t>
+      </w:r>
+      <w:r>
+        <w:t xml:space="preserve"> HTML/PDF (Week 5)</w:t>
+      </w:r>
+    </w:p>
+    <w:p>
+      <w:pPr>
+        <w:pStyle w:val="ListBullet"/>
+      </w:pPr>
+      <w:r>
+        <w:t>Formal R11–R15 review sign-off documentation</w:t>
+      </w:r>
+    </w:p>
+    <w:p>
+      <w:pPr>
+        <w:pStyle w:val="ListBullet"/>
+      </w:pPr>
+      <w:r>
+        <w:t>Rico holdout batch evaluation</w:t>
+      </w:r>
+    </w:p>
+    <w:p>
+      <w:pPr>
+        <w:pStyle w:val="ListBullet"/>
+      </w:pPr>
+      <w:r>
+        <w:t>Auth + Records API</w:t>
+      </w:r>
+    </w:p>
+    <w:p>
+      <w:r>
+        <w:rPr>
+          <w:b/>
+        </w:rPr>
+        <w:t>Blockers:</w:t>
+      </w:r>
+      <w:r>
+        <w:t xml:space="preserve"> None (API ready for Ayesha)</w:t>
+      </w:r>
+    </w:p>
+    <w:p>
+      <w:pPr>
+        <w:spacing w:before="120" w:after="120"/>
+      </w:pPr>
+      <w:r>
+        <w:rPr>
+          <w:color w:val="CCCCCC"/>
+          <w:sz w:val="16"/>
+        </w:rPr>
+        <w:t>────────────────────────────────────────────────────────────────────────</w:t>
+      </w:r>
+    </w:p>
+    <w:p>
+      <w:pPr>
+        <w:pStyle w:val="Heading3"/>
+      </w:pPr>
+      <w:r>
+        <w:t>Week 3+ — Noor (`noor` branch, commit `f7bcac9`)</w:t>
+      </w:r>
+    </w:p>
+    <w:p>
+      <w:r>
+        <w:rPr>
+          <w:b/>
+        </w:rPr>
+        <w:t>Pushed by:</w:t>
+      </w:r>
+      <w:r>
+        <w:t xml:space="preserve"> Muhammad Noor</w:t>
+      </w:r>
+    </w:p>
+    <w:p>
+      <w:r>
+        <w:rPr>
+          <w:b/>
+        </w:rPr>
+        <w:t>Date:</w:t>
+      </w:r>
+      <w:r>
+        <w:t xml:space="preserve"> 6 July 2026</w:t>
+      </w:r>
+    </w:p>
+    <w:p>
+      <w:r>
+        <w:rPr>
+          <w:b/>
+        </w:rPr>
+        <w:t>Completed:</w:t>
+      </w:r>
+    </w:p>
+    <w:p>
+      <w:pPr>
+        <w:pStyle w:val="ListBullet"/>
+      </w:pPr>
+      <w:r>
+        <w:rPr>
+          <w:b/>
+        </w:rPr>
+        <w:t>Parser R13–R20 extension</w:t>
+      </w:r>
+      <w:r>
+        <w:t xml:space="preserve"> — 13 new component fields (</w:t>
+      </w:r>
+      <w:r>
+        <w:rPr>
+          <w:rFonts w:ascii="Consolas" w:hAnsi="Consolas"/>
+          <w:sz w:val="20"/>
+        </w:rPr>
+        <w:t>focus_order</w:t>
+      </w:r>
+      <w:r>
+        <w:t xml:space="preserve">, </w:t>
+      </w:r>
+      <w:r>
+        <w:rPr>
+          <w:rFonts w:ascii="Consolas" w:hAnsi="Consolas"/>
+          <w:sz w:val="20"/>
+        </w:rPr>
+        <w:t>parent_id</w:t>
+      </w:r>
+      <w:r>
+        <w:t xml:space="preserve">, </w:t>
+      </w:r>
+      <w:r>
+        <w:rPr>
+          <w:rFonts w:ascii="Consolas" w:hAnsi="Consolas"/>
+          <w:sz w:val="20"/>
+        </w:rPr>
+        <w:t>media_type</w:t>
+      </w:r>
+      <w:r>
+        <w:t>, etc.)</w:t>
+      </w:r>
+    </w:p>
+    <w:p>
+      <w:pPr>
+        <w:pStyle w:val="ListBullet"/>
+      </w:pPr>
+      <w:r>
+        <w:rPr>
+          <w:b/>
+        </w:rPr>
+        <w:t>MASC `&lt;wrapper&gt;` fix</w:t>
+      </w:r>
+      <w:r>
+        <w:t xml:space="preserve"> — full widget extraction (640,563 components vs ~1/screen before)</w:t>
+      </w:r>
+    </w:p>
+    <w:p>
+      <w:pPr>
+        <w:pStyle w:val="ListBullet"/>
+      </w:pPr>
+      <w:r>
+        <w:rPr>
+          <w:b/>
+        </w:rPr>
+        <w:t>Rules R13–R20</w:t>
+      </w:r>
+      <w:r>
+        <w:t xml:space="preserve"> wired in </w:t>
+      </w:r>
+      <w:r>
+        <w:rPr>
+          <w:rFonts w:ascii="Consolas" w:hAnsi="Consolas"/>
+          <w:sz w:val="20"/>
+        </w:rPr>
+        <w:t>check()</w:t>
+      </w:r>
+      <w:r>
+        <w:t xml:space="preserve">; </w:t>
+      </w:r>
+      <w:r>
+        <w:rPr>
+          <w:b/>
+        </w:rPr>
+        <w:t>31</w:t>
+      </w:r>
+      <w:r>
+        <w:t xml:space="preserve"> rule tests + </w:t>
+      </w:r>
+      <w:r>
+        <w:rPr>
+          <w:b/>
+        </w:rPr>
+        <w:t>3</w:t>
+      </w:r>
+      <w:r>
+        <w:t xml:space="preserve"> parser tests (</w:t>
+      </w:r>
+      <w:r>
+        <w:rPr>
+          <w:b/>
+        </w:rPr>
+        <w:t>38</w:t>
+      </w:r>
+      <w:r>
+        <w:t xml:space="preserve"> total with agent/audit)</w:t>
+      </w:r>
+    </w:p>
+    <w:p>
+      <w:pPr>
+        <w:pStyle w:val="ListBullet"/>
+      </w:pPr>
+      <w:r>
+        <w:rPr>
+          <w:b/>
+        </w:rPr>
+        <w:t>Full MASC re-parse</w:t>
+      </w:r>
+      <w:r>
+        <w:t xml:space="preserve"> — 7,068 XML → </w:t>
+      </w:r>
+      <w:r>
+        <w:rPr>
+          <w:rFonts w:ascii="Consolas" w:hAnsi="Consolas"/>
+          <w:sz w:val="20"/>
+        </w:rPr>
+        <w:t>data/data-masc/parsed/</w:t>
+      </w:r>
+      <w:r>
+        <w:t xml:space="preserve">; </w:t>
+      </w:r>
+      <w:r>
+        <w:rPr>
+          <w:b/>
+        </w:rPr>
+        <w:t>462,542</w:t>
+      </w:r>
+      <w:r>
+        <w:t xml:space="preserve"> violations</w:t>
+      </w:r>
+    </w:p>
+    <w:p>
+      <w:pPr>
+        <w:pStyle w:val="ListBullet"/>
+      </w:pPr>
+      <w:r>
+        <w:rPr>
+          <w:b/>
+        </w:rPr>
+        <w:t>`scripts/noor_week3_validate.py`</w:t>
+      </w:r>
+      <w:r>
+        <w:t xml:space="preserve"> — re-parse + pytest + random 20-screen MASC sample + schema check</w:t>
+      </w:r>
+    </w:p>
+    <w:p>
+      <w:pPr>
+        <w:pStyle w:val="ListBullet"/>
+      </w:pPr>
+      <w:r>
+        <w:rPr>
+          <w:b/>
+        </w:rPr>
+        <w:t>`scripts/masc_parse_signoff.py`</w:t>
+      </w:r>
+      <w:r>
+        <w:t xml:space="preserve"> — extended-field validation + R13–R20 aggregate counts</w:t>
+      </w:r>
+    </w:p>
+    <w:p>
+      <w:pPr>
+        <w:pStyle w:val="ListBullet"/>
+      </w:pPr>
+      <w:r>
+        <w:rPr>
+          <w:b/>
+        </w:rPr>
+        <w:t>SDS v2.1</w:t>
+      </w:r>
+      <w:r>
+        <w:t xml:space="preserve"> — R01–R20 parser/rules design, validation artefact paths</w:t>
+      </w:r>
+    </w:p>
+    <w:p>
+      <w:pPr>
+        <w:pStyle w:val="ListBullet"/>
+      </w:pPr>
+      <w:r>
+        <w:rPr>
+          <w:b/>
+        </w:rPr>
+        <w:t>`auditor_schema.json`</w:t>
+      </w:r>
+      <w:r>
+        <w:t xml:space="preserve"> — optional R13–R20 component fields</w:t>
+      </w:r>
+    </w:p>
+    <w:p>
+      <w:pPr>
+        <w:pStyle w:val="ListBullet"/>
+      </w:pPr>
+      <w:r>
+        <w:t xml:space="preserve">Validation logs: </w:t>
+      </w:r>
+      <w:r>
+        <w:rPr>
+          <w:rFonts w:ascii="Consolas" w:hAnsi="Consolas"/>
+          <w:sz w:val="20"/>
+        </w:rPr>
+        <w:t>noor_week3_summary.md</w:t>
+      </w:r>
+      <w:r>
+        <w:t xml:space="preserve">, </w:t>
+      </w:r>
+      <w:r>
+        <w:rPr>
+          <w:rFonts w:ascii="Consolas" w:hAnsi="Consolas"/>
+          <w:sz w:val="20"/>
+        </w:rPr>
+        <w:t>noor_week3_validation_log.txt</w:t>
+      </w:r>
+      <w:r>
+        <w:t xml:space="preserve">, </w:t>
+      </w:r>
+      <w:r>
+        <w:rPr>
+          <w:rFonts w:ascii="Consolas" w:hAnsi="Consolas"/>
+          <w:sz w:val="20"/>
+        </w:rPr>
+        <w:t>masc_reparse_log.txt</w:t>
+      </w:r>
+    </w:p>
+    <w:p>
+      <w:pPr>
+        <w:pStyle w:val="ListBullet"/>
+      </w:pPr>
+      <w:r>
+        <w:t xml:space="preserve">Sign-off: </w:t>
+      </w:r>
+      <w:r>
+        <w:rPr>
+          <w:rFonts w:ascii="Consolas" w:hAnsi="Consolas"/>
+          <w:sz w:val="20"/>
+        </w:rPr>
+        <w:t>masc_parse_signoff_report.json</w:t>
+      </w:r>
+      <w:r>
+        <w:t xml:space="preserve"> → </w:t>
+      </w:r>
+      <w:r>
+        <w:rPr>
+          <w:b/>
+        </w:rPr>
+        <w:t>PASS</w:t>
+      </w:r>
+      <w:r>
+        <w:t xml:space="preserve"> (0 extended-field misses)</w:t>
+      </w:r>
+    </w:p>
+    <w:p>
+      <w:r>
+        <w:rPr>
+          <w:b/>
+        </w:rPr>
+        <w:t>Pending:</w:t>
+      </w:r>
+    </w:p>
+    <w:p>
+      <w:pPr>
+        <w:pStyle w:val="ListBullet"/>
+      </w:pPr>
+      <w:r>
+        <w:t>Wire live LLM into agent (Week 4)</w:t>
+      </w:r>
+    </w:p>
+    <w:p>
+      <w:pPr>
+        <w:pStyle w:val="ListBullet"/>
+      </w:pPr>
+      <w:r>
+        <w:t>Connect frontend to FastAPI</w:t>
+      </w:r>
+    </w:p>
+    <w:p>
+      <w:pPr>
+        <w:pStyle w:val="ListBullet"/>
+      </w:pPr>
+      <w:r>
+        <w:rPr>
+          <w:rFonts w:ascii="Consolas" w:hAnsi="Consolas"/>
+          <w:sz w:val="20"/>
+        </w:rPr>
+        <w:t>src/report.py</w:t>
+      </w:r>
+      <w:r>
+        <w:t xml:space="preserve"> HTML/PDF generation</w:t>
+      </w:r>
+    </w:p>
+    <w:p>
+      <w:pPr>
+        <w:pStyle w:val="ListBullet"/>
+      </w:pPr>
+      <w:r>
+        <w:t>Auth + Records API</w:t>
+      </w:r>
+    </w:p>
+    <w:p>
+      <w:r>
+        <w:rPr>
+          <w:b/>
+        </w:rPr>
+        <w:t>Blockers:</w:t>
+      </w:r>
+      <w:r>
+        <w:t xml:space="preserve"> None</w:t>
+      </w:r>
+    </w:p>
+    <w:p>
+      <w:pPr>
+        <w:spacing w:before="120" w:after="120"/>
+      </w:pPr>
+      <w:r>
+        <w:rPr>
+          <w:color w:val="CCCCCC"/>
+          <w:sz w:val="16"/>
+        </w:rPr>
+        <w:t>────────────────────────────────────────────────────────────────────────</w:t>
       </w:r>
     </w:p>
     <w:p>
@@ -8897,6 +10255,189 @@
             <w:r/>
             <w:r>
               <w:t>§4 project folder structure updated for Week 3 repo layout</w:t>
+            </w:r>
+          </w:p>
+        </w:tc>
+      </w:tr>
+      <w:tr>
+        <w:tc>
+          <w:tcPr>
+            <w:tcW w:type="dxa" w:w="2340"/>
+          </w:tcPr>
+          <w:p>
+            <w:pPr>
+              <w:spacing w:after="40"/>
+            </w:pPr>
+            <w:r/>
+            <w:r>
+              <w:t>1.4</w:t>
+            </w:r>
+          </w:p>
+        </w:tc>
+        <w:tc>
+          <w:tcPr>
+            <w:tcW w:type="dxa" w:w="2340"/>
+          </w:tcPr>
+          <w:p>
+            <w:pPr>
+              <w:spacing w:after="40"/>
+            </w:pPr>
+            <w:r/>
+            <w:r>
+              <w:t>6 Jul 2026</w:t>
+            </w:r>
+          </w:p>
+        </w:tc>
+        <w:tc>
+          <w:tcPr>
+            <w:tcW w:type="dxa" w:w="2340"/>
+          </w:tcPr>
+          <w:p>
+            <w:pPr>
+              <w:spacing w:after="40"/>
+            </w:pPr>
+            <w:r/>
+            <w:r>
+              <w:t>Noor</w:t>
+            </w:r>
+          </w:p>
+        </w:tc>
+        <w:tc>
+          <w:tcPr>
+            <w:tcW w:type="dxa" w:w="2340"/>
+          </w:tcPr>
+          <w:p>
+            <w:pPr>
+              <w:spacing w:after="40"/>
+            </w:pPr>
+            <w:r/>
+            <w:r>
+              <w:t>R13–R20 parser/rules, full MASC re-parse, SDS v2.1, validation sign-off</w:t>
+            </w:r>
+          </w:p>
+        </w:tc>
+      </w:tr>
+      <w:tr>
+        <w:tc>
+          <w:tcPr>
+            <w:tcW w:type="dxa" w:w="2340"/>
+          </w:tcPr>
+          <w:p>
+            <w:pPr>
+              <w:spacing w:after="40"/>
+            </w:pPr>
+            <w:r/>
+            <w:r>
+              <w:t>1.5</w:t>
+            </w:r>
+          </w:p>
+        </w:tc>
+        <w:tc>
+          <w:tcPr>
+            <w:tcW w:type="dxa" w:w="2340"/>
+          </w:tcPr>
+          <w:p>
+            <w:pPr>
+              <w:spacing w:after="40"/>
+            </w:pPr>
+            <w:r/>
+            <w:r>
+              <w:t>6 Jul 2026</w:t>
+            </w:r>
+          </w:p>
+        </w:tc>
+        <w:tc>
+          <w:tcPr>
+            <w:tcW w:type="dxa" w:w="2340"/>
+          </w:tcPr>
+          <w:p>
+            <w:pPr>
+              <w:spacing w:after="40"/>
+            </w:pPr>
+            <w:r/>
+            <w:r>
+              <w:t>Noor</w:t>
+            </w:r>
+          </w:p>
+        </w:tc>
+        <w:tc>
+          <w:tcPr>
+            <w:tcW w:type="dxa" w:w="2340"/>
+          </w:tcPr>
+          <w:p>
+            <w:pPr>
+              <w:spacing w:after="40"/>
+            </w:pPr>
+            <w:r/>
+            <w:r>
+              <w:t>R13–R20 rule lead → Noor; DOCX regenerated</w:t>
+            </w:r>
+          </w:p>
+        </w:tc>
+      </w:tr>
+      <w:tr>
+        <w:tc>
+          <w:tcPr>
+            <w:tcW w:type="dxa" w:w="2340"/>
+          </w:tcPr>
+          <w:p>
+            <w:pPr>
+              <w:spacing w:after="40"/>
+            </w:pPr>
+            <w:r/>
+            <w:r>
+              <w:rPr>
+                <w:b/>
+              </w:rPr>
+              <w:t>1.6</w:t>
+            </w:r>
+          </w:p>
+        </w:tc>
+        <w:tc>
+          <w:tcPr>
+            <w:tcW w:type="dxa" w:w="2340"/>
+          </w:tcPr>
+          <w:p>
+            <w:pPr>
+              <w:spacing w:after="40"/>
+            </w:pPr>
+            <w:r/>
+            <w:r>
+              <w:rPr>
+                <w:b/>
+              </w:rPr>
+              <w:t>9 Jul 2026</w:t>
+            </w:r>
+          </w:p>
+        </w:tc>
+        <w:tc>
+          <w:tcPr>
+            <w:tcW w:type="dxa" w:w="2340"/>
+          </w:tcPr>
+          <w:p>
+            <w:pPr>
+              <w:spacing w:after="40"/>
+            </w:pPr>
+            <w:r/>
+            <w:r>
+              <w:rPr>
+                <w:b/>
+              </w:rPr>
+              <w:t>Noor</w:t>
+            </w:r>
+          </w:p>
+        </w:tc>
+        <w:tc>
+          <w:tcPr>
+            <w:tcW w:type="dxa" w:w="2340"/>
+          </w:tcPr>
+          <w:p>
+            <w:pPr>
+              <w:spacing w:after="40"/>
+            </w:pPr>
+            <w:r/>
+            <w:r>
+              <w:t>Week 4: R01–R30, explainer + report API, 94 tests, frontend/notebook sync; next steps + §15</w:t>
             </w:r>
           </w:p>
         </w:tc>

</xml_diff>

<commit_message>
docs(progress): regenerate supplementary report DOCX v1.7 (Week 5)
Export Supplementary_Progress_Report_v1.0.md to formatted and standard DOCX after Week 5 push (4ce430feb) and doc alignment (565b1f26c).

Co-authored-by: Cursor <cursoragent@cursor.com>
</commit_message>
<xml_diff>
--- a/docs/progress/Supplementary_Progress_Report_v1.0.docx
+++ b/docs/progress/Supplementary_Progress_Report_v1.0.docx
@@ -23,7 +23,7 @@
         <w:rPr>
           <w:b/>
         </w:rPr>
-        <w:t>Practical work completed — Weeks 1–4 (baseline 1 July 2026; updated 9 July 2026)</w:t>
+        <w:t>Practical work completed — Weeks 1–5 (baseline 1 July 2026; updated 12 July 2026)</w:t>
       </w:r>
     </w:p>
     <w:p>
@@ -410,7 +410,7 @@
             </w:pPr>
             <w:r/>
             <w:r>
-              <w:t xml:space="preserve">Result (9 Jul on </w:t>
+              <w:t xml:space="preserve">Result (12 Jul on </w:t>
             </w:r>
             <w:r>
               <w:rPr>
@@ -502,13 +502,13 @@
               <w:t>R01–R30 implemented</w:t>
             </w:r>
             <w:r>
-              <w:t xml:space="preserve"> — visibility filter; R11 implemented; R09 needs declared colors/screenshot; </w:t>
+              <w:t xml:space="preserve"> — 57 XML pass/fail fixtures; </w:t>
             </w:r>
             <w:r>
               <w:rPr>
                 <w:b/>
               </w:rPr>
-              <w:t>94 pytest</w:t>
+              <w:t>120 pytest</w:t>
             </w:r>
           </w:p>
         </w:tc>
@@ -604,7 +604,13 @@
             </w:pPr>
             <w:r/>
             <w:r>
-              <w:t xml:space="preserve">Not started — no </w:t>
+              <w:rPr>
+                <w:b/>
+              </w:rPr>
+              <w:t>Done</w:t>
+            </w:r>
+            <w:r>
+              <w:t xml:space="preserve"> — </w:t>
             </w:r>
             <w:r>
               <w:rPr>
@@ -614,62 +620,50 @@
               <w:t>src/report.py</w:t>
             </w:r>
             <w:r>
-              <w:t xml:space="preserve"> HTML/PDF yet</w:t>
-            </w:r>
-          </w:p>
-        </w:tc>
-      </w:tr>
-      <w:tr>
-        <w:tc>
-          <w:tcPr>
-            <w:tcW w:type="dxa" w:w="4680"/>
-          </w:tcPr>
-          <w:p>
-            <w:pPr>
-              <w:spacing w:after="40"/>
-            </w:pPr>
-            <w:r/>
-            <w:r>
-              <w:t>Axion React UI</w:t>
-            </w:r>
-          </w:p>
-        </w:tc>
-        <w:tc>
-          <w:tcPr>
-            <w:tcW w:type="dxa" w:w="4680"/>
-          </w:tcPr>
-          <w:p>
-            <w:pPr>
-              <w:spacing w:after="40"/>
-            </w:pPr>
-            <w:r/>
-            <w:r>
-              <w:rPr>
-                <w:b/>
-              </w:rPr>
-              <w:t>On `noor` branch</w:t>
-            </w:r>
-            <w:r>
-              <w:t xml:space="preserve"> — Ayesha </w:t>
+              <w:t xml:space="preserve"> (Jinja2 HTML + PIL + Playwright PDF); </w:t>
             </w:r>
             <w:r>
               <w:rPr>
                 <w:rFonts w:ascii="Consolas" w:hAnsi="Consolas"/>
                 <w:sz w:val="20"/>
               </w:rPr>
-              <w:t>frontend/</w:t>
-            </w:r>
-            <w:r>
-              <w:t xml:space="preserve"> synced (latest 8 Jul); </w:t>
-            </w:r>
+              <w:t>GET …/report/download</w:t>
+            </w:r>
+          </w:p>
+        </w:tc>
+      </w:tr>
+      <w:tr>
+        <w:tc>
+          <w:tcPr>
+            <w:tcW w:type="dxa" w:w="4680"/>
+          </w:tcPr>
+          <w:p>
+            <w:pPr>
+              <w:spacing w:after="40"/>
+            </w:pPr>
+            <w:r/>
+            <w:r>
+              <w:t>Axion React UI</w:t>
+            </w:r>
+          </w:p>
+        </w:tc>
+        <w:tc>
+          <w:tcPr>
+            <w:tcW w:type="dxa" w:w="4680"/>
+          </w:tcPr>
+          <w:p>
+            <w:pPr>
+              <w:spacing w:after="40"/>
+            </w:pPr>
+            <w:r/>
             <w:r>
               <w:rPr>
                 <w:b/>
               </w:rPr>
-              <w:t>not calling live API</w:t>
-            </w:r>
-            <w:r>
-              <w:t xml:space="preserve"> (mock data)</w:t>
+              <w:t>Partial</w:t>
+            </w:r>
+            <w:r>
+              <w:t xml:space="preserve"> — Upload/Dashboard/Report wired to live API; Records still mock (Week 6)</w:t>
             </w:r>
           </w:p>
         </w:tc>
@@ -715,16 +709,16 @@
               <w:t>POST /audit</w:t>
             </w:r>
             <w:r>
-              <w:t xml:space="preserve"> → violations + </w:t>
+              <w:t xml:space="preserve"> → violations + report + </w:t>
             </w:r>
             <w:r>
               <w:rPr>
                 <w:b/>
               </w:rPr>
-              <w:t>`GET …/report`</w:t>
-            </w:r>
-            <w:r>
-              <w:t xml:space="preserve"> (score + agent fields); no auth/records/download</w:t>
+              <w:t>download</w:t>
+            </w:r>
+            <w:r>
+              <w:t>; no auth/records persistence</w:t>
             </w:r>
           </w:p>
         </w:tc>
@@ -846,7 +840,7 @@
               <w:rPr>
                 <w:b/>
               </w:rPr>
-              <w:t>v1.6</w:t>
+              <w:t>v1.7</w:t>
             </w:r>
           </w:p>
         </w:tc>
@@ -858,10 +852,10 @@
         <w:rPr>
           <w:b/>
         </w:rPr>
-        <w:t>Bottom line (9 Jul):</w:t>
-      </w:r>
-      <w:r>
-        <w:t xml:space="preserve"> Week 4 agent wiring is done — real API demo: XML → R01–R30 → </w:t>
+        <w:t>Bottom line (12 Jul, pushed `4ce430feb`):</w:t>
+      </w:r>
+      <w:r>
+        <w:t xml:space="preserve"> Week 5 complete — full pipeline XML → R01–R30 → </w:t>
       </w:r>
       <w:r>
         <w:rPr>
@@ -871,17 +865,7 @@
         <w:t>report.json</w:t>
       </w:r>
       <w:r>
-        <w:t xml:space="preserve"> (template mode without live LLM). Next: Ayesha frontend↔API + prompt experiments (TBD-01); Noor </w:t>
-      </w:r>
-      <w:r>
-        <w:rPr>
-          <w:rFonts w:ascii="Consolas" w:hAnsi="Consolas"/>
-          <w:sz w:val="20"/>
-        </w:rPr>
-        <w:t>src/report.py</w:t>
-      </w:r>
-      <w:r>
-        <w:t xml:space="preserve"> HTML/PDF.</w:t>
+        <w:t xml:space="preserve"> → downloadable HTML/PDF. Upload/Dashboard/Report wired to live API. Rule fixtures now cover R09–R20. Next: Records + auth (Week 6).</w:t>
       </w:r>
     </w:p>
     <w:p>
@@ -975,7 +959,7 @@
             </w:pPr>
             <w:r/>
             <w:r>
-              <w:t>Status (9 Jul)</w:t>
+              <w:t>Status (12 Jul)</w:t>
             </w:r>
           </w:p>
         </w:tc>
@@ -1168,7 +1152,14 @@
               <w:t>src/rules.py</w:t>
             </w:r>
             <w:r>
-              <w:t>; fixtures R11 + R21–R30</w:t>
+              <w:t xml:space="preserve">; 57 XML fixtures in </w:t>
+            </w:r>
+            <w:r>
+              <w:rPr>
+                <w:rFonts w:ascii="Consolas" w:hAnsi="Consolas"/>
+                <w:sz w:val="20"/>
+              </w:rPr>
+              <w:t>tests/fixtures/rules/</w:t>
             </w:r>
           </w:p>
         </w:tc>
@@ -1335,7 +1326,10 @@
             </w:pPr>
             <w:r/>
             <w:r>
-              <w:t>Planned</w:t>
+              <w:rPr>
+                <w:b/>
+              </w:rPr>
+              <w:t>Done</w:t>
             </w:r>
           </w:p>
         </w:tc>
@@ -1348,9 +1342,6 @@
               <w:spacing w:after="40"/>
             </w:pPr>
             <w:r/>
-            <w:r>
-              <w:t xml:space="preserve">No </w:t>
-            </w:r>
             <w:r>
               <w:rPr>
                 <w:rFonts w:ascii="Consolas" w:hAnsi="Consolas"/>
@@ -1358,97 +1349,15 @@
               </w:rPr>
               <w:t>src/report.py</w:t>
             </w:r>
-          </w:p>
-        </w:tc>
-      </w:tr>
-      <w:tr>
-        <w:tc>
-          <w:tcPr>
-            <w:tcW w:type="dxa" w:w="1872"/>
-          </w:tcPr>
-          <w:p>
-            <w:pPr>
-              <w:spacing w:after="40"/>
-            </w:pPr>
-            <w:r/>
-            <w:r>
-              <w:t>UI — Axion</w:t>
-            </w:r>
-          </w:p>
-        </w:tc>
-        <w:tc>
-          <w:tcPr>
-            <w:tcW w:type="dxa" w:w="1872"/>
-          </w:tcPr>
-          <w:p>
-            <w:pPr>
-              <w:spacing w:after="40"/>
-            </w:pPr>
-            <w:r/>
-            <w:r>
-              <w:t>Ayesha</w:t>
-            </w:r>
-          </w:p>
-        </w:tc>
-        <w:tc>
-          <w:tcPr>
-            <w:tcW w:type="dxa" w:w="1872"/>
-          </w:tcPr>
-          <w:p>
-            <w:pPr>
-              <w:spacing w:after="40"/>
-            </w:pPr>
-            <w:r/>
-            <w:r>
-              <w:t>React dashboard</w:t>
-            </w:r>
-          </w:p>
-        </w:tc>
-        <w:tc>
-          <w:tcPr>
-            <w:tcW w:type="dxa" w:w="1872"/>
-          </w:tcPr>
-          <w:p>
-            <w:pPr>
-              <w:spacing w:after="40"/>
-            </w:pPr>
-            <w:r/>
-            <w:r>
-              <w:rPr>
-                <w:b/>
-              </w:rPr>
-              <w:t>Scaffold</w:t>
-            </w:r>
-          </w:p>
-        </w:tc>
-        <w:tc>
-          <w:tcPr>
-            <w:tcW w:type="dxa" w:w="1872"/>
-          </w:tcPr>
-          <w:p>
-            <w:pPr>
-              <w:spacing w:after="40"/>
-            </w:pPr>
-            <w:r/>
+            <w:r>
+              <w:t xml:space="preserve">; </w:t>
+            </w:r>
             <w:r>
               <w:rPr>
                 <w:rFonts w:ascii="Consolas" w:hAnsi="Consolas"/>
                 <w:sz w:val="20"/>
               </w:rPr>
-              <w:t>frontend/</w:t>
-            </w:r>
-            <w:r>
-              <w:t xml:space="preserve"> on </w:t>
-            </w:r>
-            <w:r>
-              <w:rPr>
-                <w:rFonts w:ascii="Consolas" w:hAnsi="Consolas"/>
-                <w:sz w:val="20"/>
-              </w:rPr>
-              <w:t>noor</w:t>
-            </w:r>
-            <w:r>
-              <w:t>; mock data only</w:t>
+              <w:t>GET …/report/download</w:t>
             </w:r>
           </w:p>
         </w:tc>
@@ -1464,7 +1373,7 @@
             </w:pPr>
             <w:r/>
             <w:r>
-              <w:t>API</w:t>
+              <w:t>UI — Axion</w:t>
             </w:r>
           </w:p>
         </w:tc>
@@ -1478,7 +1387,7 @@
             </w:pPr>
             <w:r/>
             <w:r>
-              <w:t>Noor</w:t>
+              <w:t>Ayesha</w:t>
             </w:r>
           </w:p>
         </w:tc>
@@ -1492,7 +1401,7 @@
             </w:pPr>
             <w:r/>
             <w:r>
-              <w:t>FastAPI audit routes</w:t>
+              <w:t>React dashboard</w:t>
             </w:r>
           </w:p>
         </w:tc>
@@ -1523,7 +1432,82 @@
             </w:pPr>
             <w:r/>
             <w:r>
-              <w:t>violations + report; no auth/records/download</w:t>
+              <w:t>Upload/Dashboard/Report wired; Records mock</w:t>
+            </w:r>
+          </w:p>
+        </w:tc>
+      </w:tr>
+      <w:tr>
+        <w:tc>
+          <w:tcPr>
+            <w:tcW w:type="dxa" w:w="1872"/>
+          </w:tcPr>
+          <w:p>
+            <w:pPr>
+              <w:spacing w:after="40"/>
+            </w:pPr>
+            <w:r/>
+            <w:r>
+              <w:t>API</w:t>
+            </w:r>
+          </w:p>
+        </w:tc>
+        <w:tc>
+          <w:tcPr>
+            <w:tcW w:type="dxa" w:w="1872"/>
+          </w:tcPr>
+          <w:p>
+            <w:pPr>
+              <w:spacing w:after="40"/>
+            </w:pPr>
+            <w:r/>
+            <w:r>
+              <w:t>Noor</w:t>
+            </w:r>
+          </w:p>
+        </w:tc>
+        <w:tc>
+          <w:tcPr>
+            <w:tcW w:type="dxa" w:w="1872"/>
+          </w:tcPr>
+          <w:p>
+            <w:pPr>
+              <w:spacing w:after="40"/>
+            </w:pPr>
+            <w:r/>
+            <w:r>
+              <w:t>FastAPI audit routes</w:t>
+            </w:r>
+          </w:p>
+        </w:tc>
+        <w:tc>
+          <w:tcPr>
+            <w:tcW w:type="dxa" w:w="1872"/>
+          </w:tcPr>
+          <w:p>
+            <w:pPr>
+              <w:spacing w:after="40"/>
+            </w:pPr>
+            <w:r/>
+            <w:r>
+              <w:rPr>
+                <w:b/>
+              </w:rPr>
+              <w:t>Partial</w:t>
+            </w:r>
+          </w:p>
+        </w:tc>
+        <w:tc>
+          <w:tcPr>
+            <w:tcW w:type="dxa" w:w="1872"/>
+          </w:tcPr>
+          <w:p>
+            <w:pPr>
+              <w:spacing w:after="40"/>
+            </w:pPr>
+            <w:r/>
+            <w:r>
+              <w:t>violations + report + download; no auth/records</w:t>
             </w:r>
           </w:p>
         </w:tc>
@@ -1632,7 +1616,7 @@
           <w:i/>
           <w:color w:val="333333"/>
         </w:rPr>
-        <w:t>**As of 9 July 2026** on branch `noor` — canonical repo: [agentic-accessibility-auditor](https://github.com/MuhammadNoor7/agentic-accessibility-auditor)</w:t>
+        <w:t>**As of 12 July 2026** on branch `noor` (commit `4ce430feb`) — canonical repo: [agentic-accessibility-auditor](https://github.com/MuhammadNoor7/agentic-accessibility-auditor)</w:t>
       </w:r>
     </w:p>
     <w:p>
@@ -1656,6 +1640,12 @@
         <w:t>│   ├── rules.py                        ← R01–R30 rule checker (Stage 2)</w:t>
         <w:br/>
         <w:t>│   ├── agent.py                        ← Score + build_audit_report (Stage 3; API-wired)</w:t>
+        <w:br/>
+        <w:t>│   ├── report.py                       ← Jinja2 HTML + Playwright PDF (Stage 4)</w:t>
+        <w:br/>
+        <w:t>│   ├── templates/</w:t>
+        <w:br/>
+        <w:t>│   │   └── audit_report.html.j2        ← Standalone HTML report template</w:t>
         <w:br/>
         <w:t>│   ├── explainer.py                    ← Live LLM recommendations (batched; anti-hallucination)</w:t>
         <w:br/>
@@ -1679,7 +1669,7 @@
         <w:br/>
         <w:t>│   └── routers/</w:t>
         <w:br/>
-        <w:t>│       └── audit.py                    ← POST /audit, GET …/violations, GET …/report</w:t>
+        <w:t>│       └── audit.py                    ← POST /audit, GET …/violations, GET …/report, GET …/report/download</w:t>
         <w:br/>
         <w:t>│</w:t>
         <w:br/>
@@ -1697,7 +1687,7 @@
         <w:br/>
         <w:t>│       ├── main.jsx, index.css</w:t>
         <w:br/>
-        <w:t>│       ├── state/auditFiles.js         ← Local upload state (not API-wired yet)</w:t>
+        <w:t>│       ├── state/auditFiles.js         ← Upload file state (wired to POST /audit)</w:t>
         <w:br/>
         <w:t>│       ├── components/</w:t>
         <w:br/>
@@ -1717,19 +1707,21 @@
         <w:br/>
         <w:t>│</w:t>
         <w:br/>
-        <w:t>├── tests/                              ← pytest suite (**94** passed on `noor`)</w:t>
+        <w:t>├── tests/                              ← pytest suite (**120** passed on `noor`)</w:t>
         <w:br/>
         <w:t>│   ├── test_parser.py</w:t>
         <w:br/>
-        <w:t>│   ├── test_rules.py                   ← R01–R30 fixtures + visibility filter tests</w:t>
+        <w:t>│   ├── test_rules.py                   ← R01–R30 pass/fail XML fixtures (78 tests)</w:t>
         <w:br/>
         <w:t>│   ├── test_agent.py                   ← score + template report</w:t>
         <w:br/>
-        <w:t>│   ├── test_audit.py                   ← FastAPI violations + report</w:t>
+        <w:t>│   ├── test_audit.py                   ← FastAPI violations + report + download</w:t>
+        <w:br/>
+        <w:t>│   ├── test_report.py                  ← HTML/PDF export (Week 5)</w:t>
         <w:br/>
         <w:t>│   ├── test_explainer.py               ← anti-hallucination / batching (mocked LLM)</w:t>
         <w:br/>
-        <w:t>│   └── fixtures/rules/                 ← XML fixtures (R01–R12, R21–R30, …)</w:t>
+        <w:t>│   └── fixtures/rules/                 ← 57 controlled XML screens (R01–R30)</w:t>
         <w:br/>
         <w:t>│</w:t>
         <w:br/>
@@ -1757,21 +1749,17 @@
         <w:br/>
         <w:t>├── outputs/                            ← pipeline artefacts</w:t>
         <w:br/>
-        <w:t>│   ├── violations/                     ← *_violations.json</w:t>
+        <w:t>│   ├── violations/                     ← *_violations.json (Stage 2; generated locally)</w:t>
         <w:br/>
-        <w:t>│   ├── reports/                        ← *_report.json (agent-enriched; Week 4)</w:t>
+        <w:t>│   ├── reports/                        ← *_report.json, .html, .pdf (Stages 3–4)</w:t>
         <w:br/>
         <w:t>│   └── validation_logs/</w:t>
         <w:br/>
-        <w:t>│       ├── week3_summary.md</w:t>
+        <w:t>│       ├── noor_week1–4 summaries + logs</w:t>
         <w:br/>
-        <w:t>│       ├── week3_validation_log.txt</w:t>
+        <w:t>│       ├── noor_week5_summary.md</w:t>
         <w:br/>
-        <w:t>│       ├── noor_week3_summary.md</w:t>
-        <w:br/>
-        <w:t>│       ├── noor_week3_validation_log.txt</w:t>
-        <w:br/>
-        <w:t>│       └── masc_reparse_log.txt</w:t>
+        <w:t>│       └── noor_week5_validation_log.txt</w:t>
         <w:br/>
         <w:t>│</w:t>
         <w:br/>
@@ -1807,6 +1795,10 @@
         <w:br/>
         <w:t>│   ├── noor_week3_validate.py</w:t>
         <w:br/>
+        <w:t>│   ├── noor_week4_validate.py</w:t>
+        <w:br/>
+        <w:t>│   ├── noor_week5_validate.py</w:t>
+        <w:br/>
         <w:t>│   ├── masc_parse_signoff.py</w:t>
         <w:br/>
         <w:t>│   ├── run_explainer_sample.py         ← Stage 3 LLM sample runner</w:t>
@@ -2124,9 +2116,6 @@
               </w:rPr>
               <w:t>src/report.py</w:t>
             </w:r>
-            <w:r>
-              <w:t xml:space="preserve"> (planned)</w:t>
-            </w:r>
           </w:p>
         </w:tc>
         <w:tc>
@@ -2139,7 +2128,24 @@
             </w:pPr>
             <w:r/>
             <w:r>
-              <w:t>HTML/PDF — not started</w:t>
+              <w:rPr>
+                <w:rFonts w:ascii="Consolas" w:hAnsi="Consolas"/>
+                <w:sz w:val="20"/>
+              </w:rPr>
+              <w:t>outputs/reports/*_report.html</w:t>
+            </w:r>
+            <w:r>
+              <w:t xml:space="preserve"> / </w:t>
+            </w:r>
+            <w:r>
+              <w:rPr>
+                <w:rFonts w:ascii="Consolas" w:hAnsi="Consolas"/>
+                <w:sz w:val="20"/>
+              </w:rPr>
+              <w:t>.pdf</w:t>
+            </w:r>
+            <w:r>
+              <w:t xml:space="preserve"> + download API</w:t>
             </w:r>
           </w:p>
         </w:tc>
@@ -2187,7 +2193,7 @@
             </w:pPr>
             <w:r/>
             <w:r>
-              <w:t>in-memory job → violations + report JSON</w:t>
+              <w:t>in-memory job → violations + report JSON + file download</w:t>
             </w:r>
           </w:p>
         </w:tc>
@@ -2245,7 +2251,7 @@
               <w:t>:5173</w:t>
             </w:r>
             <w:r>
-              <w:t xml:space="preserve"> (mock data; not wired to API yet)</w:t>
+              <w:t xml:space="preserve"> (Upload/Dashboard/Report wired; Records mock)</w:t>
             </w:r>
           </w:p>
         </w:tc>
@@ -8107,7 +8113,7 @@
         <w:pStyle w:val="Heading2"/>
       </w:pPr>
       <w:r>
-        <w:t>14. Recommended next steps (updated 9 July 2026)</w:t>
+        <w:t>14. Recommended next steps (updated 12 July 2026)</w:t>
       </w:r>
     </w:p>
     <w:p>
@@ -8118,69 +8124,10 @@
         <w:rPr>
           <w:b/>
         </w:rPr>
-        <w:t>Ayesha:</w:t>
-      </w:r>
-      <w:r>
-        <w:t xml:space="preserve"> Wire </w:t>
-      </w:r>
-      <w:r>
-        <w:rPr>
-          <w:rFonts w:ascii="Consolas" w:hAnsi="Consolas"/>
-          <w:sz w:val="20"/>
-        </w:rPr>
-        <w:t>frontend/</w:t>
-      </w:r>
-      <w:r>
-        <w:t xml:space="preserve"> to live audit API (</w:t>
-      </w:r>
-      <w:r>
-        <w:rPr>
-          <w:rFonts w:ascii="Consolas" w:hAnsi="Consolas"/>
-          <w:sz w:val="20"/>
-        </w:rPr>
-        <w:t>POST /audit</w:t>
-      </w:r>
-      <w:r>
-        <w:t xml:space="preserve">, </w:t>
-      </w:r>
-      <w:r>
-        <w:rPr>
-          <w:rFonts w:ascii="Consolas" w:hAnsi="Consolas"/>
-          <w:sz w:val="20"/>
-        </w:rPr>
-        <w:t>GET …/violations</w:t>
-      </w:r>
-      <w:r>
-        <w:t xml:space="preserve">, </w:t>
-      </w:r>
-      <w:r>
-        <w:rPr>
-          <w:rFonts w:ascii="Consolas" w:hAnsi="Consolas"/>
-          <w:sz w:val="20"/>
-        </w:rPr>
-        <w:t>GET …/report</w:t>
-      </w:r>
-      <w:r>
-        <w:t>); run prompt experiments (</w:t>
-      </w:r>
-      <w:r>
-        <w:rPr>
-          <w:rFonts w:ascii="Consolas" w:hAnsi="Consolas"/>
-          <w:sz w:val="20"/>
-        </w:rPr>
-        <w:t>run_explainer_sample.py</w:t>
-      </w:r>
-      <w:r>
-        <w:t xml:space="preserve">) and resolve </w:t>
-      </w:r>
-      <w:r>
-        <w:rPr>
-          <w:b/>
-        </w:rPr>
-        <w:t>TBD-01</w:t>
-      </w:r>
-      <w:r>
-        <w:t xml:space="preserve"> with Noor; review R11–R12</w:t>
+        <w:t>Salar:</w:t>
+      </w:r>
+      <w:r>
+        <w:t xml:space="preserve"> Auth backend (JWT) + records persistence API (Week 6)</w:t>
       </w:r>
     </w:p>
     <w:p>
@@ -8191,20 +8138,10 @@
         <w:rPr>
           <w:b/>
         </w:rPr>
-        <w:t>Noor:</w:t>
-      </w:r>
-      <w:r>
-        <w:t xml:space="preserve"> Start </w:t>
-      </w:r>
-      <w:r>
-        <w:rPr>
-          <w:rFonts w:ascii="Consolas" w:hAnsi="Consolas"/>
-          <w:sz w:val="20"/>
-        </w:rPr>
-        <w:t>src/report.py</w:t>
-      </w:r>
-      <w:r>
-        <w:t xml:space="preserve"> HTML/PDF; update validation logs for R01–R30; Rico holdout batch parse</w:t>
+        <w:t>Ayesha:</w:t>
+      </w:r>
+      <w:r>
+        <w:t xml:space="preserve"> Wire Records page to list endpoint once backend exists; auth screens when auth router lands</w:t>
       </w:r>
     </w:p>
     <w:p>
@@ -8215,10 +8152,10 @@
         <w:rPr>
           <w:b/>
         </w:rPr>
-        <w:t>Salar:</w:t>
-      </w:r>
-      <w:r>
-        <w:t xml:space="preserve"> Tune R07 false positives; improve R09 when colors/screenshots available</w:t>
+        <w:t>Noor:</w:t>
+      </w:r>
+      <w:r>
+        <w:t xml:space="preserve"> Rico holdout batch parse + evaluation sheet; Docker polish</w:t>
       </w:r>
     </w:p>
     <w:p>
@@ -8232,7 +8169,7 @@
         <w:t>All:</w:t>
       </w:r>
       <w:r>
-        <w:t xml:space="preserve"> Demo — XML upload → API → violations → agent-enriched report (template or live LLM)</w:t>
+        <w:t xml:space="preserve"> Demo — XML upload → API → dashboard → downloadable HTML/PDF report</w:t>
       </w:r>
     </w:p>
     <w:p>
@@ -8266,6 +8203,553 @@
           <w:color w:val="333333"/>
         </w:rPr>
         <w:t>**Instructions:** Each intern adds a dated entry after pushing work. Newest week at the top. Keep entries factual — file names, test counts, branch commits.</w:t>
+      </w:r>
+    </w:p>
+    <w:p>
+      <w:pPr>
+        <w:pStyle w:val="Heading3"/>
+      </w:pPr>
+      <w:r>
+        <w:t>Week 5 — Noor (`noor` branch, commit `4ce430feb` — pushed 12 Jul 2026)</w:t>
+      </w:r>
+    </w:p>
+    <w:p>
+      <w:r>
+        <w:rPr>
+          <w:b/>
+        </w:rPr>
+        <w:t>Pushed by:</w:t>
+      </w:r>
+      <w:r>
+        <w:t xml:space="preserve"> Muhammad Noor</w:t>
+      </w:r>
+    </w:p>
+    <w:p>
+      <w:r>
+        <w:rPr>
+          <w:b/>
+        </w:rPr>
+        <w:t>Date:</w:t>
+      </w:r>
+      <w:r>
+        <w:t xml:space="preserve"> 12 July 2026</w:t>
+      </w:r>
+    </w:p>
+    <w:p>
+      <w:r>
+        <w:rPr>
+          <w:b/>
+        </w:rPr>
+        <w:t>Completed:</w:t>
+      </w:r>
+    </w:p>
+    <w:p>
+      <w:pPr>
+        <w:pStyle w:val="ListBullet"/>
+      </w:pPr>
+      <w:r>
+        <w:rPr>
+          <w:b/>
+        </w:rPr>
+        <w:t>`src/report.py`</w:t>
+      </w:r>
+      <w:r>
+        <w:t xml:space="preserve"> — Jinja2 template (</w:t>
+      </w:r>
+      <w:r>
+        <w:rPr>
+          <w:rFonts w:ascii="Consolas" w:hAnsi="Consolas"/>
+          <w:sz w:val="20"/>
+        </w:rPr>
+        <w:t>src/templates/audit_report.html.j2</w:t>
+      </w:r>
+      <w:r>
+        <w:t>), PIL screenshot bounding-box annotation, Playwright PDF export</w:t>
+      </w:r>
+    </w:p>
+    <w:p>
+      <w:pPr>
+        <w:pStyle w:val="ListBullet"/>
+      </w:pPr>
+      <w:r>
+        <w:rPr>
+          <w:b/>
+        </w:rPr>
+        <w:t>Download API</w:t>
+      </w:r>
+      <w:r>
+        <w:t xml:space="preserve"> — </w:t>
+      </w:r>
+      <w:r>
+        <w:rPr>
+          <w:rFonts w:ascii="Consolas" w:hAnsi="Consolas"/>
+          <w:sz w:val="20"/>
+        </w:rPr>
+        <w:t>GET /api/v1/audit/{id}/report/download?format=html|pdf</w:t>
+      </w:r>
+      <w:r>
+        <w:t xml:space="preserve"> (sync handler for Playwright)</w:t>
+      </w:r>
+    </w:p>
+    <w:p>
+      <w:pPr>
+        <w:pStyle w:val="ListBullet"/>
+      </w:pPr>
+      <w:r>
+        <w:rPr>
+          <w:b/>
+        </w:rPr>
+        <w:t>Frontend</w:t>
+      </w:r>
+      <w:r>
+        <w:t xml:space="preserve"> — </w:t>
+      </w:r>
+      <w:r>
+        <w:rPr>
+          <w:rFonts w:ascii="Consolas" w:hAnsi="Consolas"/>
+          <w:sz w:val="20"/>
+        </w:rPr>
+        <w:t>downloadAuditReport()</w:t>
+      </w:r>
+      <w:r>
+        <w:t xml:space="preserve"> in </w:t>
+      </w:r>
+      <w:r>
+        <w:rPr>
+          <w:rFonts w:ascii="Consolas" w:hAnsi="Consolas"/>
+          <w:sz w:val="20"/>
+        </w:rPr>
+        <w:t>api.js</w:t>
+      </w:r>
+      <w:r>
+        <w:t xml:space="preserve">; </w:t>
+      </w:r>
+      <w:r>
+        <w:rPr>
+          <w:rFonts w:ascii="Consolas" w:hAnsi="Consolas"/>
+          <w:sz w:val="20"/>
+        </w:rPr>
+        <w:t>Report.jsx</w:t>
+      </w:r>
+      <w:r>
+        <w:t xml:space="preserve"> real HTML/PDF download after processing animation</w:t>
+      </w:r>
+    </w:p>
+    <w:p>
+      <w:pPr>
+        <w:pStyle w:val="ListBullet"/>
+      </w:pPr>
+      <w:r>
+        <w:rPr>
+          <w:b/>
+        </w:rPr>
+        <w:t>Rule fixtures</w:t>
+      </w:r>
+      <w:r>
+        <w:t xml:space="preserve"> — 21 new R09–R20 pass/fail XML files; </w:t>
+      </w:r>
+      <w:r>
+        <w:rPr>
+          <w:rFonts w:ascii="Consolas" w:hAnsi="Consolas"/>
+          <w:sz w:val="20"/>
+        </w:rPr>
+        <w:t>test_run.py --fixtures</w:t>
+      </w:r>
+      <w:r>
+        <w:t xml:space="preserve"> batch mode; fixture path fix (no MASC root collision)</w:t>
+      </w:r>
+    </w:p>
+    <w:p>
+      <w:pPr>
+        <w:pStyle w:val="ListBullet"/>
+      </w:pPr>
+      <w:r>
+        <w:rPr>
+          <w:b/>
+        </w:rPr>
+        <w:t>Tests</w:t>
+      </w:r>
+      <w:r>
+        <w:t xml:space="preserve"> — </w:t>
+      </w:r>
+      <w:r>
+        <w:rPr>
+          <w:rFonts w:ascii="Consolas" w:hAnsi="Consolas"/>
+          <w:sz w:val="20"/>
+        </w:rPr>
+        <w:t>tests/test_report.py</w:t>
+      </w:r>
+      <w:r>
+        <w:t xml:space="preserve">; extended </w:t>
+      </w:r>
+      <w:r>
+        <w:rPr>
+          <w:rFonts w:ascii="Consolas" w:hAnsi="Consolas"/>
+          <w:sz w:val="20"/>
+        </w:rPr>
+        <w:t>tests/test_audit.py</w:t>
+      </w:r>
+      <w:r>
+        <w:t xml:space="preserve"> + </w:t>
+      </w:r>
+      <w:r>
+        <w:rPr>
+          <w:rFonts w:ascii="Consolas" w:hAnsi="Consolas"/>
+          <w:sz w:val="20"/>
+        </w:rPr>
+        <w:t>tests/test_rules.py</w:t>
+      </w:r>
+      <w:r>
+        <w:t xml:space="preserve">; </w:t>
+      </w:r>
+      <w:r>
+        <w:rPr>
+          <w:b/>
+        </w:rPr>
+        <w:t>120 pytest</w:t>
+      </w:r>
+      <w:r>
+        <w:t xml:space="preserve"> passed</w:t>
+      </w:r>
+    </w:p>
+    <w:p>
+      <w:pPr>
+        <w:pStyle w:val="ListBullet"/>
+      </w:pPr>
+      <w:r>
+        <w:rPr>
+          <w:b/>
+        </w:rPr>
+        <w:t>Validation</w:t>
+      </w:r>
+      <w:r>
+        <w:t xml:space="preserve"> — </w:t>
+      </w:r>
+      <w:r>
+        <w:rPr>
+          <w:rFonts w:ascii="Consolas" w:hAnsi="Consolas"/>
+          <w:sz w:val="20"/>
+        </w:rPr>
+        <w:t>scripts/noor_week5_validate.py</w:t>
+      </w:r>
+      <w:r>
+        <w:t xml:space="preserve"> + validation logs</w:t>
+      </w:r>
+    </w:p>
+    <w:p>
+      <w:pPr>
+        <w:pStyle w:val="ListBullet"/>
+      </w:pPr>
+      <w:r>
+        <w:rPr>
+          <w:b/>
+        </w:rPr>
+        <w:t>Docs</w:t>
+      </w:r>
+      <w:r>
+        <w:t xml:space="preserve"> — SRS/SDS/README/updated_plan/progress report aligned; WeasyPrint → Jinja2 + Playwright</w:t>
+      </w:r>
+    </w:p>
+    <w:p>
+      <w:r>
+        <w:rPr>
+          <w:b/>
+        </w:rPr>
+        <w:t>Pending:</w:t>
+      </w:r>
+    </w:p>
+    <w:p>
+      <w:pPr>
+        <w:pStyle w:val="ListBullet"/>
+      </w:pPr>
+      <w:r>
+        <w:t>Records + auth (Week 6)</w:t>
+      </w:r>
+    </w:p>
+    <w:p>
+      <w:pPr>
+        <w:pStyle w:val="ListBullet"/>
+      </w:pPr>
+      <w:r>
+        <w:t>Rico holdout batch evaluation</w:t>
+      </w:r>
+    </w:p>
+    <w:p>
+      <w:r>
+        <w:rPr>
+          <w:b/>
+        </w:rPr>
+        <w:t>Blockers:</w:t>
+      </w:r>
+      <w:r>
+        <w:t xml:space="preserve"> None</w:t>
+      </w:r>
+    </w:p>
+    <w:p>
+      <w:pPr>
+        <w:spacing w:before="120" w:after="120"/>
+      </w:pPr>
+      <w:r>
+        <w:rPr>
+          <w:color w:val="CCCCCC"/>
+          <w:sz w:val="16"/>
+        </w:rPr>
+        <w:t>────────────────────────────────────────────────────────────────────────</w:t>
+      </w:r>
+    </w:p>
+    <w:p>
+      <w:pPr>
+        <w:pStyle w:val="Heading3"/>
+      </w:pPr>
+      <w:r>
+        <w:t>Week 4 — Ayesha</w:t>
+      </w:r>
+    </w:p>
+    <w:p>
+      <w:r>
+        <w:rPr>
+          <w:b/>
+        </w:rPr>
+        <w:t>Pushed by:</w:t>
+      </w:r>
+      <w:r>
+        <w:t xml:space="preserve"> Ayesha Naveed</w:t>
+      </w:r>
+    </w:p>
+    <w:p>
+      <w:r>
+        <w:rPr>
+          <w:b/>
+        </w:rPr>
+        <w:t>Date:</w:t>
+      </w:r>
+      <w:r>
+        <w:t xml:space="preserve"> 11 July 2026</w:t>
+      </w:r>
+    </w:p>
+    <w:p>
+      <w:r>
+        <w:rPr>
+          <w:b/>
+        </w:rPr>
+        <w:t>Completed:</w:t>
+      </w:r>
+    </w:p>
+    <w:p>
+      <w:pPr>
+        <w:pStyle w:val="ListBullet"/>
+      </w:pPr>
+      <w:r>
+        <w:rPr>
+          <w:b/>
+        </w:rPr>
+        <w:t>R11–R12 review sign-off:</w:t>
+      </w:r>
+      <w:r>
+        <w:t xml:space="preserve"> reviewed </w:t>
+      </w:r>
+      <w:r>
+        <w:rPr>
+          <w:rFonts w:ascii="Consolas" w:hAnsi="Consolas"/>
+          <w:sz w:val="20"/>
+        </w:rPr>
+        <w:t>src/rules.py</w:t>
+      </w:r>
+      <w:r>
+        <w:t xml:space="preserve"> implementations of </w:t>
+      </w:r>
+      <w:r>
+        <w:rPr>
+          <w:rFonts w:ascii="Consolas" w:hAnsi="Consolas"/>
+          <w:sz w:val="20"/>
+        </w:rPr>
+        <w:t>check_color_only_info</w:t>
+      </w:r>
+      <w:r>
+        <w:t xml:space="preserve"> (R11) and </w:t>
+      </w:r>
+      <w:r>
+        <w:rPr>
+          <w:rFonts w:ascii="Consolas" w:hAnsi="Consolas"/>
+          <w:sz w:val="20"/>
+        </w:rPr>
+        <w:t>check_missing_captions</w:t>
+      </w:r>
+      <w:r>
+        <w:t xml:space="preserve"> (R12) against </w:t>
+      </w:r>
+      <w:r>
+        <w:rPr>
+          <w:rFonts w:ascii="Consolas" w:hAnsi="Consolas"/>
+          <w:sz w:val="20"/>
+        </w:rPr>
+        <w:t>docs/r11_r12_design.md</w:t>
+      </w:r>
+      <w:r>
+        <w:t xml:space="preserve">. Confirmed both rules moved past their original Week 3 stub design — R11 now flags checkable-state widgets (CheckBox/Switch/ToggleButton/RadioButton) with no text/content_desc; R12 now uses </w:t>
+      </w:r>
+      <w:r>
+        <w:rPr>
+          <w:rFonts w:ascii="Consolas" w:hAnsi="Consolas"/>
+          <w:sz w:val="20"/>
+        </w:rPr>
+        <w:t>parent_id</w:t>
+      </w:r>
+      <w:r>
+        <w:t xml:space="preserve"> sibling adjacency plus bounds-proximity fallback, not just a blanket VideoView flag. Ran </w:t>
+      </w:r>
+      <w:r>
+        <w:rPr>
+          <w:rFonts w:ascii="Consolas" w:hAnsi="Consolas"/>
+          <w:sz w:val="20"/>
+        </w:rPr>
+        <w:t>pytest tests/test_rules.py -k "r11 or r12"</w:t>
+      </w:r>
+      <w:r>
+        <w:t xml:space="preserve"> — all 5 relevant tests passed (fixture pass/fail cases, non-checkable-widget exclusion, sibling-vs-bounds-distance priority, non-media stub behavior).</w:t>
+      </w:r>
+    </w:p>
+    <w:p>
+      <w:pPr>
+        <w:pStyle w:val="ListBullet"/>
+      </w:pPr>
+      <w:r>
+        <w:rPr>
+          <w:b/>
+        </w:rPr>
+        <w:t>Frontend ↔ API wiring</w:t>
+      </w:r>
+      <w:r>
+        <w:t xml:space="preserve"> (Priority 1): Upload, Dashboard, and Report pages now call the live backend (</w:t>
+      </w:r>
+      <w:r>
+        <w:rPr>
+          <w:rFonts w:ascii="Consolas" w:hAnsi="Consolas"/>
+          <w:sz w:val="20"/>
+        </w:rPr>
+        <w:t>POST /api/v1/audit</w:t>
+      </w:r>
+      <w:r>
+        <w:t xml:space="preserve">, </w:t>
+      </w:r>
+      <w:r>
+        <w:rPr>
+          <w:rFonts w:ascii="Consolas" w:hAnsi="Consolas"/>
+          <w:sz w:val="20"/>
+        </w:rPr>
+        <w:t>GET /report</w:t>
+      </w:r>
+      <w:r>
+        <w:t>) instead of mock data. Tested end-to-end with a real XML fixture and Groq — confirmed full pipeline works (upload → audit → dashboard → report).</w:t>
+      </w:r>
+    </w:p>
+    <w:p>
+      <w:pPr>
+        <w:pStyle w:val="ListBullet"/>
+      </w:pPr>
+      <w:r>
+        <w:rPr>
+          <w:b/>
+        </w:rPr>
+        <w:t>Agent prompt experiments (TBD-01):</w:t>
+      </w:r>
+      <w:r>
+        <w:t xml:space="preserve"> ran </w:t>
+      </w:r>
+      <w:r>
+        <w:rPr>
+          <w:rFonts w:ascii="Consolas" w:hAnsi="Consolas"/>
+          <w:sz w:val="20"/>
+        </w:rPr>
+        <w:t>scripts/run_explainer_sample.py</w:t>
+      </w:r>
+      <w:r>
+        <w:t xml:space="preserve"> — Groq tested successfully (15/15 violations explained, good quality, no hallucination observed). Anthropic/OpenAI blocked by paid billing requirements; Gemini blocked by a Google-side free-tier quota bug (</w:t>
+      </w:r>
+      <w:r>
+        <w:rPr>
+          <w:rFonts w:ascii="Consolas" w:hAnsi="Consolas"/>
+          <w:sz w:val="20"/>
+        </w:rPr>
+        <w:t>429</w:t>
+      </w:r>
+      <w:r>
+        <w:t xml:space="preserve">, limit 0) even after Noor's SDK fix resolved the original key-format issue. Documented in </w:t>
+      </w:r>
+      <w:r>
+        <w:rPr>
+          <w:rFonts w:ascii="Consolas" w:hAnsi="Consolas"/>
+          <w:sz w:val="20"/>
+        </w:rPr>
+        <w:t>docs/agent_prompt_experiments.md</w:t>
+      </w:r>
+      <w:r>
+        <w:t xml:space="preserve"> and </w:t>
+      </w:r>
+      <w:r>
+        <w:rPr>
+          <w:rFonts w:ascii="Consolas" w:hAnsi="Consolas"/>
+          <w:sz w:val="20"/>
+        </w:rPr>
+        <w:t>docs/TBD-01-decision.md</w:t>
+      </w:r>
+      <w:r>
+        <w:t>; TBD-01 marked Resolved (Groq as default) in this doc's Open Decisions table.</w:t>
+      </w:r>
+    </w:p>
+    <w:p>
+      <w:r>
+        <w:rPr>
+          <w:b/>
+        </w:rPr>
+        <w:t>Pending:</w:t>
+      </w:r>
+    </w:p>
+    <w:p>
+      <w:pPr>
+        <w:pStyle w:val="ListBullet"/>
+      </w:pPr>
+      <w:r>
+        <w:t>Full 4-provider comparison once Anthropic/OpenAI credits are available and Gemini's quota issue is resolved</w:t>
+      </w:r>
+    </w:p>
+    <w:p>
+      <w:pPr>
+        <w:pStyle w:val="ListBullet"/>
+      </w:pPr>
+      <w:r>
+        <w:t>Records/Audit History page — blocked on backend (no list endpoint, no persistence yet)</w:t>
+      </w:r>
+    </w:p>
+    <w:p>
+      <w:pPr>
+        <w:pStyle w:val="ListBullet"/>
+      </w:pPr>
+      <w:r>
+        <w:t>Auth pages (login/signup/etc.) — blocked on backend (no auth router implemented yet)</w:t>
+      </w:r>
+    </w:p>
+    <w:p>
+      <w:r>
+        <w:rPr>
+          <w:b/>
+        </w:rPr>
+        <w:t>Blockers:</w:t>
+      </w:r>
+      <w:r>
+        <w:t xml:space="preserve"> None on my own tasks; Records + Auth wiring blocked on backend work not yet scoped.</w:t>
+      </w:r>
+    </w:p>
+    <w:p>
+      <w:pPr>
+        <w:spacing w:before="120" w:after="120"/>
+      </w:pPr>
+      <w:r>
+        <w:rPr>
+          <w:color w:val="CCCCCC"/>
+          <w:sz w:val="16"/>
+        </w:rPr>
+        <w:t>────────────────────────────────────────────────────────────────────────</w:t>
       </w:r>
     </w:p>
     <w:p>
@@ -10438,6 +10922,83 @@
             <w:r/>
             <w:r>
               <w:t>Week 4: R01–R30, explainer + report API, 94 tests, frontend/notebook sync; next steps + §15</w:t>
+            </w:r>
+          </w:p>
+        </w:tc>
+      </w:tr>
+      <w:tr>
+        <w:tc>
+          <w:tcPr>
+            <w:tcW w:type="dxa" w:w="2340"/>
+          </w:tcPr>
+          <w:p>
+            <w:pPr>
+              <w:spacing w:after="40"/>
+            </w:pPr>
+            <w:r/>
+            <w:r>
+              <w:rPr>
+                <w:b/>
+              </w:rPr>
+              <w:t>1.7</w:t>
+            </w:r>
+          </w:p>
+        </w:tc>
+        <w:tc>
+          <w:tcPr>
+            <w:tcW w:type="dxa" w:w="2340"/>
+          </w:tcPr>
+          <w:p>
+            <w:pPr>
+              <w:spacing w:after="40"/>
+            </w:pPr>
+            <w:r/>
+            <w:r>
+              <w:rPr>
+                <w:b/>
+              </w:rPr>
+              <w:t>12 Jul 2026</w:t>
+            </w:r>
+          </w:p>
+        </w:tc>
+        <w:tc>
+          <w:tcPr>
+            <w:tcW w:type="dxa" w:w="2340"/>
+          </w:tcPr>
+          <w:p>
+            <w:pPr>
+              <w:spacing w:after="40"/>
+            </w:pPr>
+            <w:r/>
+            <w:r>
+              <w:rPr>
+                <w:b/>
+              </w:rPr>
+              <w:t>Noor</w:t>
+            </w:r>
+          </w:p>
+        </w:tc>
+        <w:tc>
+          <w:tcPr>
+            <w:tcW w:type="dxa" w:w="2340"/>
+          </w:tcPr>
+          <w:p>
+            <w:pPr>
+              <w:spacing w:after="40"/>
+            </w:pPr>
+            <w:r/>
+            <w:r>
+              <w:t>Week 5 pushed (</w:t>
+            </w:r>
+            <w:r>
+              <w:rPr>
+                <w:rFonts w:ascii="Consolas" w:hAnsi="Consolas"/>
+                <w:sz w:val="20"/>
+              </w:rPr>
+              <w:t>4ce430feb</w:t>
+            </w:r>
+            <w:r>
+              <w:t>): HTML/PDF export, download API, R09–R20 fixtures, 120 tests, docs aligned (Jinja2+Playwright)</w:t>
             </w:r>
           </w:p>
         </w:tc>

</xml_diff>

<commit_message>
fix(upload): require screenshot+XML pair on API and merge Ayesha upload validation
Merge Ayesha Upload.jsx/api.js fixes (error popup, filesMatch, dual multipart) and enforce pair rules in audit.py. Regenerate SRS/SDS/progress DOCX from updated markdown; update README, tests, and validation scripts.

Co-authored-by: Cursor <cursoragent@cursor.com>
</commit_message>
<xml_diff>
--- a/docs/progress/Supplementary_Progress_Report_v1.0.docx
+++ b/docs/progress/Supplementary_Progress_Report_v1.0.docx
@@ -23,7 +23,7 @@
         <w:rPr>
           <w:b/>
         </w:rPr>
-        <w:t>Practical work completed — Weeks 1–5 (baseline 1 July 2026; updated 12 July 2026)</w:t>
+        <w:t>Practical work completed — Weeks 1–5 (baseline 1 July 2026; updated 14 July 2026)</w:t>
       </w:r>
     </w:p>
     <w:p>
@@ -312,7 +312,7 @@
           </w:tcPr>
           <w:p>
             <w:r>
-              <w:t>Result (12 Jul on `noor`)</w:t>
+              <w:t>Result (14 Jul on `noor`)</w:t>
             </w:r>
           </w:p>
         </w:tc>
@@ -422,7 +422,7 @@
           </w:tcPr>
           <w:p>
             <w:r>
-              <w:t>**Partial** — Upload/Dashboard/Report wired to live API; Records still mock (Week 6)</w:t>
+              <w:t>**Partial** — Upload/Dashboard/Report wired to live API; **upload pair validation fixed** (Ayesha); Records still mock (Week 6)</w:t>
             </w:r>
           </w:p>
         </w:tc>
@@ -444,7 +444,7 @@
           </w:tcPr>
           <w:p>
             <w:r>
-              <w:t>**Partial** — `POST /audit` → violations + report + **download**; no auth/records persistence</w:t>
+              <w:t>**Partial** — `POST /audit` requires screenshot + XML + pair check; violations + report + **download**; no auth/records persistence</w:t>
             </w:r>
           </w:p>
         </w:tc>
@@ -510,7 +510,7 @@
           </w:tcPr>
           <w:p>
             <w:r>
-              <w:t>SRS v2.0 (Ayesha+Salar), **SDS v2.2** (Noor), progress report **v1.8**</w:t>
+              <w:t>SRS v2.0 (Ayesha+Salar), **SDS v2.6** (Noor), progress report **v1.10**</w:t>
             </w:r>
           </w:p>
         </w:tc>
@@ -521,10 +521,19 @@
         <w:rPr>
           <w:b/>
         </w:rPr>
-        <w:t>Bottom line (12 Jul, pushed `4ce430feb`):</w:t>
-      </w:r>
-      <w:r>
-        <w:t xml:space="preserve"> Week 5 complete — full pipeline XML → R01–R30 → </w:t>
+        <w:t>Bottom line (14 Jul):</w:t>
+      </w:r>
+      <w:r>
+        <w:t xml:space="preserve"> Upload validation handoff complete — frontend (Ayesha </w:t>
+      </w:r>
+      <w:r>
+        <w:rPr>
+          <w:rFonts w:ascii="Consolas" w:hAnsi="Consolas"/>
+        </w:rPr>
+        <w:t>052a976</w:t>
+      </w:r>
+      <w:r>
+        <w:t xml:space="preserve">) + backend pair enforcement (Noor). Full pipeline: screenshot + XML → R01–R30 → </w:t>
       </w:r>
       <w:r>
         <w:rPr>
@@ -533,7 +542,7 @@
         <w:t>report.json</w:t>
       </w:r>
       <w:r>
-        <w:t xml:space="preserve"> → downloadable HTML/PDF. Upload/Dashboard/Report wired to live API. Rule fixtures cover R09–R20. Next: Records + auth (Week 6).</w:t>
+        <w:t xml:space="preserve"> → downloadable HTML/PDF. Next: Records + auth (Week 6).</w:t>
       </w:r>
     </w:p>
     <w:p>
@@ -1619,7 +1628,7 @@
         <w:br/>
         <w:t>│   ├── parsed/                         ← generic parsed output</w:t>
         <w:br/>
-        <w:t>│   └── screenshots/                    ← optional screenshot uploads</w:t>
+        <w:t>│   └── screenshots/                    ← screenshot uploads (paired with XML for POST /audit)</w:t>
         <w:br/>
         <w:t>│</w:t>
         <w:br/>
@@ -6487,6 +6496,187 @@
         <w:pStyle w:val="Heading3"/>
       </w:pPr>
       <w:r>
+        <w:t>Upload validation fix — Ayesha + Noor (`ayesha` `052a976` → merged on `noor`, 14 Jul 2026)</w:t>
+      </w:r>
+    </w:p>
+    <w:p>
+      <w:r>
+        <w:rPr>
+          <w:b/>
+        </w:rPr>
+        <w:t>Pushed by:</w:t>
+      </w:r>
+      <w:r>
+        <w:t xml:space="preserve"> Ayesha Naveed (frontend) + Muhammad Noor (backend/docs)</w:t>
+      </w:r>
+    </w:p>
+    <w:p>
+      <w:r>
+        <w:rPr>
+          <w:b/>
+        </w:rPr>
+        <w:t>Date:</w:t>
+      </w:r>
+      <w:r>
+        <w:t xml:space="preserve"> 14 July 2026</w:t>
+      </w:r>
+    </w:p>
+    <w:p>
+      <w:r>
+        <w:rPr>
+          <w:b/>
+        </w:rPr>
+        <w:t>Completed (handoff doc — 4 issues):</w:t>
+      </w:r>
+    </w:p>
+    <w:p>
+      <w:pPr>
+        <w:pStyle w:val="ListBullet"/>
+      </w:pPr>
+      <w:r>
+        <w:rPr>
+          <w:b/>
+        </w:rPr>
+        <w:t>Issue 1</w:t>
+      </w:r>
+      <w:r>
+        <w:t xml:space="preserve"> — XML without screenshot shows error popup (not silent) — </w:t>
+      </w:r>
+      <w:r>
+        <w:rPr>
+          <w:rFonts w:ascii="Consolas" w:hAnsi="Consolas"/>
+        </w:rPr>
+        <w:t>Upload.jsx</w:t>
+      </w:r>
+    </w:p>
+    <w:p>
+      <w:pPr>
+        <w:pStyle w:val="ListBullet"/>
+      </w:pPr>
+      <w:r>
+        <w:rPr>
+          <w:b/>
+        </w:rPr>
+        <w:t>Issue 2</w:t>
+      </w:r>
+      <w:r>
+        <w:t xml:space="preserve"> — </w:t>
+      </w:r>
+      <w:r>
+        <w:rPr>
+          <w:rFonts w:ascii="Consolas" w:hAnsi="Consolas"/>
+        </w:rPr>
+        <w:t>createAudit(screenshot, xml)</w:t>
+      </w:r>
+      <w:r>
+        <w:t xml:space="preserve"> sends both files — </w:t>
+      </w:r>
+      <w:r>
+        <w:rPr>
+          <w:rFonts w:ascii="Consolas" w:hAnsi="Consolas"/>
+        </w:rPr>
+        <w:t>api.js</w:t>
+      </w:r>
+    </w:p>
+    <w:p>
+      <w:pPr>
+        <w:pStyle w:val="ListBullet"/>
+      </w:pPr>
+      <w:r>
+        <w:rPr>
+          <w:b/>
+        </w:rPr>
+        <w:t>Issue 3</w:t>
+      </w:r>
+      <w:r>
+        <w:t xml:space="preserve"> — Backend requires screenshot + XML; 400 on pair mismatch — </w:t>
+      </w:r>
+      <w:r>
+        <w:rPr>
+          <w:rFonts w:ascii="Consolas" w:hAnsi="Consolas"/>
+        </w:rPr>
+        <w:t>backend/routers/audit.py</w:t>
+      </w:r>
+    </w:p>
+    <w:p>
+      <w:pPr>
+        <w:pStyle w:val="ListBullet"/>
+      </w:pPr>
+      <w:r>
+        <w:rPr>
+          <w:b/>
+        </w:rPr>
+        <w:t>Issue 4</w:t>
+      </w:r>
+      <w:r>
+        <w:t xml:space="preserve"> — </w:t>
+      </w:r>
+      <w:r>
+        <w:rPr>
+          <w:rFonts w:ascii="Consolas" w:hAnsi="Consolas"/>
+        </w:rPr>
+        <w:t>filesMatch()</w:t>
+      </w:r>
+      <w:r>
+        <w:t xml:space="preserve"> stem/prefix logic rejects false-positive digit matches — </w:t>
+      </w:r>
+      <w:r>
+        <w:rPr>
+          <w:rFonts w:ascii="Consolas" w:hAnsi="Consolas"/>
+        </w:rPr>
+        <w:t>Upload.jsx</w:t>
+      </w:r>
+    </w:p>
+    <w:p>
+      <w:pPr>
+        <w:pStyle w:val="ListBullet"/>
+      </w:pPr>
+      <w:r>
+        <w:rPr>
+          <w:b/>
+        </w:rPr>
+        <w:t>Tests</w:t>
+      </w:r>
+      <w:r>
+        <w:t xml:space="preserve"> — </w:t>
+      </w:r>
+      <w:r>
+        <w:rPr>
+          <w:rFonts w:ascii="Consolas" w:hAnsi="Consolas"/>
+        </w:rPr>
+        <w:t>tests/test_audit.py</w:t>
+      </w:r>
+      <w:r>
+        <w:t xml:space="preserve"> updated; missing-screenshot + mismatched-pair cases; validation scripts aligned</w:t>
+      </w:r>
+    </w:p>
+    <w:p>
+      <w:r>
+        <w:rPr>
+          <w:b/>
+        </w:rPr>
+        <w:t>Pending:</w:t>
+      </w:r>
+      <w:r>
+        <w:t xml:space="preserve"> Records + auth (Week 6)</w:t>
+      </w:r>
+    </w:p>
+    <w:p>
+      <w:r>
+        <w:rPr>
+          <w:b/>
+        </w:rPr>
+        <w:t>Blockers:</w:t>
+      </w:r>
+      <w:r>
+        <w:t xml:space="preserve"> None</w:t>
+      </w:r>
+    </w:p>
+    <w:p>
+      <w:pPr>
+        <w:pStyle w:val="Heading3"/>
+      </w:pPr>
+      <w:r>
         <w:t>Week 5 — Noor (`noor` branch, commit `4ce430feb` — pushed 12 Jul 2026)</w:t>
       </w:r>
     </w:p>
@@ -8971,6 +9161,48 @@
           <w:p>
             <w:r>
               <w:t>Rules credit → Salar + Noor + Ayesha (reviewed by all); Word export → `Supplementary_Progress_Report_v1.0.docx`; SRS/SDS DOCX generated from markdown</w:t>
+            </w:r>
+          </w:p>
+        </w:tc>
+      </w:tr>
+      <w:tr>
+        <w:tc>
+          <w:tcPr>
+            <w:tcW w:type="dxa" w:w="2160"/>
+          </w:tcPr>
+          <w:p>
+            <w:r>
+              <w:t>**1.10**</w:t>
+            </w:r>
+          </w:p>
+        </w:tc>
+        <w:tc>
+          <w:tcPr>
+            <w:tcW w:type="dxa" w:w="2160"/>
+          </w:tcPr>
+          <w:p>
+            <w:r>
+              <w:t>**14 Jul 2026**</w:t>
+            </w:r>
+          </w:p>
+        </w:tc>
+        <w:tc>
+          <w:tcPr>
+            <w:tcW w:type="dxa" w:w="2160"/>
+          </w:tcPr>
+          <w:p>
+            <w:r>
+              <w:t>**Noor**</w:t>
+            </w:r>
+          </w:p>
+        </w:tc>
+        <w:tc>
+          <w:tcPr>
+            <w:tcW w:type="dxa" w:w="2160"/>
+          </w:tcPr>
+          <w:p>
+            <w:r>
+              <w:t>Upload validation handoff merged (Ayesha frontend + Noor backend); SRS/SDS API contract updated</w:t>
             </w:r>
           </w:p>
         </w:tc>

</xml_diff>

<commit_message>
docs(week6): random eval sheet, validation logs, SRS/SDS/progress update
Co-authored-by: Cursor <cursoragent@cursor.com>
</commit_message>
<xml_diff>
--- a/docs/progress/Supplementary_Progress_Report_v1.0.docx
+++ b/docs/progress/Supplementary_Progress_Report_v1.0.docx
@@ -312,7 +312,7 @@
           </w:tcPr>
           <w:p>
             <w:r>
-              <w:t>Result (14 Jul on `noor`)</w:t>
+              <w:t>Result (15 Jul on `noor`)</w:t>
             </w:r>
           </w:p>
         </w:tc>
@@ -356,7 +356,7 @@
           </w:tcPr>
           <w:p>
             <w:r>
-              <w:t>**R01–R30 implemented** — 57 XML pass/fail fixtures; **120 pytest**</w:t>
+              <w:t>**R01–R30 implemented** — 57 XML pass/fail fixtures; **120+ pytest**</w:t>
             </w:r>
           </w:p>
         </w:tc>
@@ -422,7 +422,7 @@
           </w:tcPr>
           <w:p>
             <w:r>
-              <w:t>**Partial** — Upload/Dashboard/Report wired to live API; **upload pair validation fixed** (Ayesha); Records still mock (Week 6)</w:t>
+              <w:t>**Partial → near-complete** — Upload/Dashboard/Report wired; Records + Login/SignUp on live auth/records API (Salar + Ayesha synced)</w:t>
             </w:r>
           </w:p>
         </w:tc>
@@ -444,7 +444,7 @@
           </w:tcPr>
           <w:p>
             <w:r>
-              <w:t>**Partial** — `POST /audit` requires screenshot + XML + pair check; violations + report + **download**; no auth/records persistence</w:t>
+              <w:t>**Done** for Week 5 scope — paired `POST /audit`, violations, report, download</w:t>
             </w:r>
           </w:p>
         </w:tc>
@@ -466,7 +466,7 @@
           </w:tcPr>
           <w:p>
             <w:r>
-              <w:t>Specified in SRS v2.0; not implemented in code</w:t>
+              <w:t>**Done on `noor`** — JWT (`/auth/*`) + per-user `/records` (Salar `198936146`); score/filename fields (Noor)</w:t>
             </w:r>
           </w:p>
         </w:tc>
@@ -488,7 +488,7 @@
           </w:tcPr>
           <w:p>
             <w:r>
-              <w:t>Deferred on `noor` (removed); Salar owns Docker on `salar`</w:t>
+              <w:t>**Synced** — `backend/Dockerfile` + root `docker-compose.yml` from Salar</w:t>
             </w:r>
           </w:p>
         </w:tc>
@@ -510,7 +510,7 @@
           </w:tcPr>
           <w:p>
             <w:r>
-              <w:t>SRS v2.0 (Ayesha+Salar), **SDS v2.6** (Noor), progress report **v1.10**</w:t>
+              <w:t>SRS **v2.3**, SDS **v2.7**, progress report **v1.11**</w:t>
             </w:r>
           </w:p>
         </w:tc>
@@ -521,28 +521,28 @@
         <w:rPr>
           <w:b/>
         </w:rPr>
-        <w:t>Bottom line (14 Jul):</w:t>
-      </w:r>
-      <w:r>
-        <w:t xml:space="preserve"> Upload validation handoff complete — frontend (Ayesha </w:t>
+        <w:t>Bottom line (15 Jul):</w:t>
+      </w:r>
+      <w:r>
+        <w:t xml:space="preserve"> Week 6 sync on </w:t>
       </w:r>
       <w:r>
         <w:rPr>
           <w:rFonts w:ascii="Consolas" w:hAnsi="Consolas"/>
         </w:rPr>
-        <w:t>052a976</w:t>
-      </w:r>
-      <w:r>
-        <w:t xml:space="preserve">) + backend pair enforcement (Noor). Full pipeline: screenshot + XML → R01–R30 → </w:t>
+        <w:t>noor</w:t>
+      </w:r>
+      <w:r>
+        <w:t xml:space="preserve"> (</w:t>
       </w:r>
       <w:r>
         <w:rPr>
           <w:rFonts w:ascii="Consolas" w:hAnsi="Consolas"/>
         </w:rPr>
-        <w:t>report.json</w:t>
-      </w:r>
-      <w:r>
-        <w:t xml:space="preserve"> → downloadable HTML/PDF. Next: Records + auth (Week 6).</w:t>
+        <w:t>03ffa505a</w:t>
+      </w:r>
+      <w:r>
+        <w:t>+): Salar JWT/records + Ayesha prompt/Dashboard + Noor eval sheet (40 stratified-random screens) + Week 6 validation logs. Next: ≥25 manual eval rows; Friday demo; training stretch on MASC splits.</w:t>
       </w:r>
     </w:p>
     <w:p>
@@ -857,7 +857,7 @@
           </w:tcPr>
           <w:p>
             <w:r>
-              <w:t>Noor</w:t>
+              <w:t>Noor (audit) + **Salar (auth/records)**</w:t>
             </w:r>
           </w:p>
         </w:tc>
@@ -867,7 +867,7 @@
           </w:tcPr>
           <w:p>
             <w:r>
-              <w:t>`backend/routers/audit.py`, `backend/main.py`</w:t>
+              <w:t>`backend/routers/audit.py`; `auth.py`, `auth_router.py`, `records_router.py`</w:t>
             </w:r>
           </w:p>
         </w:tc>
@@ -889,7 +889,7 @@
           </w:tcPr>
           <w:p>
             <w:r>
-              <w:t>Ayesha</w:t>
+              <w:t>Ayesha (+ Salar auth wiring)</w:t>
             </w:r>
           </w:p>
         </w:tc>
@@ -899,7 +899,7 @@
           </w:tcPr>
           <w:p>
             <w:r>
-              <w:t>`frontend/`; API wiring Upload/Dashboard/Report</w:t>
+              <w:t>`frontend/`; API wiring Upload/Dashboard/Report/Records/Login</w:t>
             </w:r>
           </w:p>
         </w:tc>
@@ -6413,12 +6413,104 @@
         <w:pStyle w:val="Heading2"/>
       </w:pPr>
       <w:r>
-        <w:t>14. Recommended next steps (updated 12 July 2026)</w:t>
+        <w:t>14. Recommended next steps (updated 15 July 2026)</w:t>
       </w:r>
     </w:p>
     <w:p>
       <w:r>
         <w:t xml:space="preserve">1. </w:t>
+      </w:r>
+      <w:r>
+        <w:rPr>
+          <w:b/>
+        </w:rPr>
+        <w:t>Noor:</w:t>
+      </w:r>
+      <w:r>
+        <w:t xml:space="preserve"> Fill ≥25 manual rows on </w:t>
+      </w:r>
+      <w:r>
+        <w:rPr>
+          <w:rFonts w:ascii="Consolas" w:hAnsi="Consolas"/>
+        </w:rPr>
+        <w:t>docs/week6/evaluation_sheet_40_screens.csv</w:t>
+      </w:r>
+      <w:r>
+        <w:t xml:space="preserve"> (FP / missed notes)</w:t>
+      </w:r>
+    </w:p>
+    <w:p>
+      <w:r>
+        <w:t xml:space="preserve">2. </w:t>
+      </w:r>
+      <w:r>
+        <w:rPr>
+          <w:b/>
+        </w:rPr>
+        <w:t>All:</w:t>
+      </w:r>
+      <w:r>
+        <w:t xml:space="preserve"> Friday demo — login → upload screenshot+XML → dashboard → report HTML/PDF → Records list</w:t>
+      </w:r>
+    </w:p>
+    <w:p>
+      <w:r>
+        <w:t xml:space="preserve">3. </w:t>
+      </w:r>
+      <w:r>
+        <w:rPr>
+          <w:b/>
+        </w:rPr>
+        <w:t>Noor (stretch):</w:t>
+      </w:r>
+      <w:r>
+        <w:t xml:space="preserve"> Map guidelines for CV training on MASC </w:t>
+      </w:r>
+      <w:r>
+        <w:rPr>
+          <w:b/>
+        </w:rPr>
+        <w:t>train</w:t>
+      </w:r>
+      <w:r>
+        <w:t xml:space="preserve"> → tune on </w:t>
+      </w:r>
+      <w:r>
+        <w:rPr>
+          <w:b/>
+        </w:rPr>
+        <w:t>val</w:t>
+      </w:r>
+      <w:r>
+        <w:t xml:space="preserve"> → test on </w:t>
+      </w:r>
+      <w:r>
+        <w:rPr>
+          <w:b/>
+        </w:rPr>
+        <w:t>test</w:t>
+      </w:r>
+      <w:r>
+        <w:t>; never train on Rico holdout</w:t>
+      </w:r>
+    </w:p>
+    <w:p>
+      <w:r>
+        <w:t xml:space="preserve">4. </w:t>
+      </w:r>
+      <w:r>
+        <w:rPr>
+          <w:b/>
+        </w:rPr>
+        <w:t>Ayesha:</w:t>
+      </w:r>
+      <w:r>
+        <w:t xml:space="preserve"> Continue prompt experiments; polish auth/records UX if needed</w:t>
+      </w:r>
+    </w:p>
+    <w:p>
+      <w:r>
+        <w:t xml:space="preserve">5. </w:t>
       </w:r>
       <w:r>
         <w:rPr>
@@ -6427,49 +6519,7 @@
         <w:t>Salar:</w:t>
       </w:r>
       <w:r>
-        <w:t xml:space="preserve"> Auth backend (JWT) + records persistence API (Week 6)</w:t>
-      </w:r>
-    </w:p>
-    <w:p>
-      <w:r>
-        <w:t xml:space="preserve">2. </w:t>
-      </w:r>
-      <w:r>
-        <w:rPr>
-          <w:b/>
-        </w:rPr>
-        <w:t>Ayesha:</w:t>
-      </w:r>
-      <w:r>
-        <w:t xml:space="preserve"> Wire Records page to list endpoint once backend exists; auth screens when auth router lands</w:t>
-      </w:r>
-    </w:p>
-    <w:p>
-      <w:r>
-        <w:t xml:space="preserve">3. </w:t>
-      </w:r>
-      <w:r>
-        <w:rPr>
-          <w:b/>
-        </w:rPr>
-        <w:t>Noor:</w:t>
-      </w:r>
-      <w:r>
-        <w:t xml:space="preserve"> Rico holdout batch parse + evaluation sheet; Docker polish</w:t>
-      </w:r>
-    </w:p>
-    <w:p>
-      <w:r>
-        <w:t xml:space="preserve">4. </w:t>
-      </w:r>
-      <w:r>
-        <w:rPr>
-          <w:b/>
-        </w:rPr>
-        <w:t>All:</w:t>
-      </w:r>
-      <w:r>
-        <w:t xml:space="preserve"> Demo — XML upload → API → dashboard → downloadable HTML/PDF report</w:t>
+        <w:t xml:space="preserve"> Optional OTP/forgot-password backend stretch; keep JWT secret configured for demos</w:t>
       </w:r>
     </w:p>
     <w:p>
@@ -6489,6 +6539,401 @@
       </w:r>
       <w:r>
         <w:t xml:space="preserve"> Each intern adds a dated entry after pushing work. Newest week at the top. Keep entries factual — file names, test counts, branch commits.</w:t>
+      </w:r>
+    </w:p>
+    <w:p>
+      <w:pPr>
+        <w:pStyle w:val="Heading3"/>
+      </w:pPr>
+      <w:r>
+        <w:t>Week 6 — Noor (`noor` branch — Salar + Ayesha sync + eval, 15 Jul 2026)</w:t>
+      </w:r>
+    </w:p>
+    <w:p>
+      <w:r>
+        <w:rPr>
+          <w:b/>
+        </w:rPr>
+        <w:t>Pushed by:</w:t>
+      </w:r>
+      <w:r>
+        <w:t xml:space="preserve"> Muhammad Noor (integration) — sources: Salar </w:t>
+      </w:r>
+      <w:r>
+        <w:rPr>
+          <w:rFonts w:ascii="Consolas" w:hAnsi="Consolas"/>
+        </w:rPr>
+        <w:t>198936146</w:t>
+      </w:r>
+      <w:r>
+        <w:t xml:space="preserve">, Ayesha </w:t>
+      </w:r>
+      <w:r>
+        <w:rPr>
+          <w:rFonts w:ascii="Consolas" w:hAnsi="Consolas"/>
+        </w:rPr>
+        <w:t>3d4fa82eb</w:t>
+      </w:r>
+    </w:p>
+    <w:p>
+      <w:r>
+        <w:rPr>
+          <w:b/>
+        </w:rPr>
+        <w:t>Date:</w:t>
+      </w:r>
+      <w:r>
+        <w:t xml:space="preserve"> 15 July 2026</w:t>
+      </w:r>
+    </w:p>
+    <w:p>
+      <w:r>
+        <w:rPr>
+          <w:b/>
+        </w:rPr>
+        <w:t>Completed:</w:t>
+      </w:r>
+    </w:p>
+    <w:p>
+      <w:pPr>
+        <w:pStyle w:val="ListBullet"/>
+      </w:pPr>
+      <w:r>
+        <w:rPr>
+          <w:b/>
+        </w:rPr>
+        <w:t>Synced Salar JWT + records</w:t>
+      </w:r>
+      <w:r>
+        <w:t xml:space="preserve"> into </w:t>
+      </w:r>
+      <w:r>
+        <w:rPr>
+          <w:rFonts w:ascii="Consolas" w:hAnsi="Consolas"/>
+        </w:rPr>
+        <w:t>_noor_push</w:t>
+      </w:r>
+      <w:r>
+        <w:t xml:space="preserve"> / </w:t>
+      </w:r>
+      <w:r>
+        <w:rPr>
+          <w:rFonts w:ascii="Consolas" w:hAnsi="Consolas"/>
+        </w:rPr>
+        <w:t>noor</w:t>
+      </w:r>
+      <w:r>
+        <w:t xml:space="preserve"> — </w:t>
+      </w:r>
+      <w:r>
+        <w:rPr>
+          <w:rFonts w:ascii="Consolas" w:hAnsi="Consolas"/>
+        </w:rPr>
+        <w:t>backend/auth.py</w:t>
+      </w:r>
+      <w:r>
+        <w:t xml:space="preserve">, </w:t>
+      </w:r>
+      <w:r>
+        <w:rPr>
+          <w:rFonts w:ascii="Consolas" w:hAnsi="Consolas"/>
+        </w:rPr>
+        <w:t>auth_router.py</w:t>
+      </w:r>
+      <w:r>
+        <w:t xml:space="preserve">, </w:t>
+      </w:r>
+      <w:r>
+        <w:rPr>
+          <w:rFonts w:ascii="Consolas" w:hAnsi="Consolas"/>
+        </w:rPr>
+        <w:t>records_router.py</w:t>
+      </w:r>
+      <w:r>
+        <w:t xml:space="preserve">, </w:t>
+      </w:r>
+      <w:r>
+        <w:rPr>
+          <w:rFonts w:ascii="Consolas" w:hAnsi="Consolas"/>
+        </w:rPr>
+        <w:t>test_auth.py</w:t>
+      </w:r>
+      <w:r>
+        <w:t xml:space="preserve">, Docker/compose, Login/SignUp, </w:t>
+      </w:r>
+      <w:r>
+        <w:rPr>
+          <w:rFonts w:ascii="Consolas" w:hAnsi="Consolas"/>
+        </w:rPr>
+        <w:t>frontend/src/utils/auth.js</w:t>
+      </w:r>
+    </w:p>
+    <w:p>
+      <w:pPr>
+        <w:pStyle w:val="ListBullet"/>
+      </w:pPr>
+      <w:r>
+        <w:rPr>
+          <w:b/>
+        </w:rPr>
+        <w:t>Synced Ayesha</w:t>
+      </w:r>
+      <w:r>
+        <w:t xml:space="preserve"> — </w:t>
+      </w:r>
+      <w:r>
+        <w:rPr>
+          <w:rFonts w:ascii="Consolas" w:hAnsi="Consolas"/>
+        </w:rPr>
+        <w:t>docs/agent_prompt_experiments.md</w:t>
+      </w:r>
+      <w:r>
+        <w:t xml:space="preserve"> (larger Groq sample); </w:t>
+      </w:r>
+      <w:r>
+        <w:rPr>
+          <w:rFonts w:ascii="Consolas" w:hAnsi="Consolas"/>
+        </w:rPr>
+        <w:t>Dashboard.jsx</w:t>
+      </w:r>
+      <w:r>
+        <w:t xml:space="preserve"> re-run popup layout</w:t>
+      </w:r>
+    </w:p>
+    <w:p>
+      <w:pPr>
+        <w:pStyle w:val="ListBullet"/>
+      </w:pPr>
+      <w:r>
+        <w:rPr>
+          <w:b/>
+        </w:rPr>
+        <w:t>Noor UI polish</w:t>
+      </w:r>
+      <w:r>
+        <w:t xml:space="preserve"> — Report score ring (</w:t>
+      </w:r>
+      <w:r>
+        <w:rPr>
+          <w:rFonts w:ascii="Consolas" w:hAnsi="Consolas"/>
+        </w:rPr>
+        <w:t>accessibility_score</w:t>
+      </w:r>
+      <w:r>
+        <w:t>); Records Screenshot/XML + Score columns; Upload saves record when logged in</w:t>
+      </w:r>
+    </w:p>
+    <w:p>
+      <w:pPr>
+        <w:pStyle w:val="ListBullet"/>
+      </w:pPr>
+      <w:r>
+        <w:rPr>
+          <w:b/>
+        </w:rPr>
+        <w:t>Eval sheet</w:t>
+      </w:r>
+      <w:r>
+        <w:t xml:space="preserve"> — </w:t>
+      </w:r>
+      <w:r>
+        <w:rPr>
+          <w:rFonts w:ascii="Consolas" w:hAnsi="Consolas"/>
+        </w:rPr>
+        <w:t>docs/week6/evaluation_sheet_40_screens.csv</w:t>
+      </w:r>
+      <w:r>
+        <w:t xml:space="preserve"> — </w:t>
+      </w:r>
+      <w:r>
+        <w:rPr>
+          <w:b/>
+        </w:rPr>
+        <w:t>stratified random</w:t>
+      </w:r>
+      <w:r>
+        <w:t xml:space="preserve"> 4×10 MASC categories (seed </w:t>
+      </w:r>
+      <w:r>
+        <w:rPr>
+          <w:rFonts w:ascii="Consolas" w:hAnsi="Consolas"/>
+        </w:rPr>
+        <w:t>20260715</w:t>
+      </w:r>
+      <w:r>
+        <w:t>); R26–R30 design DOCX</w:t>
+      </w:r>
+    </w:p>
+    <w:p>
+      <w:pPr>
+        <w:pStyle w:val="ListBullet"/>
+      </w:pPr>
+      <w:r>
+        <w:rPr>
+          <w:b/>
+        </w:rPr>
+        <w:t>`.gitignore`</w:t>
+      </w:r>
+      <w:r>
+        <w:t xml:space="preserve"> — synced from Salar (</w:t>
+      </w:r>
+      <w:r>
+        <w:rPr>
+          <w:rFonts w:ascii="Consolas" w:hAnsi="Consolas"/>
+        </w:rPr>
+        <w:t>data/</w:t>
+      </w:r>
+      <w:r>
+        <w:t xml:space="preserve"> + </w:t>
+      </w:r>
+      <w:r>
+        <w:rPr>
+          <w:rFonts w:ascii="Consolas" w:hAnsi="Consolas"/>
+        </w:rPr>
+        <w:t>outputs/</w:t>
+      </w:r>
+      <w:r>
+        <w:t xml:space="preserve"> + validation/samples exceptions)</w:t>
+      </w:r>
+    </w:p>
+    <w:p>
+      <w:pPr>
+        <w:pStyle w:val="ListBullet"/>
+      </w:pPr>
+      <w:r>
+        <w:rPr>
+          <w:b/>
+        </w:rPr>
+        <w:t>Validation</w:t>
+      </w:r>
+      <w:r>
+        <w:t xml:space="preserve"> — </w:t>
+      </w:r>
+      <w:r>
+        <w:rPr>
+          <w:rFonts w:ascii="Consolas" w:hAnsi="Consolas"/>
+        </w:rPr>
+        <w:t>scripts/noor_week6_validate.py</w:t>
+      </w:r>
+      <w:r>
+        <w:t xml:space="preserve"> → </w:t>
+      </w:r>
+      <w:r>
+        <w:rPr>
+          <w:rFonts w:ascii="Consolas" w:hAnsi="Consolas"/>
+        </w:rPr>
+        <w:t>outputs/validation_logs/noor_week6_summary.md</w:t>
+      </w:r>
+      <w:r>
+        <w:t xml:space="preserve"> + </w:t>
+      </w:r>
+      <w:r>
+        <w:rPr>
+          <w:rFonts w:ascii="Consolas" w:hAnsi="Consolas"/>
+        </w:rPr>
+        <w:t>noor_week6_validation_log.txt</w:t>
+      </w:r>
+    </w:p>
+    <w:p>
+      <w:pPr>
+        <w:pStyle w:val="ListBullet"/>
+      </w:pPr>
+      <w:r>
+        <w:t xml:space="preserve">auth tests: </w:t>
+      </w:r>
+      <w:r>
+        <w:rPr>
+          <w:b/>
+        </w:rPr>
+        <w:t>12 passed</w:t>
+      </w:r>
+    </w:p>
+    <w:p>
+      <w:pPr>
+        <w:pStyle w:val="ListBullet"/>
+      </w:pPr>
+      <w:r>
+        <w:t xml:space="preserve">audit tests: </w:t>
+      </w:r>
+      <w:r>
+        <w:rPr>
+          <w:b/>
+        </w:rPr>
+        <w:t>8 passed, 1 skipped</w:t>
+      </w:r>
+      <w:r>
+        <w:t xml:space="preserve"> (PDF skip if Chromium missing)</w:t>
+      </w:r>
+    </w:p>
+    <w:p>
+      <w:pPr>
+        <w:pStyle w:val="ListBullet"/>
+      </w:pPr>
+      <w:r>
+        <w:t xml:space="preserve">R26–R30: </w:t>
+      </w:r>
+      <w:r>
+        <w:rPr>
+          <w:b/>
+        </w:rPr>
+        <w:t>8 passed</w:t>
+      </w:r>
+    </w:p>
+    <w:p>
+      <w:pPr>
+        <w:pStyle w:val="ListBullet"/>
+      </w:pPr>
+      <w:r>
+        <w:t xml:space="preserve">Auth/Records API smoke: </w:t>
+      </w:r>
+      <w:r>
+        <w:rPr>
+          <w:b/>
+        </w:rPr>
+        <w:t>PASS</w:t>
+      </w:r>
+    </w:p>
+    <w:p>
+      <w:r>
+        <w:rPr>
+          <w:b/>
+        </w:rPr>
+        <w:t>Pending:</w:t>
+      </w:r>
+    </w:p>
+    <w:p>
+      <w:pPr>
+        <w:pStyle w:val="ListBullet"/>
+      </w:pPr>
+      <w:r>
+        <w:t>≥25 manual eval verdicts on the CSV</w:t>
+      </w:r>
+    </w:p>
+    <w:p>
+      <w:pPr>
+        <w:pStyle w:val="ListBullet"/>
+      </w:pPr>
+      <w:r>
+        <w:t>Rico holdout batch evaluation (Week 8)</w:t>
+      </w:r>
+    </w:p>
+    <w:p>
+      <w:pPr>
+        <w:pStyle w:val="ListBullet"/>
+      </w:pPr>
+      <w:r>
+        <w:t>Progress manual fill + Friday demo rehearsal</w:t>
+      </w:r>
+    </w:p>
+    <w:p>
+      <w:r>
+        <w:rPr>
+          <w:b/>
+        </w:rPr>
+        <w:t>Blockers:</w:t>
+      </w:r>
+      <w:r>
+        <w:t xml:space="preserve"> None on sync scope</w:t>
       </w:r>
     </w:p>
     <w:p>
@@ -9203,6 +9648,48 @@
           <w:p>
             <w:r>
               <w:t>Upload validation handoff merged (Ayesha frontend + Noor backend); SRS/SDS API contract updated</w:t>
+            </w:r>
+          </w:p>
+        </w:tc>
+      </w:tr>
+      <w:tr>
+        <w:tc>
+          <w:tcPr>
+            <w:tcW w:type="dxa" w:w="2160"/>
+          </w:tcPr>
+          <w:p>
+            <w:r>
+              <w:t>**1.11**</w:t>
+            </w:r>
+          </w:p>
+        </w:tc>
+        <w:tc>
+          <w:tcPr>
+            <w:tcW w:type="dxa" w:w="2160"/>
+          </w:tcPr>
+          <w:p>
+            <w:r>
+              <w:t>**15 Jul 2026**</w:t>
+            </w:r>
+          </w:p>
+        </w:tc>
+        <w:tc>
+          <w:tcPr>
+            <w:tcW w:type="dxa" w:w="2160"/>
+          </w:tcPr>
+          <w:p>
+            <w:r>
+              <w:t>**Noor**</w:t>
+            </w:r>
+          </w:p>
+        </w:tc>
+        <w:tc>
+          <w:tcPr>
+            <w:tcW w:type="dxa" w:w="2160"/>
+          </w:tcPr>
+          <w:p>
+            <w:r>
+              <w:t>Week 6: Salar auth/records + Ayesha prompt/Dashboard synced; random 40-screen eval sheet; Week 6 validation logs; `.gitignore` from Salar</w:t>
             </w:r>
           </w:p>
         </w:tc>

</xml_diff>

<commit_message>
docs(progress): add Week 7 evidence pack and regenerate report DOCX
Supplementary report v1.14 with section 15B metrics, rule/guideline tables, validation excerpt, and team handoff notes.

Co-authored-by: Cursor <cursoragent@cursor.com>
</commit_message>
<xml_diff>
--- a/docs/progress/Supplementary_Progress_Report_v1.0.docx
+++ b/docs/progress/Supplementary_Progress_Report_v1.0.docx
@@ -26,7 +26,7 @@
           <w:b/>
           <w:sz w:val="22"/>
         </w:rPr>
-        <w:t>Practical work completed — Weeks 1–6 (baseline 1 July 2026; updated 16 July 2026)</w:t>
+        <w:t>Practical work completed — Weeks 1–6 (baseline 1 July 2026; updated 20 July 2026)</w:t>
       </w:r>
     </w:p>
     <w:p>
@@ -1157,7 +1157,7 @@
                 <w:b/>
                 <w:sz w:val="20"/>
               </w:rPr>
-              <w:t>v2.5</w:t>
+              <w:t>v2.6</w:t>
             </w:r>
             <w:r>
               <w:rPr>
@@ -1173,7 +1173,7 @@
                 <w:b/>
                 <w:sz w:val="20"/>
               </w:rPr>
-              <w:t>v2.9</w:t>
+              <w:t>v2.10</w:t>
             </w:r>
             <w:r>
               <w:rPr>
@@ -1189,15 +1189,15 @@
                 <w:b/>
                 <w:sz w:val="20"/>
               </w:rPr>
-              <w:t>v1.13</w:t>
-            </w:r>
-            <w:r>
-              <w:rPr>
-                <w:rFonts w:ascii="Calibri" w:hAnsi="Calibri" w:eastAsia="Calibri"/>
-                <w:b w:val="0"/>
-                <w:sz w:val="20"/>
-              </w:rPr>
-              <w:t>, plan updated 16 Jul</w:t>
+              <w:t>v1.14</w:t>
+            </w:r>
+            <w:r>
+              <w:rPr>
+                <w:rFonts w:ascii="Calibri" w:hAnsi="Calibri" w:eastAsia="Calibri"/>
+                <w:b w:val="0"/>
+                <w:sz w:val="20"/>
+              </w:rPr>
+              <w:t>, plan updated 20 Jul</w:t>
             </w:r>
           </w:p>
         </w:tc>
@@ -1211,7 +1211,7 @@
           <w:b/>
           <w:sz w:val="22"/>
         </w:rPr>
-        <w:t>Bottom line (16 Jul):</w:t>
+        <w:t>Bottom line (20 Jul):</w:t>
       </w:r>
       <w:r>
         <w:rPr>
@@ -1252,24 +1252,39 @@
           <w:b w:val="0"/>
           <w:sz w:val="22"/>
         </w:rPr>
-        <w:t xml:space="preserve"> (</w:t>
-      </w:r>
-      <w:r>
-        <w:rPr>
-          <w:rFonts w:ascii="Consolas" w:hAnsi="Consolas" w:eastAsia="Consolas"/>
-          <w:b w:val="0"/>
-          <w:color w:val="1E3A5F"/>
-          <w:sz w:val="18"/>
-        </w:rPr>
-        <w:t>995f6d31</w:t>
-      </w:r>
-      <w:r>
-        <w:rPr>
-          <w:rFonts w:ascii="Calibri" w:hAnsi="Calibri" w:eastAsia="Calibri"/>
-          <w:b w:val="0"/>
-          <w:sz w:val="22"/>
-        </w:rPr>
-        <w:t>): Salar JWT/records + Ayesha auth UI + Noor OTP/SMTP/Google OAuth, 40/40 eval sheet, HTML/PDF export fix, validation logs refreshed. Optional: Friday demo walkthrough; training stretch / Rico holdout in Weeks 7–8.</w:t>
+        <w:t xml:space="preserve">. </w:t>
+      </w:r>
+      <w:r>
+        <w:rPr>
+          <w:rFonts w:ascii="Calibri" w:hAnsi="Calibri" w:eastAsia="Calibri"/>
+          <w:b/>
+          <w:sz w:val="22"/>
+        </w:rPr>
+        <w:t>Week 7 (Noor):</w:t>
+      </w:r>
+      <w:r>
+        <w:rPr>
+          <w:rFonts w:ascii="Calibri" w:hAnsi="Calibri" w:eastAsia="Calibri"/>
+          <w:b w:val="0"/>
+          <w:sz w:val="22"/>
+        </w:rPr>
+        <w:t xml:space="preserve"> MASC 40-screen QA analysis — rule-wise R01–R30 + guideline G01–G30 summaries, FP/miss QA notes, Week 6 cross-check, team priority fixes; validation logs refreshed. </w:t>
+      </w:r>
+      <w:r>
+        <w:rPr>
+          <w:rFonts w:ascii="Calibri" w:hAnsi="Calibri" w:eastAsia="Calibri"/>
+          <w:b/>
+          <w:sz w:val="22"/>
+        </w:rPr>
+        <w:t>Rico holdout batch deferred.</w:t>
+      </w:r>
+      <w:r>
+        <w:rPr>
+          <w:rFonts w:ascii="Calibri" w:hAnsi="Calibri" w:eastAsia="Calibri"/>
+          <w:b w:val="0"/>
+          <w:sz w:val="22"/>
+        </w:rPr>
+        <w:t xml:space="preserve"> Salar/Ayesha Week 7 tasks (FP tuning, UI polish) pending.</w:t>
       </w:r>
     </w:p>
     <w:p>
@@ -3457,6 +3472,129 @@
                 <w:sz w:val="20"/>
               </w:rPr>
               <w:t xml:space="preserve"> + validation logs</w:t>
+            </w:r>
+          </w:p>
+        </w:tc>
+      </w:tr>
+      <w:tr>
+        <w:tc>
+          <w:tcPr>
+            <w:tcW w:type="dxa" w:w="1901"/>
+          </w:tcPr>
+          <w:p>
+            <w:pPr>
+              <w:spacing w:before="60" w:after="60"/>
+            </w:pPr>
+            <w:r/>
+            <w:r>
+              <w:rPr>
+                <w:rFonts w:ascii="Calibri" w:hAnsi="Calibri" w:eastAsia="Calibri"/>
+                <w:b w:val="0"/>
+                <w:sz w:val="20"/>
+              </w:rPr>
+              <w:t>Week 7 QA</w:t>
+            </w:r>
+          </w:p>
+        </w:tc>
+        <w:tc>
+          <w:tcPr>
+            <w:tcW w:type="dxa" w:w="1901"/>
+          </w:tcPr>
+          <w:p>
+            <w:pPr>
+              <w:spacing w:before="60" w:after="60"/>
+            </w:pPr>
+            <w:r/>
+            <w:r>
+              <w:rPr>
+                <w:rFonts w:ascii="Calibri" w:hAnsi="Calibri" w:eastAsia="Calibri"/>
+                <w:b w:val="0"/>
+                <w:sz w:val="20"/>
+              </w:rPr>
+              <w:t>Noor</w:t>
+            </w:r>
+          </w:p>
+        </w:tc>
+        <w:tc>
+          <w:tcPr>
+            <w:tcW w:type="dxa" w:w="1901"/>
+          </w:tcPr>
+          <w:p>
+            <w:pPr>
+              <w:spacing w:before="60" w:after="60"/>
+            </w:pPr>
+            <w:r/>
+            <w:r>
+              <w:rPr>
+                <w:rFonts w:ascii="Calibri" w:hAnsi="Calibri" w:eastAsia="Calibri"/>
+                <w:b w:val="0"/>
+                <w:sz w:val="20"/>
+              </w:rPr>
+              <w:t>Rule/guideline summaries</w:t>
+            </w:r>
+          </w:p>
+        </w:tc>
+        <w:tc>
+          <w:tcPr>
+            <w:tcW w:type="dxa" w:w="1901"/>
+          </w:tcPr>
+          <w:p>
+            <w:pPr>
+              <w:spacing w:before="60" w:after="60"/>
+            </w:pPr>
+            <w:r/>
+            <w:r>
+              <w:rPr>
+                <w:rFonts w:ascii="Calibri" w:hAnsi="Calibri" w:eastAsia="Calibri"/>
+                <w:b/>
+                <w:sz w:val="20"/>
+              </w:rPr>
+              <w:t>Done</w:t>
+            </w:r>
+            <w:r>
+              <w:rPr>
+                <w:rFonts w:ascii="Calibri" w:hAnsi="Calibri" w:eastAsia="Calibri"/>
+                <w:b w:val="0"/>
+                <w:sz w:val="20"/>
+              </w:rPr>
+              <w:t xml:space="preserve"> (holdout deferred)</w:t>
+            </w:r>
+          </w:p>
+        </w:tc>
+        <w:tc>
+          <w:tcPr>
+            <w:tcW w:type="dxa" w:w="1901"/>
+          </w:tcPr>
+          <w:p>
+            <w:pPr>
+              <w:spacing w:before="60" w:after="60"/>
+            </w:pPr>
+            <w:r/>
+            <w:r>
+              <w:rPr>
+                <w:rFonts w:ascii="Consolas" w:hAnsi="Consolas" w:eastAsia="Consolas"/>
+                <w:b w:val="0"/>
+                <w:color w:val="1E3A5F"/>
+                <w:sz w:val="18"/>
+              </w:rPr>
+              <w:t>docs/week7/</w:t>
+            </w:r>
+            <w:r>
+              <w:rPr>
+                <w:rFonts w:ascii="Calibri" w:hAnsi="Calibri" w:eastAsia="Calibri"/>
+                <w:b w:val="0"/>
+                <w:sz w:val="20"/>
+              </w:rPr>
+              <w:t xml:space="preserve"> · </w:t>
+            </w:r>
+            <w:r>
+              <w:rPr>
+                <w:rFonts w:ascii="Consolas" w:hAnsi="Consolas" w:eastAsia="Consolas"/>
+                <w:b w:val="0"/>
+                <w:color w:val="1E3A5F"/>
+                <w:sz w:val="18"/>
+              </w:rPr>
+              <w:t>outputs/week7_eval/</w:t>
             </w:r>
           </w:p>
         </w:tc>
@@ -20032,6 +20170,1787 @@
         <w:pStyle w:val="Heading2"/>
       </w:pPr>
       <w:r>
+        <w:t>15B. Week 7 evidence pack (QA analysis — Noor)</w:t>
+      </w:r>
+    </w:p>
+    <w:p>
+      <w:pPr>
+        <w:ind w:left="288"/>
+      </w:pPr>
+      <w:r>
+        <w:rPr>
+          <w:rFonts w:ascii="Calibri" w:hAnsi="Calibri" w:eastAsia="Calibri"/>
+          <w:b/>
+          <w:color w:val="1E3A5F"/>
+        </w:rPr>
+        <w:t xml:space="preserve">| </w:t>
+      </w:r>
+      <w:r>
+        <w:rPr>
+          <w:rFonts w:ascii="Calibri" w:hAnsi="Calibri" w:eastAsia="Calibri"/>
+          <w:b/>
+          <w:sz w:val="22"/>
+        </w:rPr>
+        <w:t>Scope:</w:t>
+      </w:r>
+      <w:r>
+        <w:rPr>
+          <w:rFonts w:ascii="Calibri" w:hAnsi="Calibri" w:eastAsia="Calibri"/>
+          <w:b w:val="0"/>
+          <w:sz w:val="22"/>
+        </w:rPr>
+        <w:t xml:space="preserve"> MASC 40-screen stratified sample (seed </w:t>
+      </w:r>
+      <w:r>
+        <w:rPr>
+          <w:rFonts w:ascii="Consolas" w:hAnsi="Consolas" w:eastAsia="Consolas"/>
+          <w:b w:val="0"/>
+          <w:color w:val="1E3A5F"/>
+          <w:sz w:val="18"/>
+        </w:rPr>
+        <w:t>20260715</w:t>
+      </w:r>
+      <w:r>
+        <w:rPr>
+          <w:rFonts w:ascii="Calibri" w:hAnsi="Calibri" w:eastAsia="Calibri"/>
+          <w:b w:val="0"/>
+          <w:sz w:val="22"/>
+        </w:rPr>
+        <w:t xml:space="preserve">). Rico holdout batch </w:t>
+      </w:r>
+      <w:r>
+        <w:rPr>
+          <w:rFonts w:ascii="Calibri" w:hAnsi="Calibri" w:eastAsia="Calibri"/>
+          <w:b/>
+          <w:sz w:val="22"/>
+        </w:rPr>
+        <w:t>not run</w:t>
+      </w:r>
+      <w:r>
+        <w:rPr>
+          <w:rFonts w:ascii="Calibri" w:hAnsi="Calibri" w:eastAsia="Calibri"/>
+          <w:b w:val="0"/>
+          <w:sz w:val="22"/>
+        </w:rPr>
+        <w:t xml:space="preserve"> in this pass.</w:t>
+      </w:r>
+    </w:p>
+    <w:p>
+      <w:pPr>
+        <w:ind w:left="288"/>
+      </w:pPr>
+      <w:r>
+        <w:rPr>
+          <w:rFonts w:ascii="Calibri" w:hAnsi="Calibri" w:eastAsia="Calibri"/>
+          <w:b/>
+          <w:color w:val="1E3A5F"/>
+        </w:rPr>
+        <w:t xml:space="preserve">| </w:t>
+      </w:r>
+      <w:r>
+        <w:rPr>
+          <w:rFonts w:ascii="Calibri" w:hAnsi="Calibri" w:eastAsia="Calibri"/>
+          <w:b w:val="0"/>
+          <w:sz w:val="22"/>
+        </w:rPr>
+        <w:t xml:space="preserve">Artifacts: </w:t>
+      </w:r>
+      <w:r>
+        <w:rPr>
+          <w:rFonts w:ascii="Consolas" w:hAnsi="Consolas" w:eastAsia="Consolas"/>
+          <w:b w:val="0"/>
+          <w:color w:val="1E3A5F"/>
+          <w:sz w:val="18"/>
+        </w:rPr>
+        <w:t>docs/week7/</w:t>
+      </w:r>
+      <w:r>
+        <w:rPr>
+          <w:rFonts w:ascii="Calibri" w:hAnsi="Calibri" w:eastAsia="Calibri"/>
+          <w:b w:val="0"/>
+          <w:sz w:val="22"/>
+        </w:rPr>
+        <w:t xml:space="preserve"> · </w:t>
+      </w:r>
+      <w:r>
+        <w:rPr>
+          <w:rFonts w:ascii="Consolas" w:hAnsi="Consolas" w:eastAsia="Consolas"/>
+          <w:b w:val="0"/>
+          <w:color w:val="1E3A5F"/>
+          <w:sz w:val="18"/>
+        </w:rPr>
+        <w:t>outputs/week7_eval/</w:t>
+      </w:r>
+      <w:r>
+        <w:rPr>
+          <w:rFonts w:ascii="Calibri" w:hAnsi="Calibri" w:eastAsia="Calibri"/>
+          <w:b w:val="0"/>
+          <w:sz w:val="22"/>
+        </w:rPr>
+        <w:t xml:space="preserve"> · </w:t>
+      </w:r>
+      <w:r>
+        <w:rPr>
+          <w:rFonts w:ascii="Consolas" w:hAnsi="Consolas" w:eastAsia="Consolas"/>
+          <w:b w:val="0"/>
+          <w:color w:val="1E3A5F"/>
+          <w:sz w:val="18"/>
+        </w:rPr>
+        <w:t>outputs/validation_logs/noor_week7_*</w:t>
+      </w:r>
+    </w:p>
+    <w:p>
+      <w:pPr>
+        <w:pStyle w:val="Heading3"/>
+      </w:pPr>
+      <w:r>
+        <w:t>15B.1 Week 7 deliverables (Noor)</w:t>
+      </w:r>
+    </w:p>
+    <w:tbl>
+      <w:tblPr>
+        <w:tblStyle w:val="TableGrid"/>
+        <w:tblW w:type="auto" w:w="0"/>
+        <w:tblLayout w:type="autofit"/>
+        <w:tblLook w:firstColumn="1" w:firstRow="1" w:lastColumn="0" w:lastRow="0" w:noHBand="0" w:noVBand="1" w:val="04A0"/>
+      </w:tblPr>
+      <w:tblGrid>
+        <w:gridCol w:w="3168"/>
+        <w:gridCol w:w="3168"/>
+        <w:gridCol w:w="3168"/>
+      </w:tblGrid>
+      <w:tr>
+        <w:tc>
+          <w:tcPr>
+            <w:tcW w:type="dxa" w:w="3168"/>
+            <w:shd w:fill="1E3A5F" w:val="clear"/>
+          </w:tcPr>
+          <w:p>
+            <w:pPr>
+              <w:spacing w:before="60" w:after="60"/>
+            </w:pPr>
+            <w:r/>
+            <w:r>
+              <w:rPr>
+                <w:rFonts w:ascii="Calibri" w:hAnsi="Calibri" w:eastAsia="Calibri"/>
+                <w:b/>
+                <w:color w:val="FFFFFF"/>
+                <w:sz w:val="20"/>
+              </w:rPr>
+              <w:t>Item</w:t>
+            </w:r>
+          </w:p>
+        </w:tc>
+        <w:tc>
+          <w:tcPr>
+            <w:tcW w:type="dxa" w:w="3168"/>
+            <w:shd w:fill="1E3A5F" w:val="clear"/>
+          </w:tcPr>
+          <w:p>
+            <w:pPr>
+              <w:spacing w:before="60" w:after="60"/>
+            </w:pPr>
+            <w:r/>
+            <w:r>
+              <w:rPr>
+                <w:rFonts w:ascii="Calibri" w:hAnsi="Calibri" w:eastAsia="Calibri"/>
+                <w:b/>
+                <w:color w:val="FFFFFF"/>
+                <w:sz w:val="20"/>
+              </w:rPr>
+              <w:t>Path</w:t>
+            </w:r>
+          </w:p>
+        </w:tc>
+        <w:tc>
+          <w:tcPr>
+            <w:tcW w:type="dxa" w:w="3168"/>
+            <w:shd w:fill="1E3A5F" w:val="clear"/>
+          </w:tcPr>
+          <w:p>
+            <w:pPr>
+              <w:spacing w:before="60" w:after="60"/>
+            </w:pPr>
+            <w:r/>
+            <w:r>
+              <w:rPr>
+                <w:rFonts w:ascii="Calibri" w:hAnsi="Calibri" w:eastAsia="Calibri"/>
+                <w:b/>
+                <w:color w:val="FFFFFF"/>
+                <w:sz w:val="20"/>
+              </w:rPr>
+              <w:t>Status</w:t>
+            </w:r>
+          </w:p>
+        </w:tc>
+      </w:tr>
+      <w:tr>
+        <w:tc>
+          <w:tcPr>
+            <w:tcW w:type="dxa" w:w="3168"/>
+          </w:tcPr>
+          <w:p>
+            <w:pPr>
+              <w:spacing w:before="60" w:after="60"/>
+            </w:pPr>
+            <w:r/>
+            <w:r>
+              <w:rPr>
+                <w:rFonts w:ascii="Calibri" w:hAnsi="Calibri" w:eastAsia="Calibri"/>
+                <w:b w:val="0"/>
+                <w:sz w:val="20"/>
+              </w:rPr>
+              <w:t>Per-screen results (violations, score, R01–R30 counts)</w:t>
+            </w:r>
+          </w:p>
+        </w:tc>
+        <w:tc>
+          <w:tcPr>
+            <w:tcW w:type="dxa" w:w="3168"/>
+          </w:tcPr>
+          <w:p>
+            <w:pPr>
+              <w:spacing w:before="60" w:after="60"/>
+            </w:pPr>
+            <w:r/>
+            <w:r>
+              <w:rPr>
+                <w:rFonts w:ascii="Consolas" w:hAnsi="Consolas" w:eastAsia="Consolas"/>
+                <w:b w:val="0"/>
+                <w:color w:val="1E3A5F"/>
+                <w:sz w:val="18"/>
+              </w:rPr>
+              <w:t>outputs/week7_eval/per_screen_results.csv</w:t>
+            </w:r>
+          </w:p>
+        </w:tc>
+        <w:tc>
+          <w:tcPr>
+            <w:tcW w:type="dxa" w:w="3168"/>
+          </w:tcPr>
+          <w:p>
+            <w:pPr>
+              <w:spacing w:before="60" w:after="60"/>
+            </w:pPr>
+            <w:r/>
+            <w:r>
+              <w:rPr>
+                <w:rFonts w:ascii="Calibri" w:hAnsi="Calibri" w:eastAsia="Calibri"/>
+                <w:b w:val="0"/>
+                <w:sz w:val="20"/>
+              </w:rPr>
+              <w:t>Done</w:t>
+            </w:r>
+          </w:p>
+        </w:tc>
+      </w:tr>
+      <w:tr>
+        <w:tc>
+          <w:tcPr>
+            <w:tcW w:type="dxa" w:w="3168"/>
+          </w:tcPr>
+          <w:p>
+            <w:pPr>
+              <w:spacing w:before="60" w:after="60"/>
+            </w:pPr>
+            <w:r/>
+            <w:r>
+              <w:rPr>
+                <w:rFonts w:ascii="Calibri" w:hAnsi="Calibri" w:eastAsia="Calibri"/>
+                <w:b w:val="0"/>
+                <w:sz w:val="20"/>
+              </w:rPr>
+              <w:t>Rule-wise summary R01–R30</w:t>
+            </w:r>
+          </w:p>
+        </w:tc>
+        <w:tc>
+          <w:tcPr>
+            <w:tcW w:type="dxa" w:w="3168"/>
+          </w:tcPr>
+          <w:p>
+            <w:pPr>
+              <w:spacing w:before="60" w:after="60"/>
+            </w:pPr>
+            <w:r/>
+            <w:r>
+              <w:rPr>
+                <w:rFonts w:ascii="Consolas" w:hAnsi="Consolas" w:eastAsia="Consolas"/>
+                <w:b w:val="0"/>
+                <w:color w:val="1E3A5F"/>
+                <w:sz w:val="18"/>
+              </w:rPr>
+              <w:t>docs/week7/rule_summary.md</w:t>
+            </w:r>
+            <w:r>
+              <w:rPr>
+                <w:rFonts w:ascii="Calibri" w:hAnsi="Calibri" w:eastAsia="Calibri"/>
+                <w:b w:val="0"/>
+                <w:sz w:val="20"/>
+              </w:rPr>
+              <w:t xml:space="preserve"> + CSV</w:t>
+            </w:r>
+          </w:p>
+        </w:tc>
+        <w:tc>
+          <w:tcPr>
+            <w:tcW w:type="dxa" w:w="3168"/>
+          </w:tcPr>
+          <w:p>
+            <w:pPr>
+              <w:spacing w:before="60" w:after="60"/>
+            </w:pPr>
+            <w:r/>
+            <w:r>
+              <w:rPr>
+                <w:rFonts w:ascii="Calibri" w:hAnsi="Calibri" w:eastAsia="Calibri"/>
+                <w:b w:val="0"/>
+                <w:sz w:val="20"/>
+              </w:rPr>
+              <w:t>Done</w:t>
+            </w:r>
+          </w:p>
+        </w:tc>
+      </w:tr>
+      <w:tr>
+        <w:tc>
+          <w:tcPr>
+            <w:tcW w:type="dxa" w:w="3168"/>
+          </w:tcPr>
+          <w:p>
+            <w:pPr>
+              <w:spacing w:before="60" w:after="60"/>
+            </w:pPr>
+            <w:r/>
+            <w:r>
+              <w:rPr>
+                <w:rFonts w:ascii="Calibri" w:hAnsi="Calibri" w:eastAsia="Calibri"/>
+                <w:b w:val="0"/>
+                <w:sz w:val="20"/>
+              </w:rPr>
+              <w:t>Guideline coverage G01–G30</w:t>
+            </w:r>
+          </w:p>
+        </w:tc>
+        <w:tc>
+          <w:tcPr>
+            <w:tcW w:type="dxa" w:w="3168"/>
+          </w:tcPr>
+          <w:p>
+            <w:pPr>
+              <w:spacing w:before="60" w:after="60"/>
+            </w:pPr>
+            <w:r/>
+            <w:r>
+              <w:rPr>
+                <w:rFonts w:ascii="Consolas" w:hAnsi="Consolas" w:eastAsia="Consolas"/>
+                <w:b w:val="0"/>
+                <w:color w:val="1E3A5F"/>
+                <w:sz w:val="18"/>
+              </w:rPr>
+              <w:t>docs/week7/guideline_summary.md</w:t>
+            </w:r>
+            <w:r>
+              <w:rPr>
+                <w:rFonts w:ascii="Calibri" w:hAnsi="Calibri" w:eastAsia="Calibri"/>
+                <w:b w:val="0"/>
+                <w:sz w:val="20"/>
+              </w:rPr>
+              <w:t xml:space="preserve"> + CSV</w:t>
+            </w:r>
+          </w:p>
+        </w:tc>
+        <w:tc>
+          <w:tcPr>
+            <w:tcW w:type="dxa" w:w="3168"/>
+          </w:tcPr>
+          <w:p>
+            <w:pPr>
+              <w:spacing w:before="60" w:after="60"/>
+            </w:pPr>
+            <w:r/>
+            <w:r>
+              <w:rPr>
+                <w:rFonts w:ascii="Calibri" w:hAnsi="Calibri" w:eastAsia="Calibri"/>
+                <w:b w:val="0"/>
+                <w:sz w:val="20"/>
+              </w:rPr>
+              <w:t>Done</w:t>
+            </w:r>
+          </w:p>
+        </w:tc>
+      </w:tr>
+      <w:tr>
+        <w:tc>
+          <w:tcPr>
+            <w:tcW w:type="dxa" w:w="3168"/>
+          </w:tcPr>
+          <w:p>
+            <w:pPr>
+              <w:spacing w:before="60" w:after="60"/>
+            </w:pPr>
+            <w:r/>
+            <w:r>
+              <w:rPr>
+                <w:rFonts w:ascii="Calibri" w:hAnsi="Calibri" w:eastAsia="Calibri"/>
+                <w:b w:val="0"/>
+                <w:sz w:val="20"/>
+              </w:rPr>
+              <w:t>QA notes (FP / miss / Week 7 vs 8)</w:t>
+            </w:r>
+          </w:p>
+        </w:tc>
+        <w:tc>
+          <w:tcPr>
+            <w:tcW w:type="dxa" w:w="3168"/>
+          </w:tcPr>
+          <w:p>
+            <w:pPr>
+              <w:spacing w:before="60" w:after="60"/>
+            </w:pPr>
+            <w:r/>
+            <w:r>
+              <w:rPr>
+                <w:rFonts w:ascii="Consolas" w:hAnsi="Consolas" w:eastAsia="Consolas"/>
+                <w:b w:val="0"/>
+                <w:color w:val="1E3A5F"/>
+                <w:sz w:val="18"/>
+              </w:rPr>
+              <w:t>docs/week7/qa_notes.md</w:t>
+            </w:r>
+          </w:p>
+        </w:tc>
+        <w:tc>
+          <w:tcPr>
+            <w:tcW w:type="dxa" w:w="3168"/>
+          </w:tcPr>
+          <w:p>
+            <w:pPr>
+              <w:spacing w:before="60" w:after="60"/>
+            </w:pPr>
+            <w:r/>
+            <w:r>
+              <w:rPr>
+                <w:rFonts w:ascii="Calibri" w:hAnsi="Calibri" w:eastAsia="Calibri"/>
+                <w:b w:val="0"/>
+                <w:sz w:val="20"/>
+              </w:rPr>
+              <w:t>Done</w:t>
+            </w:r>
+          </w:p>
+        </w:tc>
+      </w:tr>
+      <w:tr>
+        <w:tc>
+          <w:tcPr>
+            <w:tcW w:type="dxa" w:w="3168"/>
+          </w:tcPr>
+          <w:p>
+            <w:pPr>
+              <w:spacing w:before="60" w:after="60"/>
+            </w:pPr>
+            <w:r/>
+            <w:r>
+              <w:rPr>
+                <w:rFonts w:ascii="Calibri" w:hAnsi="Calibri" w:eastAsia="Calibri"/>
+                <w:b w:val="0"/>
+                <w:sz w:val="20"/>
+              </w:rPr>
+              <w:t>Week 6 cross-check</w:t>
+            </w:r>
+          </w:p>
+        </w:tc>
+        <w:tc>
+          <w:tcPr>
+            <w:tcW w:type="dxa" w:w="3168"/>
+          </w:tcPr>
+          <w:p>
+            <w:pPr>
+              <w:spacing w:before="60" w:after="60"/>
+            </w:pPr>
+            <w:r/>
+            <w:r>
+              <w:rPr>
+                <w:rFonts w:ascii="Consolas" w:hAnsi="Consolas" w:eastAsia="Consolas"/>
+                <w:b w:val="0"/>
+                <w:color w:val="1E3A5F"/>
+                <w:sz w:val="18"/>
+              </w:rPr>
+              <w:t>docs/week7/week6_crosscheck.md</w:t>
+            </w:r>
+          </w:p>
+        </w:tc>
+        <w:tc>
+          <w:tcPr>
+            <w:tcW w:type="dxa" w:w="3168"/>
+          </w:tcPr>
+          <w:p>
+            <w:pPr>
+              <w:spacing w:before="60" w:after="60"/>
+            </w:pPr>
+            <w:r/>
+            <w:r>
+              <w:rPr>
+                <w:rFonts w:ascii="Calibri" w:hAnsi="Calibri" w:eastAsia="Calibri"/>
+                <w:b w:val="0"/>
+                <w:sz w:val="20"/>
+              </w:rPr>
+              <w:t>Done</w:t>
+            </w:r>
+          </w:p>
+        </w:tc>
+      </w:tr>
+      <w:tr>
+        <w:tc>
+          <w:tcPr>
+            <w:tcW w:type="dxa" w:w="3168"/>
+          </w:tcPr>
+          <w:p>
+            <w:pPr>
+              <w:spacing w:before="60" w:after="60"/>
+            </w:pPr>
+            <w:r/>
+            <w:r>
+              <w:rPr>
+                <w:rFonts w:ascii="Calibri" w:hAnsi="Calibri" w:eastAsia="Calibri"/>
+                <w:b w:val="0"/>
+                <w:sz w:val="20"/>
+              </w:rPr>
+              <w:t>Team priorities (Salar/Ayesha)</w:t>
+            </w:r>
+          </w:p>
+        </w:tc>
+        <w:tc>
+          <w:tcPr>
+            <w:tcW w:type="dxa" w:w="3168"/>
+          </w:tcPr>
+          <w:p>
+            <w:pPr>
+              <w:spacing w:before="60" w:after="60"/>
+            </w:pPr>
+            <w:r/>
+            <w:r>
+              <w:rPr>
+                <w:rFonts w:ascii="Consolas" w:hAnsi="Consolas" w:eastAsia="Consolas"/>
+                <w:b w:val="0"/>
+                <w:color w:val="1E3A5F"/>
+                <w:sz w:val="18"/>
+              </w:rPr>
+              <w:t>docs/week7/team_priority_fixes.md</w:t>
+            </w:r>
+          </w:p>
+        </w:tc>
+        <w:tc>
+          <w:tcPr>
+            <w:tcW w:type="dxa" w:w="3168"/>
+          </w:tcPr>
+          <w:p>
+            <w:pPr>
+              <w:spacing w:before="60" w:after="60"/>
+            </w:pPr>
+            <w:r/>
+            <w:r>
+              <w:rPr>
+                <w:rFonts w:ascii="Calibri" w:hAnsi="Calibri" w:eastAsia="Calibri"/>
+                <w:b w:val="0"/>
+                <w:sz w:val="20"/>
+              </w:rPr>
+              <w:t>Done</w:t>
+            </w:r>
+          </w:p>
+        </w:tc>
+      </w:tr>
+      <w:tr>
+        <w:tc>
+          <w:tcPr>
+            <w:tcW w:type="dxa" w:w="3168"/>
+          </w:tcPr>
+          <w:p>
+            <w:pPr>
+              <w:spacing w:before="60" w:after="60"/>
+            </w:pPr>
+            <w:r/>
+            <w:r>
+              <w:rPr>
+                <w:rFonts w:ascii="Calibri" w:hAnsi="Calibri" w:eastAsia="Calibri"/>
+                <w:b w:val="0"/>
+                <w:sz w:val="20"/>
+              </w:rPr>
+              <w:t>Validation</w:t>
+            </w:r>
+          </w:p>
+        </w:tc>
+        <w:tc>
+          <w:tcPr>
+            <w:tcW w:type="dxa" w:w="3168"/>
+          </w:tcPr>
+          <w:p>
+            <w:pPr>
+              <w:spacing w:before="60" w:after="60"/>
+            </w:pPr>
+            <w:r/>
+            <w:r>
+              <w:rPr>
+                <w:rFonts w:ascii="Consolas" w:hAnsi="Consolas" w:eastAsia="Consolas"/>
+                <w:b w:val="0"/>
+                <w:color w:val="1E3A5F"/>
+                <w:sz w:val="18"/>
+              </w:rPr>
+              <w:t>scripts/noor_week7_validate.py</w:t>
+            </w:r>
+          </w:p>
+        </w:tc>
+        <w:tc>
+          <w:tcPr>
+            <w:tcW w:type="dxa" w:w="3168"/>
+          </w:tcPr>
+          <w:p>
+            <w:pPr>
+              <w:spacing w:before="60" w:after="60"/>
+            </w:pPr>
+            <w:r/>
+            <w:r>
+              <w:rPr>
+                <w:rFonts w:ascii="Calibri" w:hAnsi="Calibri" w:eastAsia="Calibri"/>
+                <w:b w:val="0"/>
+                <w:sz w:val="20"/>
+              </w:rPr>
+              <w:t>PASS (20 Jul)</w:t>
+            </w:r>
+          </w:p>
+        </w:tc>
+      </w:tr>
+      <w:tr>
+        <w:tc>
+          <w:tcPr>
+            <w:tcW w:type="dxa" w:w="3168"/>
+          </w:tcPr>
+          <w:p>
+            <w:pPr>
+              <w:spacing w:before="60" w:after="60"/>
+            </w:pPr>
+            <w:r/>
+            <w:r>
+              <w:rPr>
+                <w:rFonts w:ascii="Calibri" w:hAnsi="Calibri" w:eastAsia="Calibri"/>
+                <w:b w:val="0"/>
+                <w:sz w:val="20"/>
+              </w:rPr>
+              <w:t>Rico holdout batch</w:t>
+            </w:r>
+          </w:p>
+        </w:tc>
+        <w:tc>
+          <w:tcPr>
+            <w:tcW w:type="dxa" w:w="3168"/>
+          </w:tcPr>
+          <w:p>
+            <w:pPr>
+              <w:spacing w:before="60" w:after="60"/>
+            </w:pPr>
+            <w:r/>
+            <w:r>
+              <w:rPr>
+                <w:rFonts w:ascii="Consolas" w:hAnsi="Consolas" w:eastAsia="Consolas"/>
+                <w:b w:val="0"/>
+                <w:color w:val="1E3A5F"/>
+                <w:sz w:val="18"/>
+              </w:rPr>
+              <w:t>scripts/run_rico_holdout_eval.py</w:t>
+            </w:r>
+          </w:p>
+        </w:tc>
+        <w:tc>
+          <w:tcPr>
+            <w:tcW w:type="dxa" w:w="3168"/>
+          </w:tcPr>
+          <w:p>
+            <w:pPr>
+              <w:spacing w:before="60" w:after="60"/>
+            </w:pPr>
+            <w:r/>
+            <w:r>
+              <w:rPr>
+                <w:rFonts w:ascii="Calibri" w:hAnsi="Calibri" w:eastAsia="Calibri"/>
+                <w:b/>
+                <w:sz w:val="20"/>
+              </w:rPr>
+              <w:t>Deferred</w:t>
+            </w:r>
+          </w:p>
+        </w:tc>
+      </w:tr>
+    </w:tbl>
+    <w:p/>
+    <w:p>
+      <w:pPr>
+        <w:pStyle w:val="Heading3"/>
+      </w:pPr>
+      <w:r>
+        <w:t>15B.2 Key metrics (MASC n=40)</w:t>
+      </w:r>
+    </w:p>
+    <w:tbl>
+      <w:tblPr>
+        <w:tblStyle w:val="TableGrid"/>
+        <w:tblW w:type="auto" w:w="0"/>
+        <w:tblLayout w:type="autofit"/>
+        <w:tblLook w:firstColumn="1" w:firstRow="1" w:lastColumn="0" w:lastRow="0" w:noHBand="0" w:noVBand="1" w:val="04A0"/>
+      </w:tblPr>
+      <w:tblGrid>
+        <w:gridCol w:w="4752"/>
+        <w:gridCol w:w="4752"/>
+      </w:tblGrid>
+      <w:tr>
+        <w:tc>
+          <w:tcPr>
+            <w:tcW w:type="dxa" w:w="4752"/>
+            <w:shd w:fill="1E3A5F" w:val="clear"/>
+          </w:tcPr>
+          <w:p>
+            <w:pPr>
+              <w:spacing w:before="60" w:after="60"/>
+            </w:pPr>
+            <w:r/>
+            <w:r>
+              <w:rPr>
+                <w:rFonts w:ascii="Calibri" w:hAnsi="Calibri" w:eastAsia="Calibri"/>
+                <w:b/>
+                <w:color w:val="FFFFFF"/>
+                <w:sz w:val="20"/>
+              </w:rPr>
+              <w:t>Metric</w:t>
+            </w:r>
+          </w:p>
+        </w:tc>
+        <w:tc>
+          <w:tcPr>
+            <w:tcW w:type="dxa" w:w="4752"/>
+            <w:shd w:fill="1E3A5F" w:val="clear"/>
+          </w:tcPr>
+          <w:p>
+            <w:pPr>
+              <w:spacing w:before="60" w:after="60"/>
+            </w:pPr>
+            <w:r/>
+            <w:r>
+              <w:rPr>
+                <w:rFonts w:ascii="Calibri" w:hAnsi="Calibri" w:eastAsia="Calibri"/>
+                <w:b/>
+                <w:color w:val="FFFFFF"/>
+                <w:sz w:val="20"/>
+              </w:rPr>
+              <w:t>Value</w:t>
+            </w:r>
+          </w:p>
+        </w:tc>
+      </w:tr>
+      <w:tr>
+        <w:tc>
+          <w:tcPr>
+            <w:tcW w:type="dxa" w:w="4752"/>
+          </w:tcPr>
+          <w:p>
+            <w:pPr>
+              <w:spacing w:before="60" w:after="60"/>
+            </w:pPr>
+            <w:r/>
+            <w:r>
+              <w:rPr>
+                <w:rFonts w:ascii="Calibri" w:hAnsi="Calibri" w:eastAsia="Calibri"/>
+                <w:b w:val="0"/>
+                <w:sz w:val="20"/>
+              </w:rPr>
+              <w:t>Screens evaluated</w:t>
+            </w:r>
+          </w:p>
+        </w:tc>
+        <w:tc>
+          <w:tcPr>
+            <w:tcW w:type="dxa" w:w="4752"/>
+          </w:tcPr>
+          <w:p>
+            <w:pPr>
+              <w:spacing w:before="60" w:after="60"/>
+            </w:pPr>
+            <w:r/>
+            <w:r>
+              <w:rPr>
+                <w:rFonts w:ascii="Calibri" w:hAnsi="Calibri" w:eastAsia="Calibri"/>
+                <w:b w:val="0"/>
+                <w:sz w:val="20"/>
+              </w:rPr>
+              <w:t>40</w:t>
+            </w:r>
+          </w:p>
+        </w:tc>
+      </w:tr>
+      <w:tr>
+        <w:tc>
+          <w:tcPr>
+            <w:tcW w:type="dxa" w:w="4752"/>
+          </w:tcPr>
+          <w:p>
+            <w:pPr>
+              <w:spacing w:before="60" w:after="60"/>
+            </w:pPr>
+            <w:r/>
+            <w:r>
+              <w:rPr>
+                <w:rFonts w:ascii="Calibri" w:hAnsi="Calibri" w:eastAsia="Calibri"/>
+                <w:b w:val="0"/>
+                <w:sz w:val="20"/>
+              </w:rPr>
+              <w:t>Failures</w:t>
+            </w:r>
+          </w:p>
+        </w:tc>
+        <w:tc>
+          <w:tcPr>
+            <w:tcW w:type="dxa" w:w="4752"/>
+          </w:tcPr>
+          <w:p>
+            <w:pPr>
+              <w:spacing w:before="60" w:after="60"/>
+            </w:pPr>
+            <w:r/>
+            <w:r>
+              <w:rPr>
+                <w:rFonts w:ascii="Calibri" w:hAnsi="Calibri" w:eastAsia="Calibri"/>
+                <w:b w:val="0"/>
+                <w:sz w:val="20"/>
+              </w:rPr>
+              <w:t>0</w:t>
+            </w:r>
+          </w:p>
+        </w:tc>
+      </w:tr>
+      <w:tr>
+        <w:tc>
+          <w:tcPr>
+            <w:tcW w:type="dxa" w:w="4752"/>
+          </w:tcPr>
+          <w:p>
+            <w:pPr>
+              <w:spacing w:before="60" w:after="60"/>
+            </w:pPr>
+            <w:r/>
+            <w:r>
+              <w:rPr>
+                <w:rFonts w:ascii="Calibri" w:hAnsi="Calibri" w:eastAsia="Calibri"/>
+                <w:b w:val="0"/>
+                <w:sz w:val="20"/>
+              </w:rPr>
+              <w:t>Mean violations / screen</w:t>
+            </w:r>
+          </w:p>
+        </w:tc>
+        <w:tc>
+          <w:tcPr>
+            <w:tcW w:type="dxa" w:w="4752"/>
+          </w:tcPr>
+          <w:p>
+            <w:pPr>
+              <w:spacing w:before="60" w:after="60"/>
+            </w:pPr>
+            <w:r/>
+            <w:r>
+              <w:rPr>
+                <w:rFonts w:ascii="Calibri" w:hAnsi="Calibri" w:eastAsia="Calibri"/>
+                <w:b w:val="0"/>
+                <w:sz w:val="20"/>
+              </w:rPr>
+              <w:t>64.3</w:t>
+            </w:r>
+          </w:p>
+        </w:tc>
+      </w:tr>
+      <w:tr>
+        <w:tc>
+          <w:tcPr>
+            <w:tcW w:type="dxa" w:w="4752"/>
+          </w:tcPr>
+          <w:p>
+            <w:pPr>
+              <w:spacing w:before="60" w:after="60"/>
+            </w:pPr>
+            <w:r/>
+            <w:r>
+              <w:rPr>
+                <w:rFonts w:ascii="Calibri" w:hAnsi="Calibri" w:eastAsia="Calibri"/>
+                <w:b w:val="0"/>
+                <w:sz w:val="20"/>
+              </w:rPr>
+              <w:t>Median violations / screen</w:t>
+            </w:r>
+          </w:p>
+        </w:tc>
+        <w:tc>
+          <w:tcPr>
+            <w:tcW w:type="dxa" w:w="4752"/>
+          </w:tcPr>
+          <w:p>
+            <w:pPr>
+              <w:spacing w:before="60" w:after="60"/>
+            </w:pPr>
+            <w:r/>
+            <w:r>
+              <w:rPr>
+                <w:rFonts w:ascii="Calibri" w:hAnsi="Calibri" w:eastAsia="Calibri"/>
+                <w:b w:val="0"/>
+                <w:sz w:val="20"/>
+              </w:rPr>
+              <w:t>42</w:t>
+            </w:r>
+          </w:p>
+        </w:tc>
+      </w:tr>
+      <w:tr>
+        <w:tc>
+          <w:tcPr>
+            <w:tcW w:type="dxa" w:w="4752"/>
+          </w:tcPr>
+          <w:p>
+            <w:pPr>
+              <w:spacing w:before="60" w:after="60"/>
+            </w:pPr>
+            <w:r/>
+            <w:r>
+              <w:rPr>
+                <w:rFonts w:ascii="Calibri" w:hAnsi="Calibri" w:eastAsia="Calibri"/>
+                <w:b w:val="0"/>
+                <w:sz w:val="20"/>
+              </w:rPr>
+              <w:t>Mean accessibility score</w:t>
+            </w:r>
+          </w:p>
+        </w:tc>
+        <w:tc>
+          <w:tcPr>
+            <w:tcW w:type="dxa" w:w="4752"/>
+          </w:tcPr>
+          <w:p>
+            <w:pPr>
+              <w:spacing w:before="60" w:after="60"/>
+            </w:pPr>
+            <w:r/>
+            <w:r>
+              <w:rPr>
+                <w:rFonts w:ascii="Calibri" w:hAnsi="Calibri" w:eastAsia="Calibri"/>
+                <w:b w:val="0"/>
+                <w:sz w:val="20"/>
+              </w:rPr>
+              <w:t>6.8</w:t>
+            </w:r>
+          </w:p>
+        </w:tc>
+      </w:tr>
+      <w:tr>
+        <w:tc>
+          <w:tcPr>
+            <w:tcW w:type="dxa" w:w="4752"/>
+          </w:tcPr>
+          <w:p>
+            <w:pPr>
+              <w:spacing w:before="60" w:after="60"/>
+            </w:pPr>
+            <w:r/>
+            <w:r>
+              <w:rPr>
+                <w:rFonts w:ascii="Calibri" w:hAnsi="Calibri" w:eastAsia="Calibri"/>
+                <w:b w:val="0"/>
+                <w:sz w:val="20"/>
+              </w:rPr>
+              <w:t>Manual mostly_agree</w:t>
+            </w:r>
+          </w:p>
+        </w:tc>
+        <w:tc>
+          <w:tcPr>
+            <w:tcW w:type="dxa" w:w="4752"/>
+          </w:tcPr>
+          <w:p>
+            <w:pPr>
+              <w:spacing w:before="60" w:after="60"/>
+            </w:pPr>
+            <w:r/>
+            <w:r>
+              <w:rPr>
+                <w:rFonts w:ascii="Calibri" w:hAnsi="Calibri" w:eastAsia="Calibri"/>
+                <w:b w:val="0"/>
+                <w:sz w:val="20"/>
+              </w:rPr>
+              <w:t>32</w:t>
+            </w:r>
+          </w:p>
+        </w:tc>
+      </w:tr>
+      <w:tr>
+        <w:tc>
+          <w:tcPr>
+            <w:tcW w:type="dxa" w:w="4752"/>
+          </w:tcPr>
+          <w:p>
+            <w:pPr>
+              <w:spacing w:before="60" w:after="60"/>
+            </w:pPr>
+            <w:r/>
+            <w:r>
+              <w:rPr>
+                <w:rFonts w:ascii="Calibri" w:hAnsi="Calibri" w:eastAsia="Calibri"/>
+                <w:b w:val="0"/>
+                <w:sz w:val="20"/>
+              </w:rPr>
+              <w:t>Manual agree_clean</w:t>
+            </w:r>
+          </w:p>
+        </w:tc>
+        <w:tc>
+          <w:tcPr>
+            <w:tcW w:type="dxa" w:w="4752"/>
+          </w:tcPr>
+          <w:p>
+            <w:pPr>
+              <w:spacing w:before="60" w:after="60"/>
+            </w:pPr>
+            <w:r/>
+            <w:r>
+              <w:rPr>
+                <w:rFonts w:ascii="Calibri" w:hAnsi="Calibri" w:eastAsia="Calibri"/>
+                <w:b w:val="0"/>
+                <w:sz w:val="20"/>
+              </w:rPr>
+              <w:t>3</w:t>
+            </w:r>
+          </w:p>
+        </w:tc>
+      </w:tr>
+      <w:tr>
+        <w:tc>
+          <w:tcPr>
+            <w:tcW w:type="dxa" w:w="4752"/>
+          </w:tcPr>
+          <w:p>
+            <w:pPr>
+              <w:spacing w:before="60" w:after="60"/>
+            </w:pPr>
+            <w:r/>
+            <w:r>
+              <w:rPr>
+                <w:rFonts w:ascii="Calibri" w:hAnsi="Calibri" w:eastAsia="Calibri"/>
+                <w:b w:val="0"/>
+                <w:sz w:val="20"/>
+              </w:rPr>
+              <w:t>Manual over_flagging</w:t>
+            </w:r>
+          </w:p>
+        </w:tc>
+        <w:tc>
+          <w:tcPr>
+            <w:tcW w:type="dxa" w:w="4752"/>
+          </w:tcPr>
+          <w:p>
+            <w:pPr>
+              <w:spacing w:before="60" w:after="60"/>
+            </w:pPr>
+            <w:r/>
+            <w:r>
+              <w:rPr>
+                <w:rFonts w:ascii="Calibri" w:hAnsi="Calibri" w:eastAsia="Calibri"/>
+                <w:b w:val="0"/>
+                <w:sz w:val="20"/>
+              </w:rPr>
+              <w:t>2</w:t>
+            </w:r>
+          </w:p>
+        </w:tc>
+      </w:tr>
+      <w:tr>
+        <w:tc>
+          <w:tcPr>
+            <w:tcW w:type="dxa" w:w="4752"/>
+          </w:tcPr>
+          <w:p>
+            <w:pPr>
+              <w:spacing w:before="60" w:after="60"/>
+            </w:pPr>
+            <w:r/>
+            <w:r>
+              <w:rPr>
+                <w:rFonts w:ascii="Calibri" w:hAnsi="Calibri" w:eastAsia="Calibri"/>
+                <w:b w:val="0"/>
+                <w:sz w:val="20"/>
+              </w:rPr>
+              <w:t>Manual mixed_r30_noise</w:t>
+            </w:r>
+          </w:p>
+        </w:tc>
+        <w:tc>
+          <w:tcPr>
+            <w:tcW w:type="dxa" w:w="4752"/>
+          </w:tcPr>
+          <w:p>
+            <w:pPr>
+              <w:spacing w:before="60" w:after="60"/>
+            </w:pPr>
+            <w:r/>
+            <w:r>
+              <w:rPr>
+                <w:rFonts w:ascii="Calibri" w:hAnsi="Calibri" w:eastAsia="Calibri"/>
+                <w:b w:val="0"/>
+                <w:sz w:val="20"/>
+              </w:rPr>
+              <w:t>3</w:t>
+            </w:r>
+          </w:p>
+        </w:tc>
+      </w:tr>
+    </w:tbl>
+    <w:p/>
+    <w:p>
+      <w:pPr>
+        <w:pStyle w:val="Heading4"/>
+      </w:pPr>
+      <w:r>
+        <w:t>Top rules by violation count</w:t>
+      </w:r>
+    </w:p>
+    <w:tbl>
+      <w:tblPr>
+        <w:tblStyle w:val="TableGrid"/>
+        <w:tblW w:type="auto" w:w="0"/>
+        <w:tblLayout w:type="autofit"/>
+        <w:tblLook w:firstColumn="1" w:firstRow="1" w:lastColumn="0" w:lastRow="0" w:noHBand="0" w:noVBand="1" w:val="04A0"/>
+      </w:tblPr>
+      <w:tblGrid>
+        <w:gridCol w:w="3168"/>
+        <w:gridCol w:w="3168"/>
+        <w:gridCol w:w="3168"/>
+      </w:tblGrid>
+      <w:tr>
+        <w:tc>
+          <w:tcPr>
+            <w:tcW w:type="dxa" w:w="3168"/>
+            <w:shd w:fill="1E3A5F" w:val="clear"/>
+          </w:tcPr>
+          <w:p>
+            <w:pPr>
+              <w:spacing w:before="60" w:after="60"/>
+            </w:pPr>
+            <w:r/>
+            <w:r>
+              <w:rPr>
+                <w:rFonts w:ascii="Calibri" w:hAnsi="Calibri" w:eastAsia="Calibri"/>
+                <w:b/>
+                <w:color w:val="FFFFFF"/>
+                <w:sz w:val="20"/>
+              </w:rPr>
+              <w:t>Rule</w:t>
+            </w:r>
+          </w:p>
+        </w:tc>
+        <w:tc>
+          <w:tcPr>
+            <w:tcW w:type="dxa" w:w="3168"/>
+            <w:shd w:fill="1E3A5F" w:val="clear"/>
+          </w:tcPr>
+          <w:p>
+            <w:pPr>
+              <w:spacing w:before="60" w:after="60"/>
+            </w:pPr>
+            <w:r/>
+            <w:r>
+              <w:rPr>
+                <w:rFonts w:ascii="Calibri" w:hAnsi="Calibri" w:eastAsia="Calibri"/>
+                <w:b/>
+                <w:color w:val="FFFFFF"/>
+                <w:sz w:val="20"/>
+              </w:rPr>
+              <w:t>Violations</w:t>
+            </w:r>
+          </w:p>
+        </w:tc>
+        <w:tc>
+          <w:tcPr>
+            <w:tcW w:type="dxa" w:w="3168"/>
+            <w:shd w:fill="1E3A5F" w:val="clear"/>
+          </w:tcPr>
+          <w:p>
+            <w:pPr>
+              <w:spacing w:before="60" w:after="60"/>
+            </w:pPr>
+            <w:r/>
+            <w:r>
+              <w:rPr>
+                <w:rFonts w:ascii="Calibri" w:hAnsi="Calibri" w:eastAsia="Calibri"/>
+                <w:b/>
+                <w:color w:val="FFFFFF"/>
+                <w:sz w:val="20"/>
+              </w:rPr>
+              <w:t>Notes</w:t>
+            </w:r>
+          </w:p>
+        </w:tc>
+      </w:tr>
+      <w:tr>
+        <w:tc>
+          <w:tcPr>
+            <w:tcW w:type="dxa" w:w="3168"/>
+          </w:tcPr>
+          <w:p>
+            <w:pPr>
+              <w:spacing w:before="60" w:after="60"/>
+            </w:pPr>
+            <w:r/>
+            <w:r>
+              <w:rPr>
+                <w:rFonts w:ascii="Calibri" w:hAnsi="Calibri" w:eastAsia="Calibri"/>
+                <w:b w:val="0"/>
+                <w:sz w:val="20"/>
+              </w:rPr>
+              <w:t>R07</w:t>
+            </w:r>
+          </w:p>
+        </w:tc>
+        <w:tc>
+          <w:tcPr>
+            <w:tcW w:type="dxa" w:w="3168"/>
+          </w:tcPr>
+          <w:p>
+            <w:pPr>
+              <w:spacing w:before="60" w:after="60"/>
+            </w:pPr>
+            <w:r/>
+            <w:r>
+              <w:rPr>
+                <w:rFonts w:ascii="Calibri" w:hAnsi="Calibri" w:eastAsia="Calibri"/>
+                <w:b w:val="0"/>
+                <w:sz w:val="20"/>
+              </w:rPr>
+              <w:t>1127</w:t>
+            </w:r>
+          </w:p>
+        </w:tc>
+        <w:tc>
+          <w:tcPr>
+            <w:tcW w:type="dxa" w:w="3168"/>
+          </w:tcPr>
+          <w:p>
+            <w:pPr>
+              <w:spacing w:before="60" w:after="60"/>
+            </w:pPr>
+            <w:r/>
+            <w:r>
+              <w:rPr>
+                <w:rFonts w:ascii="Calibri" w:hAnsi="Calibri" w:eastAsia="Calibri"/>
+                <w:b w:val="0"/>
+                <w:sz w:val="20"/>
+              </w:rPr>
+              <w:t>100% of screens — primary FP cluster (nesting/zero-size)</w:t>
+            </w:r>
+          </w:p>
+        </w:tc>
+      </w:tr>
+      <w:tr>
+        <w:tc>
+          <w:tcPr>
+            <w:tcW w:type="dxa" w:w="3168"/>
+          </w:tcPr>
+          <w:p>
+            <w:pPr>
+              <w:spacing w:before="60" w:after="60"/>
+            </w:pPr>
+            <w:r/>
+            <w:r>
+              <w:rPr>
+                <w:rFonts w:ascii="Calibri" w:hAnsi="Calibri" w:eastAsia="Calibri"/>
+                <w:b w:val="0"/>
+                <w:sz w:val="20"/>
+              </w:rPr>
+              <w:t>R08</w:t>
+            </w:r>
+          </w:p>
+        </w:tc>
+        <w:tc>
+          <w:tcPr>
+            <w:tcW w:type="dxa" w:w="3168"/>
+          </w:tcPr>
+          <w:p>
+            <w:pPr>
+              <w:spacing w:before="60" w:after="60"/>
+            </w:pPr>
+            <w:r/>
+            <w:r>
+              <w:rPr>
+                <w:rFonts w:ascii="Calibri" w:hAnsi="Calibri" w:eastAsia="Calibri"/>
+                <w:b w:val="0"/>
+                <w:sz w:val="20"/>
+              </w:rPr>
+              <w:t>629</w:t>
+            </w:r>
+          </w:p>
+        </w:tc>
+        <w:tc>
+          <w:tcPr>
+            <w:tcW w:type="dxa" w:w="3168"/>
+          </w:tcPr>
+          <w:p>
+            <w:pPr>
+              <w:spacing w:before="60" w:after="60"/>
+            </w:pPr>
+            <w:r/>
+            <w:r>
+              <w:rPr>
+                <w:rFonts w:ascii="Calibri" w:hAnsi="Calibri" w:eastAsia="Calibri"/>
+                <w:b w:val="0"/>
+                <w:sz w:val="20"/>
+              </w:rPr>
+              <w:t>60% of screens — overlap pairs</w:t>
+            </w:r>
+          </w:p>
+        </w:tc>
+      </w:tr>
+      <w:tr>
+        <w:tc>
+          <w:tcPr>
+            <w:tcW w:type="dxa" w:w="3168"/>
+          </w:tcPr>
+          <w:p>
+            <w:pPr>
+              <w:spacing w:before="60" w:after="60"/>
+            </w:pPr>
+            <w:r/>
+            <w:r>
+              <w:rPr>
+                <w:rFonts w:ascii="Calibri" w:hAnsi="Calibri" w:eastAsia="Calibri"/>
+                <w:b w:val="0"/>
+                <w:sz w:val="20"/>
+              </w:rPr>
+              <w:t>R01</w:t>
+            </w:r>
+          </w:p>
+        </w:tc>
+        <w:tc>
+          <w:tcPr>
+            <w:tcW w:type="dxa" w:w="3168"/>
+          </w:tcPr>
+          <w:p>
+            <w:pPr>
+              <w:spacing w:before="60" w:after="60"/>
+            </w:pPr>
+            <w:r/>
+            <w:r>
+              <w:rPr>
+                <w:rFonts w:ascii="Calibri" w:hAnsi="Calibri" w:eastAsia="Calibri"/>
+                <w:b w:val="0"/>
+                <w:sz w:val="20"/>
+              </w:rPr>
+              <w:t>324</w:t>
+            </w:r>
+          </w:p>
+        </w:tc>
+        <w:tc>
+          <w:tcPr>
+            <w:tcW w:type="dxa" w:w="3168"/>
+          </w:tcPr>
+          <w:p>
+            <w:pPr>
+              <w:spacing w:before="60" w:after="60"/>
+            </w:pPr>
+            <w:r/>
+            <w:r>
+              <w:rPr>
+                <w:rFonts w:ascii="Calibri" w:hAnsi="Calibri" w:eastAsia="Calibri"/>
+                <w:b w:val="0"/>
+                <w:sz w:val="20"/>
+              </w:rPr>
+              <w:t>Missing labels — mix of real + decorative FP</w:t>
+            </w:r>
+          </w:p>
+        </w:tc>
+      </w:tr>
+      <w:tr>
+        <w:tc>
+          <w:tcPr>
+            <w:tcW w:type="dxa" w:w="3168"/>
+          </w:tcPr>
+          <w:p>
+            <w:pPr>
+              <w:spacing w:before="60" w:after="60"/>
+            </w:pPr>
+            <w:r/>
+            <w:r>
+              <w:rPr>
+                <w:rFonts w:ascii="Calibri" w:hAnsi="Calibri" w:eastAsia="Calibri"/>
+                <w:b w:val="0"/>
+                <w:sz w:val="20"/>
+              </w:rPr>
+              <w:t>R18</w:t>
+            </w:r>
+          </w:p>
+        </w:tc>
+        <w:tc>
+          <w:tcPr>
+            <w:tcW w:type="dxa" w:w="3168"/>
+          </w:tcPr>
+          <w:p>
+            <w:pPr>
+              <w:spacing w:before="60" w:after="60"/>
+            </w:pPr>
+            <w:r/>
+            <w:r>
+              <w:rPr>
+                <w:rFonts w:ascii="Calibri" w:hAnsi="Calibri" w:eastAsia="Calibri"/>
+                <w:b w:val="0"/>
+                <w:sz w:val="20"/>
+              </w:rPr>
+              <w:t>102</w:t>
+            </w:r>
+          </w:p>
+        </w:tc>
+        <w:tc>
+          <w:tcPr>
+            <w:tcW w:type="dxa" w:w="3168"/>
+          </w:tcPr>
+          <w:p>
+            <w:pPr>
+              <w:spacing w:before="60" w:after="60"/>
+            </w:pPr>
+            <w:r/>
+            <w:r>
+              <w:rPr>
+                <w:rFonts w:ascii="Calibri" w:hAnsi="Calibri" w:eastAsia="Calibri"/>
+                <w:b w:val="0"/>
+                <w:sz w:val="20"/>
+              </w:rPr>
+              <w:t>Multi-touch heuristic</w:t>
+            </w:r>
+          </w:p>
+        </w:tc>
+      </w:tr>
+      <w:tr>
+        <w:tc>
+          <w:tcPr>
+            <w:tcW w:type="dxa" w:w="3168"/>
+          </w:tcPr>
+          <w:p>
+            <w:pPr>
+              <w:spacing w:before="60" w:after="60"/>
+            </w:pPr>
+            <w:r/>
+            <w:r>
+              <w:rPr>
+                <w:rFonts w:ascii="Calibri" w:hAnsi="Calibri" w:eastAsia="Calibri"/>
+                <w:b w:val="0"/>
+                <w:sz w:val="20"/>
+              </w:rPr>
+              <w:t>R02</w:t>
+            </w:r>
+          </w:p>
+        </w:tc>
+        <w:tc>
+          <w:tcPr>
+            <w:tcW w:type="dxa" w:w="3168"/>
+          </w:tcPr>
+          <w:p>
+            <w:pPr>
+              <w:spacing w:before="60" w:after="60"/>
+            </w:pPr>
+            <w:r/>
+            <w:r>
+              <w:rPr>
+                <w:rFonts w:ascii="Calibri" w:hAnsi="Calibri" w:eastAsia="Calibri"/>
+                <w:b w:val="0"/>
+                <w:sz w:val="20"/>
+              </w:rPr>
+              <w:t>89</w:t>
+            </w:r>
+          </w:p>
+        </w:tc>
+        <w:tc>
+          <w:tcPr>
+            <w:tcW w:type="dxa" w:w="3168"/>
+          </w:tcPr>
+          <w:p>
+            <w:pPr>
+              <w:spacing w:before="60" w:after="60"/>
+            </w:pPr>
+            <w:r/>
+            <w:r>
+              <w:rPr>
+                <w:rFonts w:ascii="Calibri" w:hAnsi="Calibri" w:eastAsia="Calibri"/>
+                <w:b w:val="0"/>
+                <w:sz w:val="20"/>
+              </w:rPr>
+              <w:t>Image buttons without description</w:t>
+            </w:r>
+          </w:p>
+        </w:tc>
+      </w:tr>
+      <w:tr>
+        <w:tc>
+          <w:tcPr>
+            <w:tcW w:type="dxa" w:w="3168"/>
+          </w:tcPr>
+          <w:p>
+            <w:pPr>
+              <w:spacing w:before="60" w:after="60"/>
+            </w:pPr>
+            <w:r/>
+            <w:r>
+              <w:rPr>
+                <w:rFonts w:ascii="Calibri" w:hAnsi="Calibri" w:eastAsia="Calibri"/>
+                <w:b w:val="0"/>
+                <w:sz w:val="20"/>
+              </w:rPr>
+              <w:t>R30</w:t>
+            </w:r>
+          </w:p>
+        </w:tc>
+        <w:tc>
+          <w:tcPr>
+            <w:tcW w:type="dxa" w:w="3168"/>
+          </w:tcPr>
+          <w:p>
+            <w:pPr>
+              <w:spacing w:before="60" w:after="60"/>
+            </w:pPr>
+            <w:r/>
+            <w:r>
+              <w:rPr>
+                <w:rFonts w:ascii="Calibri" w:hAnsi="Calibri" w:eastAsia="Calibri"/>
+                <w:b w:val="0"/>
+                <w:sz w:val="20"/>
+              </w:rPr>
+              <w:t>89</w:t>
+            </w:r>
+          </w:p>
+        </w:tc>
+        <w:tc>
+          <w:tcPr>
+            <w:tcW w:type="dxa" w:w="3168"/>
+          </w:tcPr>
+          <w:p>
+            <w:pPr>
+              <w:spacing w:before="60" w:after="60"/>
+            </w:pPr>
+            <w:r/>
+            <w:r>
+              <w:rPr>
+                <w:rFonts w:ascii="Calibri" w:hAnsi="Calibri" w:eastAsia="Calibri"/>
+                <w:b w:val="0"/>
+                <w:sz w:val="20"/>
+              </w:rPr>
+              <w:t>Icon-only density — 3 manual mixed_r30_noise screens</w:t>
+            </w:r>
+          </w:p>
+        </w:tc>
+      </w:tr>
+    </w:tbl>
+    <w:p/>
+    <w:p>
+      <w:pPr>
+        <w:pStyle w:val="Heading4"/>
+      </w:pPr>
+      <w:r>
+        <w:t>Guidelines with zero hits in sample</w:t>
+      </w:r>
+    </w:p>
+    <w:p>
+      <w:r>
+        <w:rPr>
+          <w:rFonts w:ascii="Calibri" w:hAnsi="Calibri" w:eastAsia="Calibri"/>
+          <w:b w:val="0"/>
+          <w:sz w:val="22"/>
+        </w:rPr>
+        <w:t>G09, G10, G12, G13, G22, G27, G28, G29 — mostly media/CV/stretch rules not triggered on this XML sample.</w:t>
+      </w:r>
+    </w:p>
+    <w:p>
+      <w:pPr>
+        <w:pStyle w:val="Heading3"/>
+      </w:pPr>
+      <w:r>
+        <w:t>15B.3 Week 7 validation (20 Jul 2026)</w:t>
+      </w:r>
+    </w:p>
+    <w:p>
+      <w:pPr>
+        <w:spacing w:before="80" w:after="160"/>
+        <w:ind w:left="216"/>
+      </w:pPr>
+      <w:r>
+        <w:rPr>
+          <w:rFonts w:ascii="Consolas" w:hAnsi="Consolas" w:eastAsia="Consolas"/>
+          <w:b w:val="0"/>
+          <w:color w:val="1E3A5F"/>
+          <w:sz w:val="17"/>
+        </w:rPr>
+        <w:t>STEP 1: run_week7_eval_analysis.py  → 40 screens, 0 failures</w:t>
+        <w:br/>
+        <w:t>STEP 2: pytest tests/test_rules.py → PASS</w:t>
+        <w:br/>
+        <w:t>STEP 3: pytest backend/tests/test_auth.py → PASS</w:t>
+        <w:br/>
+        <w:t>STEP 4: pytest tests/test_audit.py → PASS</w:t>
+        <w:br/>
+        <w:t>STEP 5–6: week7_eval outputs + docs/week7 → PASS</w:t>
+        <w:br/>
+        <w:t>Overall → PASS</w:t>
+      </w:r>
+    </w:p>
+    <w:p>
+      <w:r>
+        <w:rPr>
+          <w:rFonts w:ascii="Calibri" w:hAnsi="Calibri" w:eastAsia="Calibri"/>
+          <w:b w:val="0"/>
+          <w:sz w:val="22"/>
+        </w:rPr>
+        <w:t xml:space="preserve">Full log: </w:t>
+      </w:r>
+      <w:r>
+        <w:rPr>
+          <w:rFonts w:ascii="Consolas" w:hAnsi="Consolas" w:eastAsia="Consolas"/>
+          <w:b w:val="0"/>
+          <w:color w:val="1E3A5F"/>
+          <w:sz w:val="18"/>
+        </w:rPr>
+        <w:t>outputs/validation_logs/noor_week7_validation_log.txt</w:t>
+      </w:r>
+    </w:p>
+    <w:p>
+      <w:r>
+        <w:rPr>
+          <w:rFonts w:ascii="Calibri" w:hAnsi="Calibri" w:eastAsia="Calibri"/>
+          <w:b w:val="0"/>
+          <w:sz w:val="22"/>
+        </w:rPr>
+        <w:t xml:space="preserve">Summary: </w:t>
+      </w:r>
+      <w:r>
+        <w:rPr>
+          <w:rFonts w:ascii="Consolas" w:hAnsi="Consolas" w:eastAsia="Consolas"/>
+          <w:b w:val="0"/>
+          <w:color w:val="1E3A5F"/>
+          <w:sz w:val="18"/>
+        </w:rPr>
+        <w:t>outputs/validation_logs/noor_week7_summary.md</w:t>
+      </w:r>
+      <w:r>
+        <w:rPr>
+          <w:rFonts w:ascii="Calibri" w:hAnsi="Calibri" w:eastAsia="Calibri"/>
+          <w:b w:val="0"/>
+          <w:sz w:val="22"/>
+        </w:rPr>
+        <w:t xml:space="preserve"> · </w:t>
+      </w:r>
+      <w:r>
+        <w:rPr>
+          <w:rFonts w:ascii="Consolas" w:hAnsi="Consolas" w:eastAsia="Consolas"/>
+          <w:b w:val="0"/>
+          <w:color w:val="1E3A5F"/>
+          <w:sz w:val="18"/>
+        </w:rPr>
+        <w:t>outputs/week7_summary.md</w:t>
+      </w:r>
+    </w:p>
+    <w:p>
+      <w:pPr>
+        <w:pStyle w:val="Heading3"/>
+      </w:pPr>
+      <w:r>
+        <w:t>15B.4 Team priority handoff (Week 7 → Salar/Ayesha)</w:t>
+      </w:r>
+    </w:p>
+    <w:p>
+      <w:pPr>
+        <w:pStyle w:val="ListNumber"/>
+      </w:pPr>
+      <w:r>
+        <w:rPr>
+          <w:rFonts w:ascii="Calibri" w:hAnsi="Calibri" w:eastAsia="Calibri"/>
+          <w:b/>
+          <w:sz w:val="22"/>
+        </w:rPr>
+        <w:t>P0 Salar</w:t>
+      </w:r>
+      <w:r>
+        <w:rPr>
+          <w:rFonts w:ascii="Calibri" w:hAnsi="Calibri" w:eastAsia="Calibri"/>
+          <w:b w:val="0"/>
+          <w:sz w:val="22"/>
+        </w:rPr>
+        <w:t xml:space="preserve"> — R07/R08 nesting FP suppression</w:t>
+      </w:r>
+    </w:p>
+    <w:p>
+      <w:pPr>
+        <w:pStyle w:val="ListNumber"/>
+      </w:pPr>
+      <w:r>
+        <w:rPr>
+          <w:rFonts w:ascii="Calibri" w:hAnsi="Calibri" w:eastAsia="Calibri"/>
+          <w:b/>
+          <w:sz w:val="22"/>
+        </w:rPr>
+        <w:t>P0 Salar</w:t>
+      </w:r>
+      <w:r>
+        <w:rPr>
+          <w:rFonts w:ascii="Calibri" w:hAnsi="Calibri" w:eastAsia="Calibri"/>
+          <w:b w:val="0"/>
+          <w:sz w:val="22"/>
+        </w:rPr>
+        <w:t xml:space="preserve"> — R30 overlap tolerance (list/chat/map/search)</w:t>
+      </w:r>
+    </w:p>
+    <w:p>
+      <w:pPr>
+        <w:pStyle w:val="ListNumber"/>
+      </w:pPr>
+      <w:r>
+        <w:rPr>
+          <w:rFonts w:ascii="Calibri" w:hAnsi="Calibri" w:eastAsia="Calibri"/>
+          <w:b/>
+          <w:sz w:val="22"/>
+        </w:rPr>
+        <w:t>P1 Ayesha</w:t>
+      </w:r>
+      <w:r>
+        <w:rPr>
+          <w:rFonts w:ascii="Calibri" w:hAnsi="Calibri" w:eastAsia="Calibri"/>
+          <w:b w:val="0"/>
+          <w:sz w:val="22"/>
+        </w:rPr>
+        <w:t xml:space="preserve"> — UI polish for demo path</w:t>
+      </w:r>
+    </w:p>
+    <w:p>
+      <w:pPr>
+        <w:pStyle w:val="ListNumber"/>
+      </w:pPr>
+      <w:r>
+        <w:rPr>
+          <w:rFonts w:ascii="Calibri" w:hAnsi="Calibri" w:eastAsia="Calibri"/>
+          <w:b/>
+          <w:sz w:val="22"/>
+        </w:rPr>
+        <w:t>P2 Noor</w:t>
+      </w:r>
+      <w:r>
+        <w:rPr>
+          <w:rFonts w:ascii="Calibri" w:hAnsi="Calibri" w:eastAsia="Calibri"/>
+          <w:b w:val="0"/>
+          <w:sz w:val="22"/>
+        </w:rPr>
+        <w:t xml:space="preserve"> — Rico holdout when dataset local</w:t>
+      </w:r>
+    </w:p>
+    <w:p>
+      <w:pPr>
+        <w:pStyle w:val="Heading2"/>
+      </w:pPr>
+      <w:r>
         <w:t>16. Document history</w:t>
       </w:r>
     </w:p>
@@ -21385,6 +23304,84 @@
                 <w:sz w:val="20"/>
               </w:rPr>
               <w:t>Progress evidence pack §15A (validation log excerpt + tables + Figma images); pipeline status Done; SRS/SDS path accuracy sync</w:t>
+            </w:r>
+          </w:p>
+        </w:tc>
+      </w:tr>
+      <w:tr>
+        <w:tc>
+          <w:tcPr>
+            <w:tcW w:type="dxa" w:w="2376"/>
+          </w:tcPr>
+          <w:p>
+            <w:pPr>
+              <w:spacing w:before="60" w:after="60"/>
+            </w:pPr>
+            <w:r/>
+            <w:r>
+              <w:rPr>
+                <w:rFonts w:ascii="Calibri" w:hAnsi="Calibri" w:eastAsia="Calibri"/>
+                <w:b/>
+                <w:sz w:val="20"/>
+              </w:rPr>
+              <w:t>1.14</w:t>
+            </w:r>
+          </w:p>
+        </w:tc>
+        <w:tc>
+          <w:tcPr>
+            <w:tcW w:type="dxa" w:w="2376"/>
+          </w:tcPr>
+          <w:p>
+            <w:pPr>
+              <w:spacing w:before="60" w:after="60"/>
+            </w:pPr>
+            <w:r/>
+            <w:r>
+              <w:rPr>
+                <w:rFonts w:ascii="Calibri" w:hAnsi="Calibri" w:eastAsia="Calibri"/>
+                <w:b/>
+                <w:sz w:val="20"/>
+              </w:rPr>
+              <w:t>20 Jul 2026</w:t>
+            </w:r>
+          </w:p>
+        </w:tc>
+        <w:tc>
+          <w:tcPr>
+            <w:tcW w:type="dxa" w:w="2376"/>
+          </w:tcPr>
+          <w:p>
+            <w:pPr>
+              <w:spacing w:before="60" w:after="60"/>
+            </w:pPr>
+            <w:r/>
+            <w:r>
+              <w:rPr>
+                <w:rFonts w:ascii="Calibri" w:hAnsi="Calibri" w:eastAsia="Calibri"/>
+                <w:b/>
+                <w:sz w:val="20"/>
+              </w:rPr>
+              <w:t>Noor</w:t>
+            </w:r>
+          </w:p>
+        </w:tc>
+        <w:tc>
+          <w:tcPr>
+            <w:tcW w:type="dxa" w:w="2376"/>
+          </w:tcPr>
+          <w:p>
+            <w:pPr>
+              <w:spacing w:before="60" w:after="60"/>
+            </w:pPr>
+            <w:r/>
+            <w:r>
+              <w:rPr>
+                <w:rFonts w:ascii="Calibri" w:hAnsi="Calibri" w:eastAsia="Calibri"/>
+                <w:b w:val="0"/>
+                <w:sz w:val="20"/>
+              </w:rPr>
+              <w:t>Week 7 QA evidence §15B: rule/guideline summaries, metrics tables, validation logs; Rico holdout deferred; SRS v2.6 / SDS v2.10 sync</w:t>
             </w:r>
           </w:p>
         </w:tc>

</xml_diff>